<commit_message>
docs: Fix missing front page and embed 7 high-resolution Mermaid diagrams into the DOCX handbook
</commit_message>
<xml_diff>
--- a/Athenis_Technical_Documentation.docx
+++ b/Athenis_Technical_Documentation.docx
@@ -2,33 +2,200 @@
 <file path=word/document.xml><?xml version="1.0" encoding="utf-8"?>
 <w:document xmlns:w="http://schemas.openxmlformats.org/wordprocessingml/2006/main" xmlns:m="http://schemas.openxmlformats.org/officeDocument/2006/math" xmlns:r="http://schemas.openxmlformats.org/officeDocument/2006/relationships" xmlns:o="urn:schemas-microsoft-com:office:office" xmlns:v="urn:schemas-microsoft-com:vml" xmlns:w10="urn:schemas-microsoft-com:office:word" xmlns:a="http://schemas.openxmlformats.org/drawingml/2006/main" xmlns:pic="http://schemas.openxmlformats.org/drawingml/2006/picture" xmlns:wp="http://schemas.openxmlformats.org/drawingml/2006/wordprocessingDrawing">
   <w:body>
-    <w:sdt>
-      <w:sdtPr>
-        <w:docPartObj>
-          <w:docPartGallery w:val="Table of Contents"/>
-          <w:docPartUnique/>
-        </w:docPartObj>
-      </w:sdtPr>
-      <w:sdtContent>
-        <w:p>
-          <w:pPr>
-            <w:pStyle w:val="TOCHeading"/>
-          </w:pPr>
-          <w:r>
-            <w:t xml:space="preserve">Table of Contents</w:t>
-          </w:r>
-        </w:p>
-        <w:p>
-          <w:r>
-            <w:fldChar w:fldCharType="begin" w:dirty="true"/>
-            <w:instrText xml:space="preserve">TOC \o "1-3" \h \z \u</w:instrText>
-            <w:fldChar w:fldCharType="separate"/>
-            <w:fldChar w:fldCharType="end"/>
-          </w:r>
-        </w:p>
-      </w:sdtContent>
-    </w:sdt>
-    <w:bookmarkStart w:id="9" w:name="athenis-enterprise-engineering-handbook"/>
+    <w:p>
+      <w:pPr>
+        <w:pStyle w:val="FirstParagraph"/>
+      </w:pPr>
+    </w:p>
+    <w:bookmarkStart w:id="10" w:name="athenis-ai-platform"/>
+    <w:p>
+      <w:pPr>
+        <w:pStyle w:val="Heading1"/>
+      </w:pPr>
+      <w:r>
+        <w:rPr>
+          <w:b/>
+          <w:bCs/>
+        </w:rPr>
+        <w:t xml:space="preserve">Athenis AI Platform</w:t>
+      </w:r>
+    </w:p>
+    <w:bookmarkStart w:id="9" w:name="Xac8a91fbc7bb5ceb11cb44143b17d1b972046a1"/>
+    <w:p>
+      <w:pPr>
+        <w:pStyle w:val="Heading2"/>
+      </w:pPr>
+      <w:r>
+        <w:t xml:space="preserve">Enterprise Engineering Architecture Handbook</w:t>
+      </w:r>
+    </w:p>
+    <w:p>
+      <w:pPr>
+        <w:pStyle w:val="FirstParagraph"/>
+      </w:pPr>
+      <w:r>
+        <w:t xml:space="preserve"> </w:t>
+      </w:r>
+      <w:r>
+        <w:rPr>
+          <w:b/>
+          <w:bCs/>
+        </w:rPr>
+        <w:t xml:space="preserve">Prepared by:</w:t>
+      </w:r>
+      <w:r>
+        <w:t xml:space="preserve"> </w:t>
+      </w:r>
+      <w:r>
+        <w:t xml:space="preserve">Ruthvek Kannan</w:t>
+      </w:r>
+      <w:r>
+        <w:br/>
+      </w:r>
+      <w:r>
+        <w:rPr>
+          <w:b/>
+          <w:bCs/>
+        </w:rPr>
+        <w:t xml:space="preserve">Date:</w:t>
+      </w:r>
+      <w:r>
+        <w:t xml:space="preserve"> </w:t>
+      </w:r>
+      <w:r>
+        <w:t xml:space="preserve">June 2026</w:t>
+      </w:r>
+      <w:r>
+        <w:br/>
+      </w:r>
+      <w:r>
+        <w:rPr>
+          <w:b/>
+          <w:bCs/>
+        </w:rPr>
+        <w:t xml:space="preserve">Version:</w:t>
+      </w:r>
+      <w:r>
+        <w:t xml:space="preserve"> </w:t>
+      </w:r>
+      <w:r>
+        <w:t xml:space="preserve">1.0.0 (Final Architecture Review)</w:t>
+      </w:r>
+    </w:p>
+    <w:p>
+      <w:pPr>
+        <w:pStyle w:val="BodyText"/>
+      </w:pPr>
+    </w:p>
+    <w:p>
+      <w:pPr>
+        <w:pStyle w:val="BlockText"/>
+      </w:pPr>
+      <w:r>
+        <w:rPr>
+          <w:b/>
+          <w:bCs/>
+        </w:rPr>
+        <w:t xml:space="preserve">CONFIDENTIALITY NOTICE</w:t>
+      </w:r>
+      <w:r>
+        <w:br/>
+      </w:r>
+      <w:r>
+        <w:t xml:space="preserve">This handbook contains sensitive architectural topology and security threat models for the Athenis RAG Platform. Do not distribute outside of the core engineering team.</w:t>
+      </w:r>
+    </w:p>
+    <w:p>
+      <w:r>
+        <w:br w:type="page"/>
+      </w:r>
+    </w:p>
+    <w:bookmarkEnd w:id="9"/>
+    <w:bookmarkEnd w:id="10"/>
+    <w:bookmarkStart w:id="11" w:name="table-of-contents"/>
+    <w:p>
+      <w:pPr>
+        <w:pStyle w:val="Heading1"/>
+      </w:pPr>
+      <w:r>
+        <w:t xml:space="preserve">Table of Contents</w:t>
+      </w:r>
+    </w:p>
+    <w:p>
+      <w:pPr>
+        <w:pStyle w:val="FirstParagraph"/>
+      </w:pPr>
+      <w:r>
+        <w:rPr>
+          <w:i/>
+          <w:iCs/>
+        </w:rPr>
+        <w:t xml:space="preserve">Note: Please right-click here in Microsoft Word and select</w:t>
+      </w:r>
+      <w:r>
+        <w:rPr>
+          <w:i/>
+          <w:iCs/>
+        </w:rPr>
+        <w:t xml:space="preserve"> </w:t>
+      </w:r>
+      <w:r>
+        <w:rPr>
+          <w:i/>
+          <w:iCs/>
+        </w:rPr>
+        <w:t xml:space="preserve">“Update Field”</w:t>
+      </w:r>
+      <w:r>
+        <w:rPr>
+          <w:i/>
+          <w:iCs/>
+        </w:rPr>
+        <w:t xml:space="preserve"> </w:t>
+      </w:r>
+      <w:r>
+        <w:rPr>
+          <w:i/>
+          <w:iCs/>
+        </w:rPr>
+        <w:t xml:space="preserve">-&gt;</w:t>
+      </w:r>
+      <w:r>
+        <w:rPr>
+          <w:i/>
+          <w:iCs/>
+        </w:rPr>
+        <w:t xml:space="preserve"> </w:t>
+      </w:r>
+      <w:r>
+        <w:rPr>
+          <w:i/>
+          <w:iCs/>
+        </w:rPr>
+        <w:t xml:space="preserve">“Update entire table”</w:t>
+      </w:r>
+      <w:r>
+        <w:rPr>
+          <w:i/>
+          <w:iCs/>
+        </w:rPr>
+        <w:t xml:space="preserve"> </w:t>
+      </w:r>
+      <w:r>
+        <w:rPr>
+          <w:i/>
+          <w:iCs/>
+        </w:rPr>
+        <w:t xml:space="preserve">to generate the clickable Table of Contents.</w:t>
+      </w:r>
+    </w:p>
+    <w:p>
+      <w:r>
+        <w:br w:type="page"/>
+      </w:r>
+    </w:p>
+    <w:bookmarkEnd w:id="11"/>
+    <w:bookmarkStart w:id="12" w:name="athenis-enterprise-engineering-handbook"/>
     <w:p>
       <w:pPr>
         <w:pStyle w:val="Heading1"/>
@@ -44,8 +211,8 @@
         </w:pict>
       </w:r>
     </w:p>
-    <w:bookmarkEnd w:id="9"/>
-    <w:bookmarkStart w:id="13" w:name="chapter-1-the-business-problem"/>
+    <w:bookmarkEnd w:id="12"/>
+    <w:bookmarkStart w:id="16" w:name="chapter-1-the-business-problem"/>
     <w:p>
       <w:pPr>
         <w:pStyle w:val="Heading1"/>
@@ -54,7 +221,7 @@
         <w:t xml:space="preserve">Chapter 1: The Business Problem</w:t>
       </w:r>
     </w:p>
-    <w:bookmarkStart w:id="10" w:name="introduction"/>
+    <w:bookmarkStart w:id="13" w:name="introduction"/>
     <w:p>
       <w:pPr>
         <w:pStyle w:val="Heading2"/>
@@ -71,8 +238,8 @@
         <w:t xml:space="preserve">In the era of Generative AI, enterprises face a paradox: they possess petabytes of valuable unstructured data (e.g., proprietary legal contracts, internal wikis, financial reports), but exposing this data to public Large Language Models (LLMs) like OpenAI’s ChatGPT presents an unacceptable security and compliance risk. Conversely, training a massive, proprietary foundational model from scratch costs millions of dollars in compute (GPU clusters) and requires highly specialized machine learning engineers.</w:t>
       </w:r>
     </w:p>
-    <w:bookmarkEnd w:id="10"/>
-    <w:bookmarkStart w:id="11" w:name="Xe29d92ce0476a76bdc897c9da50f83b04df9f0b"/>
+    <w:bookmarkEnd w:id="13"/>
+    <w:bookmarkStart w:id="14" w:name="Xe29d92ce0476a76bdc897c9da50f83b04df9f0b"/>
     <w:p>
       <w:pPr>
         <w:pStyle w:val="Heading2"/>
@@ -197,8 +364,8 @@
         <w:t xml:space="preserve">of text, Athenis guarantees that the AI cannot hallucinate answers outside of the provided context. Furthermore, because the database is self-hosted, row-level security and Role-Based Access Control (RBAC) can be rigidly enforced before the LLM ever sees the data.</w:t>
       </w:r>
     </w:p>
-    <w:bookmarkEnd w:id="11"/>
-    <w:bookmarkStart w:id="12" w:name="preventing-vendor-lock-in"/>
+    <w:bookmarkEnd w:id="14"/>
+    <w:bookmarkStart w:id="15" w:name="preventing-vendor-lock-in"/>
     <w:p>
       <w:pPr>
         <w:pStyle w:val="Heading2"/>
@@ -256,9 +423,9 @@
         </w:pict>
       </w:r>
     </w:p>
-    <w:bookmarkEnd w:id="12"/>
-    <w:bookmarkEnd w:id="13"/>
-    <w:bookmarkStart w:id="23" w:name="chapter-2-high-level-architecture"/>
+    <w:bookmarkEnd w:id="15"/>
+    <w:bookmarkEnd w:id="16"/>
+    <w:bookmarkStart w:id="30" w:name="chapter-2-high-level-architecture"/>
     <w:p>
       <w:pPr>
         <w:pStyle w:val="Heading1"/>
@@ -267,7 +434,7 @@
         <w:t xml:space="preserve">Chapter 2: High Level Architecture</w:t>
       </w:r>
     </w:p>
-    <w:bookmarkStart w:id="18" w:name="architectural-topology"/>
+    <w:bookmarkStart w:id="21" w:name="architectural-topology"/>
     <w:p>
       <w:pPr>
         <w:pStyle w:val="Heading2"/>
@@ -284,7 +451,7 @@
         <w:t xml:space="preserve">Athenis departs from traditional monolithic design patterns, opting instead for a highly decoupled, microservices-inspired architecture. This topology strictly separates the presentation layer, the synchronous API gateway, and the asynchronous background compute engines.</w:t>
       </w:r>
     </w:p>
-    <w:bookmarkStart w:id="14" w:name="the-presentation-tier-next.js"/>
+    <w:bookmarkStart w:id="17" w:name="the-presentation-tier-next.js"/>
     <w:p>
       <w:pPr>
         <w:pStyle w:val="Heading3"/>
@@ -317,8 +484,8 @@
         <w:t xml:space="preserve">framework. Next.js was chosen specifically for its App Router paradigm, which allows for aggressive server-side rendering (SSR) and seamless API route handling. The interface is styled using Tailwind CSS for rapid, utility-first design.</w:t>
       </w:r>
     </w:p>
-    <w:bookmarkEnd w:id="14"/>
-    <w:bookmarkStart w:id="15" w:name="the-synchronous-gateway-fastapi"/>
+    <w:bookmarkEnd w:id="17"/>
+    <w:bookmarkStart w:id="18" w:name="the-synchronous-gateway-fastapi"/>
     <w:p>
       <w:pPr>
         <w:pStyle w:val="Heading3"/>
@@ -366,8 +533,8 @@
         <w:t xml:space="preserve">event loop. Because the platform spends a significant amount of time waiting for network I/O (e.g., waiting for database queries or LLM responses), an asynchronous loop allows a single Python process to handle thousands of concurrent connections without blocking.</w:t>
       </w:r>
     </w:p>
-    <w:bookmarkEnd w:id="15"/>
-    <w:bookmarkStart w:id="16" w:name="Xea8ef6e2a55ce41d0c9f995069d3c5c243b1a29"/>
+    <w:bookmarkEnd w:id="18"/>
+    <w:bookmarkStart w:id="19" w:name="Xea8ef6e2a55ce41d0c9f995069d3c5c243b1a29"/>
     <w:p>
       <w:pPr>
         <w:pStyle w:val="Heading3"/>
@@ -405,8 +572,8 @@
         <w:t xml:space="preserve">. Celery is a distributed task queue that runs in entirely separate Docker containers. It allows FastAPI to offload heavy compute tasks asynchronously.</w:t>
       </w:r>
     </w:p>
-    <w:bookmarkEnd w:id="16"/>
-    <w:bookmarkStart w:id="17" w:name="state-persistence-postgresql-redis"/>
+    <w:bookmarkEnd w:id="19"/>
+    <w:bookmarkStart w:id="20" w:name="state-persistence-postgresql-redis"/>
     <w:p>
       <w:pPr>
         <w:pStyle w:val="Heading3"/>
@@ -506,9 +673,9 @@
         <w:t xml:space="preserve">).</w:t>
       </w:r>
     </w:p>
-    <w:bookmarkEnd w:id="17"/>
-    <w:bookmarkEnd w:id="18"/>
-    <w:bookmarkStart w:id="22" w:name="system-diagram"/>
+    <w:bookmarkEnd w:id="20"/>
+    <w:bookmarkEnd w:id="21"/>
+    <w:bookmarkStart w:id="25" w:name="system-diagram"/>
     <w:p>
       <w:pPr>
         <w:pStyle w:val="Heading2"/>
@@ -526,18 +693,18 @@
           <wp:inline>
             <wp:extent cx="5334000" cy="3333750"/>
             <wp:effectExtent b="0" l="0" r="0" t="0"/>
-            <wp:docPr descr="Architecture Diagram" title="" id="20" name="Picture"/>
+            <wp:docPr descr="Architecture Diagram" title="" id="23" name="Picture"/>
             <a:graphic>
               <a:graphicData uri="http://schemas.openxmlformats.org/drawingml/2006/picture">
                 <pic:pic>
                   <pic:nvPicPr>
-                    <pic:cNvPr descr="frontend/public/assets/dashboard.png" id="21" name="Picture"/>
+                    <pic:cNvPr descr="frontend/public/assets/dashboard.png" id="24" name="Picture"/>
                     <pic:cNvPicPr>
                       <a:picLocks noChangeArrowheads="1" noChangeAspect="1"/>
                     </pic:cNvPicPr>
                   </pic:nvPicPr>
                   <pic:blipFill>
-                    <a:blip r:embed="rId19"/>
+                    <a:blip r:embed="rId22"/>
                     <a:stretch>
                       <a:fillRect/>
                     </a:stretch>
@@ -592,9 +759,76 @@
         <w:t xml:space="preserve">In a production deployment, the Next.js container should be the only service exposed to the public internet (via an Ingress controller or Load Balancer). FastAPI, Celery, PostgreSQL, and Redis must remain strictly isolated within a private Virtual Private Cloud (VPC) subnet to prevent unauthorized external access.</w:t>
       </w:r>
     </w:p>
-    <w:bookmarkEnd w:id="22"/>
-    <w:bookmarkEnd w:id="23"/>
-    <w:bookmarkStart w:id="26" w:name="chapter-3-application-startup"/>
+    <w:bookmarkEnd w:id="25"/>
+    <w:bookmarkStart w:id="29" w:name="comprehensive-system-topology"/>
+    <w:p>
+      <w:pPr>
+        <w:pStyle w:val="Heading2"/>
+      </w:pPr>
+      <w:r>
+        <w:t xml:space="preserve">2.3 Comprehensive System Topology</w:t>
+      </w:r>
+    </w:p>
+    <w:p>
+      <w:pPr>
+        <w:pStyle w:val="FirstParagraph"/>
+      </w:pPr>
+      <w:r>
+        <w:drawing>
+          <wp:inline>
+            <wp:extent cx="5334000" cy="6000750"/>
+            <wp:effectExtent b="0" l="0" r="0" t="0"/>
+            <wp:docPr descr="Architecture Diagram" title="" id="27" name="Picture"/>
+            <a:graphic>
+              <a:graphicData uri="http://schemas.openxmlformats.org/drawingml/2006/picture">
+                <pic:pic>
+                  <pic:nvPicPr>
+                    <pic:cNvPr descr="diagram_1.png" id="28" name="Picture"/>
+                    <pic:cNvPicPr>
+                      <a:picLocks noChangeArrowheads="1" noChangeAspect="1"/>
+                    </pic:cNvPicPr>
+                  </pic:nvPicPr>
+                  <pic:blipFill>
+                    <a:blip r:embed="rId26"/>
+                    <a:stretch>
+                      <a:fillRect/>
+                    </a:stretch>
+                  </pic:blipFill>
+                  <pic:spPr bwMode="auto">
+                    <a:xfrm>
+                      <a:off x="0" y="0"/>
+                      <a:ext cx="5334000" cy="6000750"/>
+                    </a:xfrm>
+                    <a:prstGeom prst="rect">
+                      <a:avLst/>
+                    </a:prstGeom>
+                    <a:noFill/>
+                    <a:ln w="9525">
+                      <a:noFill/>
+                      <a:headEnd/>
+                      <a:tailEnd/>
+                    </a:ln>
+                  </pic:spPr>
+                </pic:pic>
+              </a:graphicData>
+            </a:graphic>
+          </wp:inline>
+        </w:drawing>
+      </w:r>
+      <w:r>
+        <w:t xml:space="preserve"> </w:t>
+      </w:r>
+      <w:r>
+        <w:rPr>
+          <w:i/>
+          <w:iCs/>
+        </w:rPr>
+        <w:t xml:space="preserve">Figure: System Visualization 1</w:t>
+      </w:r>
+    </w:p>
+    <w:bookmarkEnd w:id="29"/>
+    <w:bookmarkEnd w:id="30"/>
+    <w:bookmarkStart w:id="36" w:name="chapter-3-application-startup"/>
     <w:p>
       <w:pPr>
         <w:pStyle w:val="Heading1"/>
@@ -603,7 +837,7 @@
         <w:t xml:space="preserve">Chapter 3: Application Startup</w:t>
       </w:r>
     </w:p>
-    <w:bookmarkStart w:id="24" w:name="the-boot-sequence"/>
+    <w:bookmarkStart w:id="34" w:name="the-boot-sequence"/>
     <w:p>
       <w:pPr>
         <w:pStyle w:val="Heading2"/>
@@ -729,6 +963,63 @@
     </w:p>
     <w:p>
       <w:pPr>
+        <w:pStyle w:val="FirstParagraph"/>
+      </w:pPr>
+      <w:r>
+        <w:drawing>
+          <wp:inline>
+            <wp:extent cx="5334000" cy="6784117"/>
+            <wp:effectExtent b="0" l="0" r="0" t="0"/>
+            <wp:docPr descr="Architecture Diagram" title="" id="32" name="Picture"/>
+            <a:graphic>
+              <a:graphicData uri="http://schemas.openxmlformats.org/drawingml/2006/picture">
+                <pic:pic>
+                  <pic:nvPicPr>
+                    <pic:cNvPr descr="diagram_2.png" id="33" name="Picture"/>
+                    <pic:cNvPicPr>
+                      <a:picLocks noChangeArrowheads="1" noChangeAspect="1"/>
+                    </pic:cNvPicPr>
+                  </pic:nvPicPr>
+                  <pic:blipFill>
+                    <a:blip r:embed="rId31"/>
+                    <a:stretch>
+                      <a:fillRect/>
+                    </a:stretch>
+                  </pic:blipFill>
+                  <pic:spPr bwMode="auto">
+                    <a:xfrm>
+                      <a:off x="0" y="0"/>
+                      <a:ext cx="5334000" cy="6784117"/>
+                    </a:xfrm>
+                    <a:prstGeom prst="rect">
+                      <a:avLst/>
+                    </a:prstGeom>
+                    <a:noFill/>
+                    <a:ln w="9525">
+                      <a:noFill/>
+                      <a:headEnd/>
+                      <a:tailEnd/>
+                    </a:ln>
+                  </pic:spPr>
+                </pic:pic>
+              </a:graphicData>
+            </a:graphic>
+          </wp:inline>
+        </w:drawing>
+      </w:r>
+      <w:r>
+        <w:t xml:space="preserve"> </w:t>
+      </w:r>
+      <w:r>
+        <w:rPr>
+          <w:i/>
+          <w:iCs/>
+        </w:rPr>
+        <w:t xml:space="preserve">Figure: System Visualization 2</w:t>
+      </w:r>
+    </w:p>
+    <w:p>
+      <w:pPr>
         <w:pStyle w:val="BlockText"/>
       </w:pPr>
       <w:r>
@@ -760,8 +1051,8 @@
         <w:t xml:space="preserve">directives (e.g., trying to boot FastAPI before PostgreSQL) will instantly crash the backend. FastAPI requires a valid database connection string during the instantiation of the SQLAlchemy session factory.</w:t>
       </w:r>
     </w:p>
-    <w:bookmarkEnd w:id="24"/>
-    <w:bookmarkStart w:id="25" w:name="X5257d8e9c124ddf1573974cfd4df025fc5b0bea"/>
+    <w:bookmarkEnd w:id="34"/>
+    <w:bookmarkStart w:id="35" w:name="X5257d8e9c124ddf1573974cfd4df025fc5b0bea"/>
     <w:p>
       <w:pPr>
         <w:pStyle w:val="Heading2"/>
@@ -877,9 +1168,9 @@
         </w:pict>
       </w:r>
     </w:p>
-    <w:bookmarkEnd w:id="25"/>
-    <w:bookmarkEnd w:id="26"/>
-    <w:bookmarkStart w:id="30" w:name="chapter-4-frontend-initialization"/>
+    <w:bookmarkEnd w:id="35"/>
+    <w:bookmarkEnd w:id="36"/>
+    <w:bookmarkStart w:id="43" w:name="chapter-4-frontend-initialization"/>
     <w:p>
       <w:pPr>
         <w:pStyle w:val="Heading1"/>
@@ -888,7 +1179,7 @@
         <w:t xml:space="preserve">Chapter 4: Frontend Initialization</w:t>
       </w:r>
     </w:p>
-    <w:bookmarkStart w:id="28" w:name="the-next.js-paradigm"/>
+    <w:bookmarkStart w:id="41" w:name="the-next.js-paradigm"/>
     <w:p>
       <w:pPr>
         <w:pStyle w:val="Heading2"/>
@@ -948,7 +1239,7 @@
         <w:t xml:space="preserve">architecture.</w:t>
       </w:r>
     </w:p>
-    <w:bookmarkStart w:id="27" w:name="Xe266f8bbceec67121d2b3ee863cb070db150985"/>
+    <w:bookmarkStart w:id="40" w:name="Xe266f8bbceec67121d2b3ee863cb070db150985"/>
     <w:p>
       <w:pPr>
         <w:pStyle w:val="Heading3"/>
@@ -1038,9 +1329,66 @@
         <w:t xml:space="preserve">).</w:t>
       </w:r>
     </w:p>
-    <w:bookmarkEnd w:id="27"/>
-    <w:bookmarkEnd w:id="28"/>
-    <w:bookmarkStart w:id="29" w:name="handling-global-state"/>
+    <w:p>
+      <w:pPr>
+        <w:pStyle w:val="BodyText"/>
+      </w:pPr>
+      <w:r>
+        <w:drawing>
+          <wp:inline>
+            <wp:extent cx="5334000" cy="3626826"/>
+            <wp:effectExtent b="0" l="0" r="0" t="0"/>
+            <wp:docPr descr="Architecture Diagram" title="" id="38" name="Picture"/>
+            <a:graphic>
+              <a:graphicData uri="http://schemas.openxmlformats.org/drawingml/2006/picture">
+                <pic:pic>
+                  <pic:nvPicPr>
+                    <pic:cNvPr descr="diagram_3.png" id="39" name="Picture"/>
+                    <pic:cNvPicPr>
+                      <a:picLocks noChangeArrowheads="1" noChangeAspect="1"/>
+                    </pic:cNvPicPr>
+                  </pic:nvPicPr>
+                  <pic:blipFill>
+                    <a:blip r:embed="rId37"/>
+                    <a:stretch>
+                      <a:fillRect/>
+                    </a:stretch>
+                  </pic:blipFill>
+                  <pic:spPr bwMode="auto">
+                    <a:xfrm>
+                      <a:off x="0" y="0"/>
+                      <a:ext cx="5334000" cy="3626826"/>
+                    </a:xfrm>
+                    <a:prstGeom prst="rect">
+                      <a:avLst/>
+                    </a:prstGeom>
+                    <a:noFill/>
+                    <a:ln w="9525">
+                      <a:noFill/>
+                      <a:headEnd/>
+                      <a:tailEnd/>
+                    </a:ln>
+                  </pic:spPr>
+                </pic:pic>
+              </a:graphicData>
+            </a:graphic>
+          </wp:inline>
+        </w:drawing>
+      </w:r>
+      <w:r>
+        <w:t xml:space="preserve"> </w:t>
+      </w:r>
+      <w:r>
+        <w:rPr>
+          <w:i/>
+          <w:iCs/>
+        </w:rPr>
+        <w:t xml:space="preserve">Figure: System Visualization 3</w:t>
+      </w:r>
+    </w:p>
+    <w:bookmarkEnd w:id="40"/>
+    <w:bookmarkEnd w:id="41"/>
+    <w:bookmarkStart w:id="42" w:name="handling-global-state"/>
     <w:p>
       <w:pPr>
         <w:pStyle w:val="Heading2"/>
@@ -1164,9 +1512,9 @@
         <w:t xml:space="preserve">secure cookies.</w:t>
       </w:r>
     </w:p>
-    <w:bookmarkEnd w:id="29"/>
-    <w:bookmarkEnd w:id="30"/>
-    <w:bookmarkStart w:id="33" w:name="Xb81d7b5a627a4550ffa82d8f451d7ffd4e27b27"/>
+    <w:bookmarkEnd w:id="42"/>
+    <w:bookmarkEnd w:id="43"/>
+    <w:bookmarkStart w:id="46" w:name="Xb81d7b5a627a4550ffa82d8f451d7ffd4e27b27"/>
     <w:p>
       <w:pPr>
         <w:pStyle w:val="Heading1"/>
@@ -1175,7 +1523,7 @@
         <w:t xml:space="preserve">Chapter 5: Backend Initialization &amp; Configuration</w:t>
       </w:r>
     </w:p>
-    <w:bookmarkStart w:id="31" w:name="the-fastapi-core"/>
+    <w:bookmarkStart w:id="44" w:name="the-fastapi-core"/>
     <w:p>
       <w:pPr>
         <w:pStyle w:val="Heading2"/>
@@ -1215,8 +1563,8 @@
         <w:t xml:space="preserve">syntax, FastAPI can suspend the execution of the thread while waiting for network I/O, allowing a single process to handle hundreds of concurrent LLM streams.</w:t>
       </w:r>
     </w:p>
-    <w:bookmarkEnd w:id="31"/>
-    <w:bookmarkStart w:id="32" w:name="environmental-configuration"/>
+    <w:bookmarkEnd w:id="44"/>
+    <w:bookmarkStart w:id="45" w:name="environmental-configuration"/>
     <w:p>
       <w:pPr>
         <w:pStyle w:val="Heading2"/>
@@ -1380,9 +1728,9 @@
         </w:pict>
       </w:r>
     </w:p>
-    <w:bookmarkEnd w:id="32"/>
-    <w:bookmarkEnd w:id="33"/>
-    <w:bookmarkStart w:id="41" w:name="X1dd2c071f81b348087abd35f35bfcf59c462db2"/>
+    <w:bookmarkEnd w:id="45"/>
+    <w:bookmarkEnd w:id="46"/>
+    <w:bookmarkStart w:id="54" w:name="X1dd2c071f81b348087abd35f35bfcf59c462db2"/>
     <w:p>
       <w:pPr>
         <w:pStyle w:val="Heading1"/>
@@ -1391,7 +1739,7 @@
         <w:t xml:space="preserve">Chapter 6: Authentication &amp; Authorization Internals</w:t>
       </w:r>
     </w:p>
-    <w:bookmarkStart w:id="35" w:name="the-jwt-lifecycle"/>
+    <w:bookmarkStart w:id="48" w:name="the-jwt-lifecycle"/>
     <w:p>
       <w:pPr>
         <w:pStyle w:val="Heading2"/>
@@ -1408,7 +1756,7 @@
         <w:t xml:space="preserve">Authentication within Athenis is entirely stateless. The system relies on JSON Web Tokens (JWT) signed using the HMAC SHA-256 algorithm.</w:t>
       </w:r>
     </w:p>
-    <w:bookmarkStart w:id="34" w:name="token-generation"/>
+    <w:bookmarkStart w:id="47" w:name="token-generation"/>
     <w:p>
       <w:pPr>
         <w:pStyle w:val="Heading3"/>
@@ -1523,9 +1871,9 @@
         <w:t xml:space="preserve">. Because the signature is cryptographically secure, the backend does not need to store the token in the database to verify its authenticity later.</w:t>
       </w:r>
     </w:p>
-    <w:bookmarkEnd w:id="34"/>
-    <w:bookmarkEnd w:id="35"/>
-    <w:bookmarkStart w:id="40" w:name="role-based-access-control-rbac"/>
+    <w:bookmarkEnd w:id="47"/>
+    <w:bookmarkEnd w:id="48"/>
+    <w:bookmarkStart w:id="53" w:name="role-based-access-control-rbac"/>
     <w:p>
       <w:pPr>
         <w:pStyle w:val="Heading2"/>
@@ -1578,7 +1926,7 @@
         <w:t xml:space="preserve">).</w:t>
       </w:r>
     </w:p>
-    <w:bookmarkStart w:id="39" w:name="the-execution-flow-of-a-secured-request"/>
+    <w:bookmarkStart w:id="52" w:name="the-execution-flow-of-a-secured-request"/>
     <w:p>
       <w:pPr>
         <w:pStyle w:val="Heading3"/>
@@ -1722,18 +2070,18 @@
           <wp:inline>
             <wp:extent cx="5334000" cy="4503964"/>
             <wp:effectExtent b="0" l="0" r="0" t="0"/>
-            <wp:docPr descr="Architecture Diagram" title="" id="37" name="Picture"/>
+            <wp:docPr descr="Architecture Diagram" title="" id="50" name="Picture"/>
             <a:graphic>
               <a:graphicData uri="http://schemas.openxmlformats.org/drawingml/2006/picture">
                 <pic:pic>
                   <pic:nvPicPr>
-                    <pic:cNvPr descr="diagram_1.png" id="38" name="Picture"/>
+                    <pic:cNvPr descr="diagram_4.png" id="51" name="Picture"/>
                     <pic:cNvPicPr>
                       <a:picLocks noChangeArrowheads="1" noChangeAspect="1"/>
                     </pic:cNvPicPr>
                   </pic:nvPicPr>
                   <pic:blipFill>
-                    <a:blip r:embed="rId36"/>
+                    <a:blip r:embed="rId49"/>
                     <a:stretch>
                       <a:fillRect/>
                     </a:stretch>
@@ -1767,7 +2115,7 @@
           <w:i/>
           <w:iCs/>
         </w:rPr>
-        <w:t xml:space="preserve">Figure: System Visualization 1</w:t>
+        <w:t xml:space="preserve">Figure: System Visualization 4</w:t>
       </w:r>
     </w:p>
     <w:p>
@@ -1800,10 +2148,10 @@
         <w:t xml:space="preserve">stored in Redis, allowing administrators to manually revoke specific tokens.</w:t>
       </w:r>
     </w:p>
-    <w:bookmarkEnd w:id="39"/>
-    <w:bookmarkEnd w:id="40"/>
-    <w:bookmarkEnd w:id="41"/>
-    <w:bookmarkStart w:id="45" w:name="chapter-7-the-document-upload-lifecycle"/>
+    <w:bookmarkEnd w:id="52"/>
+    <w:bookmarkEnd w:id="53"/>
+    <w:bookmarkEnd w:id="54"/>
+    <w:bookmarkStart w:id="58" w:name="chapter-7-the-document-upload-lifecycle"/>
     <w:p>
       <w:pPr>
         <w:pStyle w:val="Heading1"/>
@@ -1812,7 +2160,7 @@
         <w:t xml:space="preserve">Chapter 7: The Document Upload Lifecycle</w:t>
       </w:r>
     </w:p>
-    <w:bookmarkStart w:id="42" w:name="introduction-1"/>
+    <w:bookmarkStart w:id="55" w:name="introduction-1"/>
     <w:p>
       <w:pPr>
         <w:pStyle w:val="Heading2"/>
@@ -1829,8 +2177,8 @@
         <w:t xml:space="preserve">The core value proposition of Athenis is its ability to ingest proprietary enterprise documents and make them searchable via AI. This process begins when an Administrator navigates to the Document Management dashboard.</w:t>
       </w:r>
     </w:p>
-    <w:bookmarkEnd w:id="42"/>
-    <w:bookmarkStart w:id="43" w:name="handling-large-payloads"/>
+    <w:bookmarkEnd w:id="55"/>
+    <w:bookmarkStart w:id="56" w:name="handling-large-payloads"/>
     <w:p>
       <w:pPr>
         <w:pStyle w:val="Heading2"/>
@@ -1904,8 +2252,8 @@
         <w:t xml:space="preserve">.</w:t>
       </w:r>
     </w:p>
-    <w:bookmarkEnd w:id="43"/>
-    <w:bookmarkStart w:id="44" w:name="disconnecting-the-event-loop"/>
+    <w:bookmarkEnd w:id="56"/>
+    <w:bookmarkStart w:id="57" w:name="disconnecting-the-event-loop"/>
     <w:p>
       <w:pPr>
         <w:pStyle w:val="Heading2"/>
@@ -1955,9 +2303,9 @@
         </w:pict>
       </w:r>
     </w:p>
-    <w:bookmarkEnd w:id="44"/>
-    <w:bookmarkEnd w:id="45"/>
-    <w:bookmarkStart w:id="53" w:name="Xe4ae909f5d90c947c072078669feeaa9da29e67"/>
+    <w:bookmarkEnd w:id="57"/>
+    <w:bookmarkEnd w:id="58"/>
+    <w:bookmarkStart w:id="66" w:name="Xe4ae909f5d90c947c072078669feeaa9da29e67"/>
     <w:p>
       <w:pPr>
         <w:pStyle w:val="Heading1"/>
@@ -1966,7 +2314,7 @@
         <w:t xml:space="preserve">Chapter 8: Background Processing &amp; Embedding Generation</w:t>
       </w:r>
     </w:p>
-    <w:bookmarkStart w:id="52" w:name="the-celery-worker-lifecycle"/>
+    <w:bookmarkStart w:id="65" w:name="the-celery-worker-lifecycle"/>
     <w:p>
       <w:pPr>
         <w:pStyle w:val="Heading2"/>
@@ -2019,7 +2367,7 @@
         <w:t xml:space="preserve">appears in the queue, a worker claims it.</w:t>
       </w:r>
     </w:p>
-    <w:bookmarkStart w:id="46" w:name="stage-1-text-extraction-chunking"/>
+    <w:bookmarkStart w:id="59" w:name="stage-1-text-extraction-chunking"/>
     <w:p>
       <w:pPr>
         <w:pStyle w:val="Heading3"/>
@@ -2094,8 +2442,8 @@
         <w:t xml:space="preserve">The overlap ensures that if a crucial sentence spans across a chunk boundary, the context is not lost or broken in half.</w:t>
       </w:r>
     </w:p>
-    <w:bookmarkEnd w:id="46"/>
-    <w:bookmarkStart w:id="47" w:name="stage-2-vector-embeddings"/>
+    <w:bookmarkEnd w:id="59"/>
+    <w:bookmarkStart w:id="60" w:name="stage-2-vector-embeddings"/>
     <w:p>
       <w:pPr>
         <w:pStyle w:val="Heading3"/>
@@ -2136,8 +2484,8 @@
         <w:t xml:space="preserve">of the text, allowing the system to perform complex similarity searches later.</w:t>
       </w:r>
     </w:p>
-    <w:bookmarkEnd w:id="47"/>
-    <w:bookmarkStart w:id="51" w:name="stage-3-database-insertion"/>
+    <w:bookmarkEnd w:id="60"/>
+    <w:bookmarkStart w:id="64" w:name="stage-3-database-insertion"/>
     <w:p>
       <w:pPr>
         <w:pStyle w:val="Heading3"/>
@@ -2237,18 +2585,18 @@
           <wp:inline>
             <wp:extent cx="5334000" cy="3252107"/>
             <wp:effectExtent b="0" l="0" r="0" t="0"/>
-            <wp:docPr descr="Architecture Diagram" title="" id="49" name="Picture"/>
+            <wp:docPr descr="Architecture Diagram" title="" id="62" name="Picture"/>
             <a:graphic>
               <a:graphicData uri="http://schemas.openxmlformats.org/drawingml/2006/picture">
                 <pic:pic>
                   <pic:nvPicPr>
-                    <pic:cNvPr descr="diagram_2.png" id="50" name="Picture"/>
+                    <pic:cNvPr descr="diagram_5.png" id="63" name="Picture"/>
                     <pic:cNvPicPr>
                       <a:picLocks noChangeArrowheads="1" noChangeAspect="1"/>
                     </pic:cNvPicPr>
                   </pic:nvPicPr>
                   <pic:blipFill>
-                    <a:blip r:embed="rId48"/>
+                    <a:blip r:embed="rId61"/>
                     <a:stretch>
                       <a:fillRect/>
                     </a:stretch>
@@ -2282,7 +2630,7 @@
           <w:i/>
           <w:iCs/>
         </w:rPr>
-        <w:t xml:space="preserve">Figure: System Visualization 2</w:t>
+        <w:t xml:space="preserve">Figure: System Visualization 5</w:t>
       </w:r>
     </w:p>
     <w:p>
@@ -2303,10 +2651,10 @@
         <w:t xml:space="preserve">Embedding generation is extremely network-intensive. If your Celery worker is processing a large document, it may hit the rate limits of your LLM provider. Athenis implements automatic exponential backoff to handle HTTP 429 Too Many Requests errors gracefully.</w:t>
       </w:r>
     </w:p>
-    <w:bookmarkEnd w:id="51"/>
-    <w:bookmarkEnd w:id="52"/>
-    <w:bookmarkEnd w:id="53"/>
-    <w:bookmarkStart w:id="61" w:name="Xd42938827f19096719cb00ab9e34464f099e327"/>
+    <w:bookmarkEnd w:id="64"/>
+    <w:bookmarkEnd w:id="65"/>
+    <w:bookmarkEnd w:id="66"/>
+    <w:bookmarkStart w:id="74" w:name="Xd42938827f19096719cb00ab9e34464f099e327"/>
     <w:p>
       <w:pPr>
         <w:pStyle w:val="Heading1"/>
@@ -2315,7 +2663,7 @@
         <w:t xml:space="preserve">Chapter 9: Storage &amp; The Hybrid Cognitive Engine</w:t>
       </w:r>
     </w:p>
-    <w:bookmarkStart w:id="55" w:name="introduction-to-the-storage-layer"/>
+    <w:bookmarkStart w:id="68" w:name="introduction-to-the-storage-layer"/>
     <w:p>
       <w:pPr>
         <w:pStyle w:val="Heading2"/>
@@ -2349,7 +2697,7 @@
         <w:t xml:space="preserve">extension.</w:t>
       </w:r>
     </w:p>
-    <w:bookmarkStart w:id="54" w:name="why-pgvector"/>
+    <w:bookmarkStart w:id="67" w:name="why-pgvector"/>
     <w:p>
       <w:pPr>
         <w:pStyle w:val="Heading3"/>
@@ -2386,9 +2734,9 @@
         <w:t xml:space="preserve">, Athenis relies on standard PostgreSQL Foreign Key cascading. If an administrator deletes a document, PostgreSQL instantly and atomically deletes all associated vector chunks. Synchronization issues are mathematically impossible.</w:t>
       </w:r>
     </w:p>
-    <w:bookmarkEnd w:id="54"/>
-    <w:bookmarkEnd w:id="55"/>
-    <w:bookmarkStart w:id="60" w:name="X6f9033adfbdc4ebb564d744908d9230088e6eb6"/>
+    <w:bookmarkEnd w:id="67"/>
+    <w:bookmarkEnd w:id="68"/>
+    <w:bookmarkStart w:id="73" w:name="X6f9033adfbdc4ebb564d744908d9230088e6eb6"/>
     <w:p>
       <w:pPr>
         <w:pStyle w:val="Heading2"/>
@@ -2502,7 +2850,7 @@
         <w:t xml:space="preserve">column for exact word matches.</w:t>
       </w:r>
     </w:p>
-    <w:bookmarkStart w:id="59" w:name="merging-the-results"/>
+    <w:bookmarkStart w:id="72" w:name="merging-the-results"/>
     <w:p>
       <w:pPr>
         <w:pStyle w:val="Heading3"/>
@@ -2585,18 +2933,18 @@
           <wp:inline>
             <wp:extent cx="5334000" cy="3211285"/>
             <wp:effectExtent b="0" l="0" r="0" t="0"/>
-            <wp:docPr descr="Architecture Diagram" title="" id="57" name="Picture"/>
+            <wp:docPr descr="Architecture Diagram" title="" id="70" name="Picture"/>
             <a:graphic>
               <a:graphicData uri="http://schemas.openxmlformats.org/drawingml/2006/picture">
                 <pic:pic>
                   <pic:nvPicPr>
-                    <pic:cNvPr descr="diagram_3.png" id="58" name="Picture"/>
+                    <pic:cNvPr descr="diagram_6.png" id="71" name="Picture"/>
                     <pic:cNvPicPr>
                       <a:picLocks noChangeArrowheads="1" noChangeAspect="1"/>
                     </pic:cNvPicPr>
                   </pic:nvPicPr>
                   <pic:blipFill>
-                    <a:blip r:embed="rId56"/>
+                    <a:blip r:embed="rId69"/>
                     <a:stretch>
                       <a:fillRect/>
                     </a:stretch>
@@ -2630,7 +2978,7 @@
           <w:i/>
           <w:iCs/>
         </w:rPr>
-        <w:t xml:space="preserve">Figure: System Visualization 3</w:t>
+        <w:t xml:space="preserve">Figure: System Visualization 6</w:t>
       </w:r>
     </w:p>
     <w:p>
@@ -2640,10 +2988,10 @@
         </w:pict>
       </w:r>
     </w:p>
-    <w:bookmarkEnd w:id="59"/>
-    <w:bookmarkEnd w:id="60"/>
-    <w:bookmarkEnd w:id="61"/>
-    <w:bookmarkStart w:id="64" w:name="Xf136b05d4c821232b319002678d3c3f95697fd4"/>
+    <w:bookmarkEnd w:id="72"/>
+    <w:bookmarkEnd w:id="73"/>
+    <w:bookmarkEnd w:id="74"/>
+    <w:bookmarkStart w:id="77" w:name="Xf136b05d4c821232b319002678d3c3f95697fd4"/>
     <w:p>
       <w:pPr>
         <w:pStyle w:val="Heading1"/>
@@ -2652,7 +3000,7 @@
         <w:t xml:space="preserve">Chapter 10: LLM Interaction &amp; Streaming Responses</w:t>
       </w:r>
     </w:p>
-    <w:bookmarkStart w:id="62" w:name="the-litellm-router"/>
+    <w:bookmarkStart w:id="75" w:name="the-litellm-router"/>
     <w:p>
       <w:pPr>
         <w:pStyle w:val="Heading2"/>
@@ -2726,8 +3074,8 @@
         <w:t xml:space="preserve">, Athenis can instantly route all enterprise traffic to a different AI provider without rewriting a single line of core logic.</w:t>
       </w:r>
     </w:p>
-    <w:bookmarkEnd w:id="62"/>
-    <w:bookmarkStart w:id="63" w:name="server-sent-events-sse-streaming"/>
+    <w:bookmarkEnd w:id="75"/>
+    <w:bookmarkStart w:id="76" w:name="server-sent-events-sse-streaming"/>
     <w:p>
       <w:pPr>
         <w:pStyle w:val="Heading2"/>
@@ -2834,9 +3182,9 @@
         <w:t xml:space="preserve">endpoint to allow the SSE stream to pass through unhindered.</w:t>
       </w:r>
     </w:p>
-    <w:bookmarkEnd w:id="63"/>
-    <w:bookmarkEnd w:id="64"/>
-    <w:bookmarkStart w:id="68" w:name="Xcef500cd95330b25db86aaba1e13b06f0fab0a1"/>
+    <w:bookmarkEnd w:id="76"/>
+    <w:bookmarkEnd w:id="77"/>
+    <w:bookmarkStart w:id="84" w:name="Xcef500cd95330b25db86aaba1e13b06f0fab0a1"/>
     <w:p>
       <w:pPr>
         <w:pStyle w:val="Heading1"/>
@@ -2845,7 +3193,7 @@
         <w:t xml:space="preserve">Chapter 11: Monitoring &amp; Observability Telemetry</w:t>
       </w:r>
     </w:p>
-    <w:bookmarkStart w:id="65" w:name="the-observability-stack"/>
+    <w:bookmarkStart w:id="78" w:name="the-observability-stack"/>
     <w:p>
       <w:pPr>
         <w:pStyle w:val="Heading2"/>
@@ -2886,8 +3234,8 @@
         <w:t xml:space="preserve">to solve this.</w:t>
       </w:r>
     </w:p>
-    <w:bookmarkEnd w:id="65"/>
-    <w:bookmarkStart w:id="66" w:name="trace-propagation"/>
+    <w:bookmarkEnd w:id="78"/>
+    <w:bookmarkStart w:id="79" w:name="trace-propagation"/>
     <w:p>
       <w:pPr>
         <w:pStyle w:val="Heading2"/>
@@ -2986,8 +3334,8 @@
         <w:t xml:space="preserve">and exported.</w:t>
       </w:r>
     </w:p>
-    <w:bookmarkEnd w:id="66"/>
-    <w:bookmarkStart w:id="67" w:name="grafana-dashboards"/>
+    <w:bookmarkEnd w:id="79"/>
+    <w:bookmarkStart w:id="83" w:name="grafana-dashboards"/>
     <w:p>
       <w:pPr>
         <w:pStyle w:val="Heading2"/>
@@ -3002,6 +3350,63 @@
       </w:pPr>
       <w:r>
         <w:t xml:space="preserve">These metrics are scraped by Prometheus and visualized in Grafana. The Unified Admin Dashboard in the Athenis frontend actually embeds or mimics these metrics to provide administrators with a real-time view of system health and AI token expenditure.</w:t>
+      </w:r>
+    </w:p>
+    <w:p>
+      <w:pPr>
+        <w:pStyle w:val="BodyText"/>
+      </w:pPr>
+      <w:r>
+        <w:drawing>
+          <wp:inline>
+            <wp:extent cx="5334000" cy="1170214"/>
+            <wp:effectExtent b="0" l="0" r="0" t="0"/>
+            <wp:docPr descr="Architecture Diagram" title="" id="81" name="Picture"/>
+            <a:graphic>
+              <a:graphicData uri="http://schemas.openxmlformats.org/drawingml/2006/picture">
+                <pic:pic>
+                  <pic:nvPicPr>
+                    <pic:cNvPr descr="diagram_7.png" id="82" name="Picture"/>
+                    <pic:cNvPicPr>
+                      <a:picLocks noChangeArrowheads="1" noChangeAspect="1"/>
+                    </pic:cNvPicPr>
+                  </pic:nvPicPr>
+                  <pic:blipFill>
+                    <a:blip r:embed="rId80"/>
+                    <a:stretch>
+                      <a:fillRect/>
+                    </a:stretch>
+                  </pic:blipFill>
+                  <pic:spPr bwMode="auto">
+                    <a:xfrm>
+                      <a:off x="0" y="0"/>
+                      <a:ext cx="5334000" cy="1170214"/>
+                    </a:xfrm>
+                    <a:prstGeom prst="rect">
+                      <a:avLst/>
+                    </a:prstGeom>
+                    <a:noFill/>
+                    <a:ln w="9525">
+                      <a:noFill/>
+                      <a:headEnd/>
+                      <a:tailEnd/>
+                    </a:ln>
+                  </pic:spPr>
+                </pic:pic>
+              </a:graphicData>
+            </a:graphic>
+          </wp:inline>
+        </w:drawing>
+      </w:r>
+      <w:r>
+        <w:t xml:space="preserve"> </w:t>
+      </w:r>
+      <w:r>
+        <w:rPr>
+          <w:i/>
+          <w:iCs/>
+        </w:rPr>
+        <w:t xml:space="preserve">Figure: System Visualization 7</w:t>
       </w:r>
     </w:p>
     <w:p>
@@ -3011,9 +3416,9 @@
         </w:pict>
       </w:r>
     </w:p>
-    <w:bookmarkEnd w:id="67"/>
-    <w:bookmarkEnd w:id="68"/>
-    <w:bookmarkStart w:id="71" w:name="X2419d0a7b0e748616544cd4dd00f6817fd734db"/>
+    <w:bookmarkEnd w:id="83"/>
+    <w:bookmarkEnd w:id="84"/>
+    <w:bookmarkStart w:id="87" w:name="X2419d0a7b0e748616544cd4dd00f6817fd734db"/>
     <w:p>
       <w:pPr>
         <w:pStyle w:val="Heading1"/>
@@ -3022,7 +3427,7 @@
         <w:t xml:space="preserve">Chapter 12: Deployment &amp; Containerization Architecture</w:t>
       </w:r>
     </w:p>
-    <w:bookmarkStart w:id="69" w:name="docker-multi-stage-builds"/>
+    <w:bookmarkStart w:id="85" w:name="docker-multi-stage-builds"/>
     <w:p>
       <w:pPr>
         <w:pStyle w:val="Heading2"/>
@@ -3143,8 +3548,8 @@
         <w:t xml:space="preserve">By using multi-stage builds, the final Next.js production image size is reduced by over 80% (from ~1.5GB to ~150MB). This drastically speeds up Kubernetes pod initialization times during horizontal scaling events.</w:t>
       </w:r>
     </w:p>
-    <w:bookmarkEnd w:id="69"/>
-    <w:bookmarkStart w:id="70" w:name="kubernetes-deployment-strategy"/>
+    <w:bookmarkEnd w:id="85"/>
+    <w:bookmarkStart w:id="86" w:name="kubernetes-deployment-strategy"/>
     <w:p>
       <w:pPr>
         <w:pStyle w:val="Heading2"/>
@@ -3249,9 +3654,9 @@
         </w:pict>
       </w:r>
     </w:p>
-    <w:bookmarkEnd w:id="70"/>
-    <w:bookmarkEnd w:id="71"/>
-    <w:bookmarkStart w:id="74" w:name="Xbcf302662d9d8ad3f2e49b5d3423ae3ef784e91"/>
+    <w:bookmarkEnd w:id="86"/>
+    <w:bookmarkEnd w:id="87"/>
+    <w:bookmarkStart w:id="90" w:name="Xbcf302662d9d8ad3f2e49b5d3423ae3ef784e91"/>
     <w:p>
       <w:pPr>
         <w:pStyle w:val="Heading1"/>
@@ -3260,7 +3665,7 @@
         <w:t xml:space="preserve">Chapter 13: Scaling Strategy &amp; Disaster Recovery</w:t>
       </w:r>
     </w:p>
-    <w:bookmarkStart w:id="72" w:name="horizontal-vs-vertical-scaling"/>
+    <w:bookmarkStart w:id="88" w:name="horizontal-vs-vertical-scaling"/>
     <w:p>
       <w:pPr>
         <w:pStyle w:val="Heading2"/>
@@ -3314,8 +3719,8 @@
         <w:t xml:space="preserve">(adding more RAM and CPU to the single master node) or scaled via Read Replicas, because relational databases are inherently stateful.</w:t>
       </w:r>
     </w:p>
-    <w:bookmarkEnd w:id="72"/>
-    <w:bookmarkStart w:id="73" w:name="disaster-recovery-backups"/>
+    <w:bookmarkEnd w:id="88"/>
+    <w:bookmarkStart w:id="89" w:name="disaster-recovery-backups"/>
     <w:p>
       <w:pPr>
         <w:pStyle w:val="Heading2"/>
@@ -3411,9 +3816,9 @@
         <w:t xml:space="preserve">extension enabled. RDS provides automated daily snapshots and Point-In-Time-Recovery (PITR), guaranteeing that even in a worst-case scenario, data loss is mitigated to the exact minute before the crash.</w:t>
       </w:r>
     </w:p>
-    <w:bookmarkEnd w:id="73"/>
-    <w:bookmarkEnd w:id="74"/>
-    <w:bookmarkStart w:id="78" w:name="Xb1332ee2655e6c84aaeab99b52ecdcf99580db2"/>
+    <w:bookmarkEnd w:id="89"/>
+    <w:bookmarkEnd w:id="90"/>
+    <w:bookmarkStart w:id="94" w:name="Xb1332ee2655e6c84aaeab99b52ecdcf99580db2"/>
     <w:p>
       <w:pPr>
         <w:pStyle w:val="Heading1"/>
@@ -3422,7 +3827,7 @@
         <w:t xml:space="preserve">Chapter 14: Security Audit &amp; Threat Modeling</w:t>
       </w:r>
     </w:p>
-    <w:bookmarkStart w:id="75" w:name="introduction-2"/>
+    <w:bookmarkStart w:id="91" w:name="introduction-2"/>
     <w:p>
       <w:pPr>
         <w:pStyle w:val="Heading2"/>
@@ -3481,8 +3886,8 @@
         <w:t xml:space="preserve">attacks.</w:t>
       </w:r>
     </w:p>
-    <w:bookmarkEnd w:id="75"/>
-    <w:bookmarkStart w:id="76" w:name="prompt-injection-mitigation"/>
+    <w:bookmarkEnd w:id="91"/>
+    <w:bookmarkStart w:id="92" w:name="prompt-injection-mitigation"/>
     <w:p>
       <w:pPr>
         <w:pStyle w:val="Heading2"/>
@@ -3578,8 +3983,8 @@
         <w:t xml:space="preserve">: The user’s query and the retrieved database context are strictly separated in the API schema. The LLM is mathematically less likely to confuse user input for systemic instructions.</w:t>
       </w:r>
     </w:p>
-    <w:bookmarkEnd w:id="76"/>
-    <w:bookmarkStart w:id="77" w:name="role-based-data-exfiltration-prevention"/>
+    <w:bookmarkEnd w:id="92"/>
+    <w:bookmarkStart w:id="93" w:name="role-based-data-exfiltration-prevention"/>
     <w:p>
       <w:pPr>
         <w:pStyle w:val="Heading2"/>
@@ -3731,9 +4136,9 @@
         </w:pict>
       </w:r>
     </w:p>
-    <w:bookmarkEnd w:id="77"/>
-    <w:bookmarkEnd w:id="78"/>
-    <w:bookmarkStart w:id="81" w:name="chapter-15-performance-optimization"/>
+    <w:bookmarkEnd w:id="93"/>
+    <w:bookmarkEnd w:id="94"/>
+    <w:bookmarkStart w:id="97" w:name="chapter-15-performance-optimization"/>
     <w:p>
       <w:pPr>
         <w:pStyle w:val="Heading1"/>
@@ -3742,7 +4147,7 @@
         <w:t xml:space="preserve">Chapter 15: Performance Optimization</w:t>
       </w:r>
     </w:p>
-    <w:bookmarkStart w:id="79" w:name="vector-search-latency"/>
+    <w:bookmarkStart w:id="95" w:name="vector-search-latency"/>
     <w:p>
       <w:pPr>
         <w:pStyle w:val="Heading2"/>
@@ -3901,8 +4306,8 @@
         <w:t xml:space="preserve">.</w:t>
       </w:r>
     </w:p>
-    <w:bookmarkEnd w:id="79"/>
-    <w:bookmarkStart w:id="80" w:name="redis-caching"/>
+    <w:bookmarkEnd w:id="95"/>
+    <w:bookmarkStart w:id="96" w:name="redis-caching"/>
     <w:p>
       <w:pPr>
         <w:pStyle w:val="Heading2"/>
@@ -3965,9 +4370,9 @@
         </w:pict>
       </w:r>
     </w:p>
-    <w:bookmarkEnd w:id="80"/>
-    <w:bookmarkEnd w:id="81"/>
-    <w:bookmarkStart w:id="84" w:name="chapter-16-cicd-production-readiness"/>
+    <w:bookmarkEnd w:id="96"/>
+    <w:bookmarkEnd w:id="97"/>
+    <w:bookmarkStart w:id="100" w:name="chapter-16-cicd-production-readiness"/>
     <w:p>
       <w:pPr>
         <w:pStyle w:val="Heading1"/>
@@ -3976,7 +4381,7 @@
         <w:t xml:space="preserve">Chapter 16: CI/CD &amp; Production Readiness</w:t>
       </w:r>
     </w:p>
-    <w:bookmarkStart w:id="82" w:name="continuous-integration-github-actions"/>
+    <w:bookmarkStart w:id="98" w:name="continuous-integration-github-actions"/>
     <w:p>
       <w:pPr>
         <w:pStyle w:val="Heading2"/>
@@ -4137,8 +4542,8 @@
         <w:t xml:space="preserve">is not broken.</w:t>
       </w:r>
     </w:p>
-    <w:bookmarkEnd w:id="82"/>
-    <w:bookmarkStart w:id="83" w:name="production-readiness-checklist"/>
+    <w:bookmarkEnd w:id="98"/>
+    <w:bookmarkStart w:id="99" w:name="production-readiness-checklist"/>
     <w:p>
       <w:pPr>
         <w:pStyle w:val="Heading2"/>
@@ -4258,9 +4663,9 @@
         <w:t xml:space="preserve">: Grafana dashboards are actively capturing OpenTelemetry traces, and Slack alerts are configured for HTTP 500 errors.</w:t>
       </w:r>
     </w:p>
-    <w:bookmarkEnd w:id="83"/>
-    <w:bookmarkEnd w:id="84"/>
-    <w:bookmarkStart w:id="85" w:name="conclusion-final-thoughts"/>
+    <w:bookmarkEnd w:id="99"/>
+    <w:bookmarkEnd w:id="100"/>
+    <w:bookmarkStart w:id="101" w:name="conclusion-final-thoughts"/>
     <w:p>
       <w:pPr>
         <w:pStyle w:val="Heading1"/>
@@ -4277,8 +4682,8 @@
         <w:t xml:space="preserve">You have successfully traced the entire execution lifecycle of the Athenis platform. You understand the business tradeoffs of the microservices topology, the mathematical necessity of Reciprocal Rank Fusion, the asynchronous elegance of the Celery ingestion pipeline, and the defensive security posture of the pgvector implementation. You are now equipped to operate and scale this platform at a massive enterprise level.</w:t>
       </w:r>
     </w:p>
-    <w:bookmarkEnd w:id="85"/>
-    <w:bookmarkStart w:id="88" w:name="X3d277326781992caf26d6f3544d7784104c0b50"/>
+    <w:bookmarkEnd w:id="101"/>
+    <w:bookmarkStart w:id="104" w:name="X3d277326781992caf26d6f3544d7784104c0b50"/>
     <w:p>
       <w:pPr>
         <w:pStyle w:val="Heading1"/>
@@ -4287,7 +4692,7 @@
         <w:t xml:space="preserve">Chapter 18: Security Audit &amp; Threat Modeling</w:t>
       </w:r>
     </w:p>
-    <w:bookmarkStart w:id="86" w:name="introduction-3"/>
+    <w:bookmarkStart w:id="102" w:name="introduction-3"/>
     <w:p>
       <w:pPr>
         <w:pStyle w:val="Heading2"/>
@@ -4346,8 +4751,8 @@
         <w:t xml:space="preserve">attacks.</w:t>
       </w:r>
     </w:p>
-    <w:bookmarkEnd w:id="86"/>
-    <w:bookmarkStart w:id="87" w:name="prompt-injection-mitigation-1"/>
+    <w:bookmarkEnd w:id="102"/>
+    <w:bookmarkStart w:id="103" w:name="prompt-injection-mitigation-1"/>
     <w:p>
       <w:pPr>
         <w:pStyle w:val="Heading2"/>
@@ -4496,9 +4901,9 @@
         </w:pict>
       </w:r>
     </w:p>
-    <w:bookmarkEnd w:id="87"/>
-    <w:bookmarkEnd w:id="88"/>
-    <w:bookmarkStart w:id="91" w:name="Xf0b7871ca72e650df5bd9f6476713f3502db1fb"/>
+    <w:bookmarkEnd w:id="103"/>
+    <w:bookmarkEnd w:id="104"/>
+    <w:bookmarkStart w:id="107" w:name="Xf0b7871ca72e650df5bd9f6476713f3502db1fb"/>
     <w:p>
       <w:pPr>
         <w:pStyle w:val="Heading1"/>
@@ -4507,7 +4912,7 @@
         <w:t xml:space="preserve">Chapter 19: Disaster Recovery, Backup &amp; Restore</w:t>
       </w:r>
     </w:p>
-    <w:bookmarkStart w:id="89" w:name="the-rto-and-rpo-strategy"/>
+    <w:bookmarkStart w:id="105" w:name="the-rto-and-rpo-strategy"/>
     <w:p>
       <w:pPr>
         <w:pStyle w:val="Heading2"/>
@@ -4545,8 +4950,8 @@
         <w:t xml:space="preserve">, they can be re-deployed into a secondary region instantly via Helm charts.</w:t>
       </w:r>
     </w:p>
-    <w:bookmarkEnd w:id="89"/>
-    <w:bookmarkStart w:id="90" w:name="restoring-postgresql-pgvector"/>
+    <w:bookmarkEnd w:id="105"/>
+    <w:bookmarkStart w:id="106" w:name="restoring-postgresql-pgvector"/>
     <w:p>
       <w:pPr>
         <w:pStyle w:val="Heading2"/>
@@ -4591,9 +4996,9 @@
         </w:pict>
       </w:r>
     </w:p>
-    <w:bookmarkEnd w:id="90"/>
-    <w:bookmarkEnd w:id="91"/>
-    <w:bookmarkStart w:id="95" w:name="X140e3ca9636f220e2346450b9382f3e4b023803"/>
+    <w:bookmarkEnd w:id="106"/>
+    <w:bookmarkEnd w:id="107"/>
+    <w:bookmarkStart w:id="111" w:name="X140e3ca9636f220e2346450b9382f3e4b023803"/>
     <w:p>
       <w:pPr>
         <w:pStyle w:val="Heading1"/>
@@ -4602,7 +5007,7 @@
         <w:t xml:space="preserve">Chapter 20: Extension Guide for Future Developers</w:t>
       </w:r>
     </w:p>
-    <w:bookmarkStart w:id="92" w:name="X9c2e774d9b9579cce7c0e3989404d36d91cb83d"/>
+    <w:bookmarkStart w:id="108" w:name="X9c2e774d9b9579cce7c0e3989404d36d91cb83d"/>
     <w:p>
       <w:pPr>
         <w:pStyle w:val="Heading2"/>
@@ -4682,8 +5087,8 @@
         <w:t xml:space="preserve">3. Once the Okta assertion is verified, generate the exact same internal JWT payload that the standard password flow generates. This ensures you do not need to modify the RBAC dependencies across the rest of the application.</w:t>
       </w:r>
     </w:p>
-    <w:bookmarkEnd w:id="92"/>
-    <w:bookmarkStart w:id="93" w:name="modifying-the-chunking-strategy"/>
+    <w:bookmarkEnd w:id="108"/>
+    <w:bookmarkStart w:id="109" w:name="modifying-the-chunking-strategy"/>
     <w:p>
       <w:pPr>
         <w:pStyle w:val="Heading2"/>
@@ -4765,8 +5170,8 @@
         <w:t xml:space="preserve">: This will require re-embedding every single document in the database, because the old 1000-character vectors are mathematically incompatible with the new 2000-character chunks. You must write an Alembic data migration to execute this.</w:t>
       </w:r>
     </w:p>
-    <w:bookmarkEnd w:id="93"/>
-    <w:bookmarkStart w:id="94" w:name="key-takeaways"/>
+    <w:bookmarkEnd w:id="109"/>
+    <w:bookmarkStart w:id="110" w:name="key-takeaways"/>
     <w:p>
       <w:pPr>
         <w:pStyle w:val="Heading2"/>
@@ -4853,8 +5258,8 @@
         <w:t xml:space="preserve">This concludes the Athenis Enterprise Engineering Handbook.</w:t>
       </w:r>
     </w:p>
-    <w:bookmarkEnd w:id="94"/>
-    <w:bookmarkEnd w:id="95"/>
+    <w:bookmarkEnd w:id="110"/>
+    <w:bookmarkEnd w:id="111"/>
     <w:sectPr>
       <w:footnotePr>
         <w:numRestart w:val="eachSect"/>

</xml_diff>

<commit_message>
docs: Restore native Table of Contents generation and remove enterprise confidentiality notices for open-source release
</commit_message>
<xml_diff>
--- a/Athenis_Technical_Documentation.docx
+++ b/Athenis_Technical_Documentation.docx
@@ -4,29 +4,101 @@
   <w:body>
     <w:p>
       <w:pPr>
+        <w:pStyle w:val="Title"/>
+      </w:pPr>
+      <w:r>
+        <w:t xml:space="preserve">Athenis AI Platform</w:t>
+      </w:r>
+    </w:p>
+    <w:p>
+      <w:pPr>
+        <w:pStyle w:val="Subtitle"/>
+      </w:pPr>
+      <w:r>
+        <w:t xml:space="preserve">Technical Architecture Handbook</w:t>
+      </w:r>
+    </w:p>
+    <w:p>
+      <w:pPr>
+        <w:pStyle w:val="Author"/>
+      </w:pPr>
+      <w:r>
+        <w:t xml:space="preserve">Ruthvek Kannan</w:t>
+      </w:r>
+    </w:p>
+    <w:p>
+      <w:pPr>
+        <w:pStyle w:val="Date"/>
+      </w:pPr>
+      <w:r>
+        <w:t xml:space="preserve">June 2026</w:t>
+      </w:r>
+    </w:p>
+    <w:sdt>
+      <w:sdtPr>
+        <w:docPartObj>
+          <w:docPartGallery w:val="Table of Contents"/>
+          <w:docPartUnique/>
+        </w:docPartObj>
+      </w:sdtPr>
+      <w:sdtContent>
+        <w:p>
+          <w:pPr>
+            <w:pStyle w:val="TOCHeading"/>
+          </w:pPr>
+          <w:r>
+            <w:t xml:space="preserve">Table of Contents</w:t>
+          </w:r>
+        </w:p>
+        <w:p>
+          <w:r>
+            <w:fldChar w:fldCharType="begin" w:dirty="true"/>
+            <w:instrText xml:space="preserve">TOC \o "1-3" \h \z \u</w:instrText>
+            <w:fldChar w:fldCharType="separate"/>
+            <w:fldChar w:fldCharType="end"/>
+          </w:r>
+        </w:p>
+      </w:sdtContent>
+    </w:sdt>
+    <w:p>
+      <w:r>
+        <w:br w:type="page"/>
+      </w:r>
+    </w:p>
+    <w:bookmarkStart w:id="12" w:name="chapter-1-the-business-problem"/>
+    <w:p>
+      <w:pPr>
+        <w:pStyle w:val="Heading1"/>
+      </w:pPr>
+      <w:r>
+        <w:t xml:space="preserve">Chapter 1: The Business Problem</w:t>
+      </w:r>
+    </w:p>
+    <w:bookmarkStart w:id="9" w:name="introduction"/>
+    <w:p>
+      <w:pPr>
+        <w:pStyle w:val="Heading2"/>
+      </w:pPr>
+      <w:r>
+        <w:t xml:space="preserve">1.1 Introduction</w:t>
+      </w:r>
+    </w:p>
+    <w:p>
+      <w:pPr>
         <w:pStyle w:val="FirstParagraph"/>
       </w:pPr>
-    </w:p>
-    <w:bookmarkStart w:id="10" w:name="athenis-ai-platform"/>
-    <w:p>
-      <w:pPr>
-        <w:pStyle w:val="Heading1"/>
-      </w:pPr>
-      <w:r>
-        <w:rPr>
-          <w:b/>
-          <w:bCs/>
-        </w:rPr>
-        <w:t xml:space="preserve">Athenis AI Platform</w:t>
-      </w:r>
-    </w:p>
-    <w:bookmarkStart w:id="9" w:name="Xac8a91fbc7bb5ceb11cb44143b17d1b972046a1"/>
+      <w:r>
+        <w:t xml:space="preserve">In the era of Generative AI, enterprises face a paradox: they possess petabytes of valuable unstructured data (e.g., proprietary legal contracts, internal wikis, financial reports), but exposing this data to public Large Language Models (LLMs) like OpenAI’s ChatGPT presents an unacceptable security and compliance risk. Conversely, training a massive, proprietary foundational model from scratch costs millions of dollars in compute (GPU clusters) and requires highly specialized machine learning engineers.</w:t>
+      </w:r>
+    </w:p>
+    <w:bookmarkEnd w:id="9"/>
+    <w:bookmarkStart w:id="10" w:name="Xe29d92ce0476a76bdc897c9da50f83b04df9f0b"/>
     <w:p>
       <w:pPr>
         <w:pStyle w:val="Heading2"/>
       </w:pPr>
       <w:r>
-        <w:t xml:space="preserve">Enterprise Engineering Architecture Handbook</w:t>
+        <w:t xml:space="preserve">1.2 The Solution: Retrieval-Augmented Generation (RAG)</w:t>
       </w:r>
     </w:p>
     <w:p>
@@ -34,58 +106,66 @@
         <w:pStyle w:val="FirstParagraph"/>
       </w:pPr>
       <w:r>
-        <w:t xml:space="preserve"> </w:t>
-      </w:r>
-      <w:r>
-        <w:rPr>
-          <w:b/>
-          <w:bCs/>
-        </w:rPr>
-        <w:t xml:space="preserve">Prepared by:</w:t>
-      </w:r>
-      <w:r>
-        <w:t xml:space="preserve"> </w:t>
-      </w:r>
-      <w:r>
-        <w:t xml:space="preserve">Ruthvek Kannan</w:t>
-      </w:r>
-      <w:r>
-        <w:br/>
-      </w:r>
-      <w:r>
-        <w:rPr>
-          <w:b/>
-          <w:bCs/>
-        </w:rPr>
-        <w:t xml:space="preserve">Date:</w:t>
-      </w:r>
-      <w:r>
-        <w:t xml:space="preserve"> </w:t>
-      </w:r>
-      <w:r>
-        <w:t xml:space="preserve">June 2026</w:t>
-      </w:r>
-      <w:r>
-        <w:br/>
-      </w:r>
-      <w:r>
-        <w:rPr>
-          <w:b/>
-          <w:bCs/>
-        </w:rPr>
-        <w:t xml:space="preserve">Version:</w:t>
-      </w:r>
-      <w:r>
-        <w:t xml:space="preserve"> </w:t>
-      </w:r>
-      <w:r>
-        <w:t xml:space="preserve">1.0.0 (Final Architecture Review)</w:t>
+        <w:rPr>
+          <w:b/>
+          <w:bCs/>
+        </w:rPr>
+        <w:t xml:space="preserve">Athenis</w:t>
+      </w:r>
+      <w:r>
+        <w:t xml:space="preserve"> </w:t>
+      </w:r>
+      <w:r>
+        <w:t xml:space="preserve">was engineered specifically to solve this enterprise dilemma. It implements a self-hosted, scalable</w:t>
+      </w:r>
+      <w:r>
+        <w:t xml:space="preserve"> </w:t>
+      </w:r>
+      <w:r>
+        <w:rPr>
+          <w:b/>
+          <w:bCs/>
+        </w:rPr>
+        <w:t xml:space="preserve">Retrieval-Augmented Generation (RAG)</w:t>
+      </w:r>
+      <w:r>
+        <w:t xml:space="preserve"> </w:t>
+      </w:r>
+      <w:r>
+        <w:t xml:space="preserve">architecture.</w:t>
       </w:r>
     </w:p>
     <w:p>
       <w:pPr>
         <w:pStyle w:val="BodyText"/>
       </w:pPr>
+      <w:r>
+        <w:t xml:space="preserve">Instead of embedding facts directly into a model’s weights through training, Athenis acts as an intelligent intermediary. When an enterprise user asks a question, the platform:</w:t>
+      </w:r>
+      <w:r>
+        <w:t xml:space="preserve"> </w:t>
+      </w:r>
+      <w:r>
+        <w:t xml:space="preserve">1. Intercepts the query.</w:t>
+      </w:r>
+      <w:r>
+        <w:t xml:space="preserve"> </w:t>
+      </w:r>
+      <w:r>
+        <w:t xml:space="preserve">2. Securely searches a proprietary, self-hosted database for highly relevant internal documents.</w:t>
+      </w:r>
+      <w:r>
+        <w:t xml:space="preserve"> </w:t>
+      </w:r>
+      <w:r>
+        <w:t xml:space="preserve">3. Injects those exact documents directly into the prompt context.</w:t>
+      </w:r>
+      <w:r>
+        <w:t xml:space="preserve"> </w:t>
+      </w:r>
+      <w:r>
+        <w:t xml:space="preserve">4. Forwards this context-rich prompt to an LLM to generate a precise, halluciation-free answer.</w:t>
+      </w:r>
     </w:p>
     <w:p>
       <w:pPr>
@@ -96,112 +176,97 @@
           <w:b/>
           <w:bCs/>
         </w:rPr>
-        <w:t xml:space="preserve">CONFIDENTIALITY NOTICE</w:t>
-      </w:r>
-      <w:r>
-        <w:br/>
-      </w:r>
-      <w:r>
-        <w:t xml:space="preserve">This handbook contains sensitive architectural topology and security threat models for the Athenis RAG Platform. Do not distribute outside of the core engineering team.</w:t>
-      </w:r>
-    </w:p>
-    <w:p>
-      <w:r>
-        <w:br w:type="page"/>
-      </w:r>
-    </w:p>
-    <w:bookmarkEnd w:id="9"/>
-    <w:bookmarkEnd w:id="10"/>
-    <w:bookmarkStart w:id="11" w:name="table-of-contents"/>
-    <w:p>
-      <w:pPr>
-        <w:pStyle w:val="Heading1"/>
-      </w:pPr>
-      <w:r>
-        <w:t xml:space="preserve">Table of Contents</w:t>
-      </w:r>
-    </w:p>
-    <w:p>
-      <w:pPr>
-        <w:pStyle w:val="FirstParagraph"/>
-      </w:pPr>
+        <w:t xml:space="preserve">Engineering Insight</w:t>
+      </w:r>
+      <w:r>
+        <w:t xml:space="preserve"> </w:t>
+      </w:r>
+      <w:r>
+        <w:t xml:space="preserve">By strictly separating the</w:t>
+      </w:r>
+      <w:r>
+        <w:t xml:space="preserve"> </w:t>
+      </w:r>
       <w:r>
         <w:rPr>
           <w:i/>
           <w:iCs/>
         </w:rPr>
-        <w:t xml:space="preserve">Note: Please right-click here in Microsoft Word and select</w:t>
+        <w:t xml:space="preserve">retrieval</w:t>
+      </w:r>
+      <w:r>
+        <w:t xml:space="preserve"> </w:t>
+      </w:r>
+      <w:r>
+        <w:t xml:space="preserve">of facts from the</w:t>
+      </w:r>
+      <w:r>
+        <w:t xml:space="preserve"> </w:t>
       </w:r>
       <w:r>
         <w:rPr>
           <w:i/>
           <w:iCs/>
         </w:rPr>
-        <w:t xml:space="preserve"> </w:t>
-      </w:r>
-      <w:r>
-        <w:rPr>
-          <w:i/>
-          <w:iCs/>
-        </w:rPr>
-        <w:t xml:space="preserve">“Update Field”</w:t>
-      </w:r>
-      <w:r>
-        <w:rPr>
-          <w:i/>
-          <w:iCs/>
-        </w:rPr>
-        <w:t xml:space="preserve"> </w:t>
-      </w:r>
-      <w:r>
-        <w:rPr>
-          <w:i/>
-          <w:iCs/>
-        </w:rPr>
-        <w:t xml:space="preserve">-&gt;</w:t>
-      </w:r>
-      <w:r>
-        <w:rPr>
-          <w:i/>
-          <w:iCs/>
-        </w:rPr>
-        <w:t xml:space="preserve"> </w:t>
-      </w:r>
-      <w:r>
-        <w:rPr>
-          <w:i/>
-          <w:iCs/>
-        </w:rPr>
-        <w:t xml:space="preserve">“Update entire table”</w:t>
-      </w:r>
-      <w:r>
-        <w:rPr>
-          <w:i/>
-          <w:iCs/>
-        </w:rPr>
-        <w:t xml:space="preserve"> </w:t>
-      </w:r>
-      <w:r>
-        <w:rPr>
-          <w:i/>
-          <w:iCs/>
-        </w:rPr>
-        <w:t xml:space="preserve">to generate the clickable Table of Contents.</w:t>
-      </w:r>
-    </w:p>
-    <w:p>
-      <w:r>
-        <w:br w:type="page"/>
-      </w:r>
-    </w:p>
-    <w:bookmarkEnd w:id="11"/>
-    <w:bookmarkStart w:id="12" w:name="athenis-enterprise-engineering-handbook"/>
-    <w:p>
-      <w:pPr>
-        <w:pStyle w:val="Heading1"/>
-      </w:pPr>
-      <w:r>
-        <w:t xml:space="preserve">Athenis Enterprise Engineering Handbook</w:t>
+        <w:t xml:space="preserve">generation</w:t>
+      </w:r>
+      <w:r>
+        <w:t xml:space="preserve"> </w:t>
+      </w:r>
+      <w:r>
+        <w:t xml:space="preserve">of text, Athenis guarantees that the AI cannot hallucinate answers outside of the provided context. Furthermore, because the database is self-hosted, row-level security and Role-Based Access Control (RBAC) can be rigidly enforced before the LLM ever sees the data.</w:t>
+      </w:r>
+    </w:p>
+    <w:bookmarkEnd w:id="10"/>
+    <w:bookmarkStart w:id="11" w:name="preventing-vendor-lock-in"/>
+    <w:p>
+      <w:pPr>
+        <w:pStyle w:val="Heading2"/>
+      </w:pPr>
+      <w:r>
+        <w:t xml:space="preserve">1.3 Preventing Vendor Lock-in</w:t>
+      </w:r>
+    </w:p>
+    <w:p>
+      <w:pPr>
+        <w:pStyle w:val="FirstParagraph"/>
+      </w:pPr>
+      <w:r>
+        <w:t xml:space="preserve">A secondary, but equally critical, business problem is</w:t>
+      </w:r>
+      <w:r>
+        <w:t xml:space="preserve"> </w:t>
+      </w:r>
+      <w:r>
+        <w:rPr>
+          <w:b/>
+          <w:bCs/>
+        </w:rPr>
+        <w:t xml:space="preserve">vendor lock-in</w:t>
+      </w:r>
+      <w:r>
+        <w:t xml:space="preserve">. The landscape of AI providers is volatile; a model that is state-of-the-art today may be obsolete or prohibitively expensive tomorrow.</w:t>
+      </w:r>
+    </w:p>
+    <w:p>
+      <w:pPr>
+        <w:pStyle w:val="BodyText"/>
+      </w:pPr>
+      <w:r>
+        <w:t xml:space="preserve">To mitigate this, Athenis integrates</w:t>
+      </w:r>
+      <w:r>
+        <w:t xml:space="preserve"> </w:t>
+      </w:r>
+      <w:r>
+        <w:rPr>
+          <w:b/>
+          <w:bCs/>
+        </w:rPr>
+        <w:t xml:space="preserve">LiteLLM</w:t>
+      </w:r>
+      <w:r>
+        <w:t xml:space="preserve">, a dynamic routing abstraction layer. This allows the enterprise to swap between Google Gemini, Anthropic Claude, OpenAI, or even locally hosted open-source models (via Ollama) by simply changing an environment variable, requiring zero code changes to the core application.</w:t>
       </w:r>
     </w:p>
     <w:p>
@@ -211,23 +276,24 @@
         </w:pict>
       </w:r>
     </w:p>
+    <w:bookmarkEnd w:id="11"/>
     <w:bookmarkEnd w:id="12"/>
-    <w:bookmarkStart w:id="16" w:name="chapter-1-the-business-problem"/>
+    <w:bookmarkStart w:id="26" w:name="chapter-2-high-level-architecture"/>
     <w:p>
       <w:pPr>
         <w:pStyle w:val="Heading1"/>
       </w:pPr>
       <w:r>
-        <w:t xml:space="preserve">Chapter 1: The Business Problem</w:t>
-      </w:r>
-    </w:p>
-    <w:bookmarkStart w:id="13" w:name="introduction"/>
+        <w:t xml:space="preserve">Chapter 2: High Level Architecture</w:t>
+      </w:r>
+    </w:p>
+    <w:bookmarkStart w:id="17" w:name="architectural-topology"/>
     <w:p>
       <w:pPr>
         <w:pStyle w:val="Heading2"/>
       </w:pPr>
       <w:r>
-        <w:t xml:space="preserve">1.1 Introduction</w:t>
+        <w:t xml:space="preserve">2.1 Architectural Topology</w:t>
       </w:r>
     </w:p>
     <w:p>
@@ -235,17 +301,50 @@
         <w:pStyle w:val="FirstParagraph"/>
       </w:pPr>
       <w:r>
-        <w:t xml:space="preserve">In the era of Generative AI, enterprises face a paradox: they possess petabytes of valuable unstructured data (e.g., proprietary legal contracts, internal wikis, financial reports), but exposing this data to public Large Language Models (LLMs) like OpenAI’s ChatGPT presents an unacceptable security and compliance risk. Conversely, training a massive, proprietary foundational model from scratch costs millions of dollars in compute (GPU clusters) and requires highly specialized machine learning engineers.</w:t>
+        <w:t xml:space="preserve">Athenis departs from traditional monolithic design patterns, opting instead for a highly decoupled, microservices-inspired architecture. This topology strictly separates the presentation layer, the synchronous API gateway, and the asynchronous background compute engines.</w:t>
+      </w:r>
+    </w:p>
+    <w:bookmarkStart w:id="13" w:name="the-presentation-tier-next.js"/>
+    <w:p>
+      <w:pPr>
+        <w:pStyle w:val="Heading3"/>
+      </w:pPr>
+      <w:r>
+        <w:t xml:space="preserve">2.1.1 The Presentation Tier (Next.js)</w:t>
+      </w:r>
+    </w:p>
+    <w:p>
+      <w:pPr>
+        <w:pStyle w:val="FirstParagraph"/>
+      </w:pPr>
+      <w:r>
+        <w:t xml:space="preserve">The frontend is a React-based application built on the</w:t>
+      </w:r>
+      <w:r>
+        <w:t xml:space="preserve"> </w:t>
+      </w:r>
+      <w:r>
+        <w:rPr>
+          <w:b/>
+          <w:bCs/>
+        </w:rPr>
+        <w:t xml:space="preserve">Next.js</w:t>
+      </w:r>
+      <w:r>
+        <w:t xml:space="preserve"> </w:t>
+      </w:r>
+      <w:r>
+        <w:t xml:space="preserve">framework. Next.js was chosen specifically for its App Router paradigm, which allows for aggressive server-side rendering (SSR) and seamless API route handling. The interface is styled using Tailwind CSS for rapid, utility-first design.</w:t>
       </w:r>
     </w:p>
     <w:bookmarkEnd w:id="13"/>
-    <w:bookmarkStart w:id="14" w:name="Xe29d92ce0476a76bdc897c9da50f83b04df9f0b"/>
-    <w:p>
-      <w:pPr>
-        <w:pStyle w:val="Heading2"/>
-      </w:pPr>
-      <w:r>
-        <w:t xml:space="preserve">1.2 The Solution: Retrieval-Augmented Generation (RAG)</w:t>
+    <w:bookmarkStart w:id="14" w:name="the-synchronous-gateway-fastapi"/>
+    <w:p>
+      <w:pPr>
+        <w:pStyle w:val="Heading3"/>
+      </w:pPr>
+      <w:r>
+        <w:t xml:space="preserve">2.1.2 The Synchronous Gateway (FastAPI)</w:t>
       </w:r>
     </w:p>
     <w:p>
@@ -253,33 +352,56 @@
         <w:pStyle w:val="FirstParagraph"/>
       </w:pPr>
       <w:r>
-        <w:rPr>
-          <w:b/>
-          <w:bCs/>
-        </w:rPr>
-        <w:t xml:space="preserve">Athenis</w:t>
-      </w:r>
-      <w:r>
-        <w:t xml:space="preserve"> </w:t>
-      </w:r>
-      <w:r>
-        <w:t xml:space="preserve">was engineered specifically to solve this enterprise dilemma. It implements a self-hosted, scalable</w:t>
-      </w:r>
-      <w:r>
-        <w:t xml:space="preserve"> </w:t>
-      </w:r>
-      <w:r>
-        <w:rPr>
-          <w:b/>
-          <w:bCs/>
-        </w:rPr>
-        <w:t xml:space="preserve">Retrieval-Augmented Generation (RAG)</w:t>
-      </w:r>
-      <w:r>
-        <w:t xml:space="preserve"> </w:t>
-      </w:r>
-      <w:r>
-        <w:t xml:space="preserve">architecture.</w:t>
+        <w:t xml:space="preserve">The core of Athenis is the</w:t>
+      </w:r>
+      <w:r>
+        <w:t xml:space="preserve"> </w:t>
+      </w:r>
+      <w:r>
+        <w:rPr>
+          <w:b/>
+          <w:bCs/>
+        </w:rPr>
+        <w:t xml:space="preserve">FastAPI</w:t>
+      </w:r>
+      <w:r>
+        <w:t xml:space="preserve"> </w:t>
+      </w:r>
+      <w:r>
+        <w:t xml:space="preserve">Python backend. FastAPI was selected over Django or Flask due to its native integration with Python’s</w:t>
+      </w:r>
+      <w:r>
+        <w:t xml:space="preserve"> </w:t>
+      </w:r>
+      <w:r>
+        <w:rPr>
+          <w:rStyle w:val="VerbatimChar"/>
+        </w:rPr>
+        <w:t xml:space="preserve">asyncio</w:t>
+      </w:r>
+      <w:r>
+        <w:t xml:space="preserve"> </w:t>
+      </w:r>
+      <w:r>
+        <w:t xml:space="preserve">event loop. Because the platform spends a significant amount of time waiting for network I/O (e.g., waiting for database queries or LLM responses), an asynchronous loop allows a single Python process to handle thousands of concurrent connections without blocking.</w:t>
+      </w:r>
+    </w:p>
+    <w:bookmarkEnd w:id="14"/>
+    <w:bookmarkStart w:id="15" w:name="Xea8ef6e2a55ce41d0c9f995069d3c5c243b1a29"/>
+    <w:p>
+      <w:pPr>
+        <w:pStyle w:val="Heading3"/>
+      </w:pPr>
+      <w:r>
+        <w:t xml:space="preserve">2.1.3 The Asynchronous Processing Engine (Celery)</w:t>
+      </w:r>
+    </w:p>
+    <w:p>
+      <w:pPr>
+        <w:pStyle w:val="FirstParagraph"/>
+      </w:pPr>
+      <w:r>
+        <w:t xml:space="preserve">While FastAPI handles lightweight, synchronous HTTP requests, processing a 500-page PDF document is massively CPU-bound. Attempting to parse, chunk, and mathematically embed this document inside the FastAPI event loop would instantly crash the server.</w:t>
       </w:r>
     </w:p>
     <w:p>
@@ -287,293 +409,24 @@
         <w:pStyle w:val="BodyText"/>
       </w:pPr>
       <w:r>
-        <w:t xml:space="preserve">Instead of embedding facts directly into a model’s weights through training, Athenis acts as an intelligent intermediary. When an enterprise user asks a question, the platform:</w:t>
-      </w:r>
-      <w:r>
-        <w:t xml:space="preserve"> </w:t>
-      </w:r>
-      <w:r>
-        <w:t xml:space="preserve">1. Intercepts the query.</w:t>
-      </w:r>
-      <w:r>
-        <w:t xml:space="preserve"> </w:t>
-      </w:r>
-      <w:r>
-        <w:t xml:space="preserve">2. Securely searches a proprietary, self-hosted database for highly relevant internal documents.</w:t>
-      </w:r>
-      <w:r>
-        <w:t xml:space="preserve"> </w:t>
-      </w:r>
-      <w:r>
-        <w:t xml:space="preserve">3. Injects those exact documents directly into the prompt context.</w:t>
-      </w:r>
-      <w:r>
-        <w:t xml:space="preserve"> </w:t>
-      </w:r>
-      <w:r>
-        <w:t xml:space="preserve">4. Forwards this context-rich prompt to an LLM to generate a precise, halluciation-free answer.</w:t>
-      </w:r>
-    </w:p>
-    <w:p>
-      <w:pPr>
-        <w:pStyle w:val="BlockText"/>
-      </w:pPr>
-      <w:r>
-        <w:rPr>
-          <w:b/>
-          <w:bCs/>
-        </w:rPr>
-        <w:t xml:space="preserve">Engineering Insight</w:t>
-      </w:r>
-      <w:r>
-        <w:t xml:space="preserve"> </w:t>
-      </w:r>
-      <w:r>
-        <w:t xml:space="preserve">By strictly separating the</w:t>
-      </w:r>
-      <w:r>
-        <w:t xml:space="preserve"> </w:t>
-      </w:r>
-      <w:r>
-        <w:rPr>
-          <w:i/>
-          <w:iCs/>
-        </w:rPr>
-        <w:t xml:space="preserve">retrieval</w:t>
-      </w:r>
-      <w:r>
-        <w:t xml:space="preserve"> </w:t>
-      </w:r>
-      <w:r>
-        <w:t xml:space="preserve">of facts from the</w:t>
-      </w:r>
-      <w:r>
-        <w:t xml:space="preserve"> </w:t>
-      </w:r>
-      <w:r>
-        <w:rPr>
-          <w:i/>
-          <w:iCs/>
-        </w:rPr>
-        <w:t xml:space="preserve">generation</w:t>
-      </w:r>
-      <w:r>
-        <w:t xml:space="preserve"> </w:t>
-      </w:r>
-      <w:r>
-        <w:t xml:space="preserve">of text, Athenis guarantees that the AI cannot hallucinate answers outside of the provided context. Furthermore, because the database is self-hosted, row-level security and Role-Based Access Control (RBAC) can be rigidly enforced before the LLM ever sees the data.</w:t>
-      </w:r>
-    </w:p>
-    <w:bookmarkEnd w:id="14"/>
-    <w:bookmarkStart w:id="15" w:name="preventing-vendor-lock-in"/>
-    <w:p>
-      <w:pPr>
-        <w:pStyle w:val="Heading2"/>
-      </w:pPr>
-      <w:r>
-        <w:t xml:space="preserve">1.3 Preventing Vendor Lock-in</w:t>
-      </w:r>
-    </w:p>
-    <w:p>
-      <w:pPr>
-        <w:pStyle w:val="FirstParagraph"/>
-      </w:pPr>
-      <w:r>
-        <w:t xml:space="preserve">A secondary, but equally critical, business problem is</w:t>
-      </w:r>
-      <w:r>
-        <w:t xml:space="preserve"> </w:t>
-      </w:r>
-      <w:r>
-        <w:rPr>
-          <w:b/>
-          <w:bCs/>
-        </w:rPr>
-        <w:t xml:space="preserve">vendor lock-in</w:t>
-      </w:r>
-      <w:r>
-        <w:t xml:space="preserve">. The landscape of AI providers is volatile; a model that is state-of-the-art today may be obsolete or prohibitively expensive tomorrow.</w:t>
-      </w:r>
-    </w:p>
-    <w:p>
-      <w:pPr>
-        <w:pStyle w:val="BodyText"/>
-      </w:pPr>
-      <w:r>
-        <w:t xml:space="preserve">To mitigate this, Athenis integrates</w:t>
-      </w:r>
-      <w:r>
-        <w:t xml:space="preserve"> </w:t>
-      </w:r>
-      <w:r>
-        <w:rPr>
-          <w:b/>
-          <w:bCs/>
-        </w:rPr>
-        <w:t xml:space="preserve">LiteLLM</w:t>
-      </w:r>
-      <w:r>
-        <w:t xml:space="preserve">, a dynamic routing abstraction layer. This allows the enterprise to swap between Google Gemini, Anthropic Claude, OpenAI, or even locally hosted open-source models (via Ollama) by simply changing an environment variable, requiring zero code changes to the core application.</w:t>
-      </w:r>
-    </w:p>
-    <w:p>
-      <w:r>
-        <w:pict>
-          <v:rect style="width:0;height:1.5pt" o:hralign="center" o:hrstd="t" o:hr="t"/>
-        </w:pict>
+        <w:t xml:space="preserve">To solve this, Athenis employs</w:t>
+      </w:r>
+      <w:r>
+        <w:t xml:space="preserve"> </w:t>
+      </w:r>
+      <w:r>
+        <w:rPr>
+          <w:b/>
+          <w:bCs/>
+        </w:rPr>
+        <w:t xml:space="preserve">Celery</w:t>
+      </w:r>
+      <w:r>
+        <w:t xml:space="preserve">. Celery is a distributed task queue that runs in entirely separate Docker containers. It allows FastAPI to offload heavy compute tasks asynchronously.</w:t>
       </w:r>
     </w:p>
     <w:bookmarkEnd w:id="15"/>
-    <w:bookmarkEnd w:id="16"/>
-    <w:bookmarkStart w:id="30" w:name="chapter-2-high-level-architecture"/>
-    <w:p>
-      <w:pPr>
-        <w:pStyle w:val="Heading1"/>
-      </w:pPr>
-      <w:r>
-        <w:t xml:space="preserve">Chapter 2: High Level Architecture</w:t>
-      </w:r>
-    </w:p>
-    <w:bookmarkStart w:id="21" w:name="architectural-topology"/>
-    <w:p>
-      <w:pPr>
-        <w:pStyle w:val="Heading2"/>
-      </w:pPr>
-      <w:r>
-        <w:t xml:space="preserve">2.1 Architectural Topology</w:t>
-      </w:r>
-    </w:p>
-    <w:p>
-      <w:pPr>
-        <w:pStyle w:val="FirstParagraph"/>
-      </w:pPr>
-      <w:r>
-        <w:t xml:space="preserve">Athenis departs from traditional monolithic design patterns, opting instead for a highly decoupled, microservices-inspired architecture. This topology strictly separates the presentation layer, the synchronous API gateway, and the asynchronous background compute engines.</w:t>
-      </w:r>
-    </w:p>
-    <w:bookmarkStart w:id="17" w:name="the-presentation-tier-next.js"/>
-    <w:p>
-      <w:pPr>
-        <w:pStyle w:val="Heading3"/>
-      </w:pPr>
-      <w:r>
-        <w:t xml:space="preserve">2.1.1 The Presentation Tier (Next.js)</w:t>
-      </w:r>
-    </w:p>
-    <w:p>
-      <w:pPr>
-        <w:pStyle w:val="FirstParagraph"/>
-      </w:pPr>
-      <w:r>
-        <w:t xml:space="preserve">The frontend is a React-based application built on the</w:t>
-      </w:r>
-      <w:r>
-        <w:t xml:space="preserve"> </w:t>
-      </w:r>
-      <w:r>
-        <w:rPr>
-          <w:b/>
-          <w:bCs/>
-        </w:rPr>
-        <w:t xml:space="preserve">Next.js</w:t>
-      </w:r>
-      <w:r>
-        <w:t xml:space="preserve"> </w:t>
-      </w:r>
-      <w:r>
-        <w:t xml:space="preserve">framework. Next.js was chosen specifically for its App Router paradigm, which allows for aggressive server-side rendering (SSR) and seamless API route handling. The interface is styled using Tailwind CSS for rapid, utility-first design.</w:t>
-      </w:r>
-    </w:p>
-    <w:bookmarkEnd w:id="17"/>
-    <w:bookmarkStart w:id="18" w:name="the-synchronous-gateway-fastapi"/>
-    <w:p>
-      <w:pPr>
-        <w:pStyle w:val="Heading3"/>
-      </w:pPr>
-      <w:r>
-        <w:t xml:space="preserve">2.1.2 The Synchronous Gateway (FastAPI)</w:t>
-      </w:r>
-    </w:p>
-    <w:p>
-      <w:pPr>
-        <w:pStyle w:val="FirstParagraph"/>
-      </w:pPr>
-      <w:r>
-        <w:t xml:space="preserve">The core of Athenis is the</w:t>
-      </w:r>
-      <w:r>
-        <w:t xml:space="preserve"> </w:t>
-      </w:r>
-      <w:r>
-        <w:rPr>
-          <w:b/>
-          <w:bCs/>
-        </w:rPr>
-        <w:t xml:space="preserve">FastAPI</w:t>
-      </w:r>
-      <w:r>
-        <w:t xml:space="preserve"> </w:t>
-      </w:r>
-      <w:r>
-        <w:t xml:space="preserve">Python backend. FastAPI was selected over Django or Flask due to its native integration with Python’s</w:t>
-      </w:r>
-      <w:r>
-        <w:t xml:space="preserve"> </w:t>
-      </w:r>
-      <w:r>
-        <w:rPr>
-          <w:rStyle w:val="VerbatimChar"/>
-        </w:rPr>
-        <w:t xml:space="preserve">asyncio</w:t>
-      </w:r>
-      <w:r>
-        <w:t xml:space="preserve"> </w:t>
-      </w:r>
-      <w:r>
-        <w:t xml:space="preserve">event loop. Because the platform spends a significant amount of time waiting for network I/O (e.g., waiting for database queries or LLM responses), an asynchronous loop allows a single Python process to handle thousands of concurrent connections without blocking.</w:t>
-      </w:r>
-    </w:p>
-    <w:bookmarkEnd w:id="18"/>
-    <w:bookmarkStart w:id="19" w:name="Xea8ef6e2a55ce41d0c9f995069d3c5c243b1a29"/>
-    <w:p>
-      <w:pPr>
-        <w:pStyle w:val="Heading3"/>
-      </w:pPr>
-      <w:r>
-        <w:t xml:space="preserve">2.1.3 The Asynchronous Processing Engine (Celery)</w:t>
-      </w:r>
-    </w:p>
-    <w:p>
-      <w:pPr>
-        <w:pStyle w:val="FirstParagraph"/>
-      </w:pPr>
-      <w:r>
-        <w:t xml:space="preserve">While FastAPI handles lightweight, synchronous HTTP requests, processing a 500-page PDF document is massively CPU-bound. Attempting to parse, chunk, and mathematically embed this document inside the FastAPI event loop would instantly crash the server.</w:t>
-      </w:r>
-    </w:p>
-    <w:p>
-      <w:pPr>
-        <w:pStyle w:val="BodyText"/>
-      </w:pPr>
-      <w:r>
-        <w:t xml:space="preserve">To solve this, Athenis employs</w:t>
-      </w:r>
-      <w:r>
-        <w:t xml:space="preserve"> </w:t>
-      </w:r>
-      <w:r>
-        <w:rPr>
-          <w:b/>
-          <w:bCs/>
-        </w:rPr>
-        <w:t xml:space="preserve">Celery</w:t>
-      </w:r>
-      <w:r>
-        <w:t xml:space="preserve">. Celery is a distributed task queue that runs in entirely separate Docker containers. It allows FastAPI to offload heavy compute tasks asynchronously.</w:t>
-      </w:r>
-    </w:p>
-    <w:bookmarkEnd w:id="19"/>
-    <w:bookmarkStart w:id="20" w:name="state-persistence-postgresql-redis"/>
+    <w:bookmarkStart w:id="16" w:name="state-persistence-postgresql-redis"/>
     <w:p>
       <w:pPr>
         <w:pStyle w:val="Heading3"/>
@@ -673,9 +526,9 @@
         <w:t xml:space="preserve">).</w:t>
       </w:r>
     </w:p>
-    <w:bookmarkEnd w:id="20"/>
-    <w:bookmarkEnd w:id="21"/>
-    <w:bookmarkStart w:id="25" w:name="system-diagram"/>
+    <w:bookmarkEnd w:id="16"/>
+    <w:bookmarkEnd w:id="17"/>
+    <w:bookmarkStart w:id="21" w:name="system-diagram"/>
     <w:p>
       <w:pPr>
         <w:pStyle w:val="Heading2"/>
@@ -693,18 +546,18 @@
           <wp:inline>
             <wp:extent cx="5334000" cy="3333750"/>
             <wp:effectExtent b="0" l="0" r="0" t="0"/>
-            <wp:docPr descr="Architecture Diagram" title="" id="23" name="Picture"/>
+            <wp:docPr descr="Architecture Diagram" title="" id="19" name="Picture"/>
             <a:graphic>
               <a:graphicData uri="http://schemas.openxmlformats.org/drawingml/2006/picture">
                 <pic:pic>
                   <pic:nvPicPr>
-                    <pic:cNvPr descr="frontend/public/assets/dashboard.png" id="24" name="Picture"/>
+                    <pic:cNvPr descr="frontend/public/assets/dashboard.png" id="20" name="Picture"/>
                     <pic:cNvPicPr>
                       <a:picLocks noChangeArrowheads="1" noChangeAspect="1"/>
                     </pic:cNvPicPr>
                   </pic:nvPicPr>
                   <pic:blipFill>
-                    <a:blip r:embed="rId22"/>
+                    <a:blip r:embed="rId18"/>
                     <a:stretch>
                       <a:fillRect/>
                     </a:stretch>
@@ -759,8 +612,8 @@
         <w:t xml:space="preserve">In a production deployment, the Next.js container should be the only service exposed to the public internet (via an Ingress controller or Load Balancer). FastAPI, Celery, PostgreSQL, and Redis must remain strictly isolated within a private Virtual Private Cloud (VPC) subnet to prevent unauthorized external access.</w:t>
       </w:r>
     </w:p>
-    <w:bookmarkEnd w:id="25"/>
-    <w:bookmarkStart w:id="29" w:name="comprehensive-system-topology"/>
+    <w:bookmarkEnd w:id="21"/>
+    <w:bookmarkStart w:id="25" w:name="comprehensive-system-topology"/>
     <w:p>
       <w:pPr>
         <w:pStyle w:val="Heading2"/>
@@ -778,18 +631,18 @@
           <wp:inline>
             <wp:extent cx="5334000" cy="6000750"/>
             <wp:effectExtent b="0" l="0" r="0" t="0"/>
-            <wp:docPr descr="Architecture Diagram" title="" id="27" name="Picture"/>
+            <wp:docPr descr="Architecture Diagram" title="" id="23" name="Picture"/>
             <a:graphic>
               <a:graphicData uri="http://schemas.openxmlformats.org/drawingml/2006/picture">
                 <pic:pic>
                   <pic:nvPicPr>
-                    <pic:cNvPr descr="diagram_1.png" id="28" name="Picture"/>
+                    <pic:cNvPr descr="diagram_1.png" id="24" name="Picture"/>
                     <pic:cNvPicPr>
                       <a:picLocks noChangeArrowheads="1" noChangeAspect="1"/>
                     </pic:cNvPicPr>
                   </pic:nvPicPr>
                   <pic:blipFill>
-                    <a:blip r:embed="rId26"/>
+                    <a:blip r:embed="rId22"/>
                     <a:stretch>
                       <a:fillRect/>
                     </a:stretch>
@@ -826,9 +679,9 @@
         <w:t xml:space="preserve">Figure: System Visualization 1</w:t>
       </w:r>
     </w:p>
-    <w:bookmarkEnd w:id="29"/>
-    <w:bookmarkEnd w:id="30"/>
-    <w:bookmarkStart w:id="36" w:name="chapter-3-application-startup"/>
+    <w:bookmarkEnd w:id="25"/>
+    <w:bookmarkEnd w:id="26"/>
+    <w:bookmarkStart w:id="32" w:name="chapter-3-application-startup"/>
     <w:p>
       <w:pPr>
         <w:pStyle w:val="Heading1"/>
@@ -837,7 +690,7 @@
         <w:t xml:space="preserve">Chapter 3: Application Startup</w:t>
       </w:r>
     </w:p>
-    <w:bookmarkStart w:id="34" w:name="the-boot-sequence"/>
+    <w:bookmarkStart w:id="30" w:name="the-boot-sequence"/>
     <w:p>
       <w:pPr>
         <w:pStyle w:val="Heading2"/>
@@ -970,18 +823,18 @@
           <wp:inline>
             <wp:extent cx="5334000" cy="6784117"/>
             <wp:effectExtent b="0" l="0" r="0" t="0"/>
-            <wp:docPr descr="Architecture Diagram" title="" id="32" name="Picture"/>
+            <wp:docPr descr="Architecture Diagram" title="" id="28" name="Picture"/>
             <a:graphic>
               <a:graphicData uri="http://schemas.openxmlformats.org/drawingml/2006/picture">
                 <pic:pic>
                   <pic:nvPicPr>
-                    <pic:cNvPr descr="diagram_2.png" id="33" name="Picture"/>
+                    <pic:cNvPr descr="diagram_2.png" id="29" name="Picture"/>
                     <pic:cNvPicPr>
                       <a:picLocks noChangeArrowheads="1" noChangeAspect="1"/>
                     </pic:cNvPicPr>
                   </pic:nvPicPr>
                   <pic:blipFill>
-                    <a:blip r:embed="rId31"/>
+                    <a:blip r:embed="rId27"/>
                     <a:stretch>
                       <a:fillRect/>
                     </a:stretch>
@@ -1051,8 +904,8 @@
         <w:t xml:space="preserve">directives (e.g., trying to boot FastAPI before PostgreSQL) will instantly crash the backend. FastAPI requires a valid database connection string during the instantiation of the SQLAlchemy session factory.</w:t>
       </w:r>
     </w:p>
-    <w:bookmarkEnd w:id="34"/>
-    <w:bookmarkStart w:id="35" w:name="X5257d8e9c124ddf1573974cfd4df025fc5b0bea"/>
+    <w:bookmarkEnd w:id="30"/>
+    <w:bookmarkStart w:id="31" w:name="X5257d8e9c124ddf1573974cfd4df025fc5b0bea"/>
     <w:p>
       <w:pPr>
         <w:pStyle w:val="Heading2"/>
@@ -1168,9 +1021,9 @@
         </w:pict>
       </w:r>
     </w:p>
-    <w:bookmarkEnd w:id="35"/>
-    <w:bookmarkEnd w:id="36"/>
-    <w:bookmarkStart w:id="43" w:name="chapter-4-frontend-initialization"/>
+    <w:bookmarkEnd w:id="31"/>
+    <w:bookmarkEnd w:id="32"/>
+    <w:bookmarkStart w:id="39" w:name="chapter-4-frontend-initialization"/>
     <w:p>
       <w:pPr>
         <w:pStyle w:val="Heading1"/>
@@ -1179,7 +1032,7 @@
         <w:t xml:space="preserve">Chapter 4: Frontend Initialization</w:t>
       </w:r>
     </w:p>
-    <w:bookmarkStart w:id="41" w:name="the-next.js-paradigm"/>
+    <w:bookmarkStart w:id="37" w:name="the-next.js-paradigm"/>
     <w:p>
       <w:pPr>
         <w:pStyle w:val="Heading2"/>
@@ -1239,7 +1092,7 @@
         <w:t xml:space="preserve">architecture.</w:t>
       </w:r>
     </w:p>
-    <w:bookmarkStart w:id="40" w:name="Xe266f8bbceec67121d2b3ee863cb070db150985"/>
+    <w:bookmarkStart w:id="36" w:name="Xe266f8bbceec67121d2b3ee863cb070db150985"/>
     <w:p>
       <w:pPr>
         <w:pStyle w:val="Heading3"/>
@@ -1338,18 +1191,18 @@
           <wp:inline>
             <wp:extent cx="5334000" cy="3626826"/>
             <wp:effectExtent b="0" l="0" r="0" t="0"/>
-            <wp:docPr descr="Architecture Diagram" title="" id="38" name="Picture"/>
+            <wp:docPr descr="Architecture Diagram" title="" id="34" name="Picture"/>
             <a:graphic>
               <a:graphicData uri="http://schemas.openxmlformats.org/drawingml/2006/picture">
                 <pic:pic>
                   <pic:nvPicPr>
-                    <pic:cNvPr descr="diagram_3.png" id="39" name="Picture"/>
+                    <pic:cNvPr descr="diagram_3.png" id="35" name="Picture"/>
                     <pic:cNvPicPr>
                       <a:picLocks noChangeArrowheads="1" noChangeAspect="1"/>
                     </pic:cNvPicPr>
                   </pic:nvPicPr>
                   <pic:blipFill>
-                    <a:blip r:embed="rId37"/>
+                    <a:blip r:embed="rId33"/>
                     <a:stretch>
                       <a:fillRect/>
                     </a:stretch>
@@ -1386,185 +1239,185 @@
         <w:t xml:space="preserve">Figure: System Visualization 3</w:t>
       </w:r>
     </w:p>
+    <w:bookmarkEnd w:id="36"/>
+    <w:bookmarkEnd w:id="37"/>
+    <w:bookmarkStart w:id="38" w:name="handling-global-state"/>
+    <w:p>
+      <w:pPr>
+        <w:pStyle w:val="Heading2"/>
+      </w:pPr>
+      <w:r>
+        <w:t xml:space="preserve">4.2 Handling Global State</w:t>
+      </w:r>
+    </w:p>
+    <w:p>
+      <w:pPr>
+        <w:pStyle w:val="FirstParagraph"/>
+      </w:pPr>
+      <w:r>
+        <w:t xml:space="preserve">In a traditional React application, a global state management library like Redux might be used. However, Athenis avoids this complexity by relying on lightweight React Hooks (like</w:t>
+      </w:r>
+      <w:r>
+        <w:t xml:space="preserve"> </w:t>
+      </w:r>
+      <w:r>
+        <w:rPr>
+          <w:rStyle w:val="VerbatimChar"/>
+        </w:rPr>
+        <w:t xml:space="preserve">useState</w:t>
+      </w:r>
+      <w:r>
+        <w:t xml:space="preserve"> </w:t>
+      </w:r>
+      <w:r>
+        <w:t xml:space="preserve">and</w:t>
+      </w:r>
+      <w:r>
+        <w:t xml:space="preserve"> </w:t>
+      </w:r>
+      <w:r>
+        <w:rPr>
+          <w:rStyle w:val="VerbatimChar"/>
+        </w:rPr>
+        <w:t xml:space="preserve">useEffect</w:t>
+      </w:r>
+      <w:r>
+        <w:t xml:space="preserve">) combined with secure token storage.</w:t>
+      </w:r>
+    </w:p>
+    <w:p>
+      <w:pPr>
+        <w:pStyle w:val="BodyText"/>
+      </w:pPr>
+      <w:r>
+        <w:t xml:space="preserve">When the frontend initializes, a</w:t>
+      </w:r>
+      <w:r>
+        <w:t xml:space="preserve"> </w:t>
+      </w:r>
+      <w:r>
+        <w:rPr>
+          <w:rStyle w:val="VerbatimChar"/>
+        </w:rPr>
+        <w:t xml:space="preserve">useEffect</w:t>
+      </w:r>
+      <w:r>
+        <w:t xml:space="preserve"> </w:t>
+      </w:r>
+      <w:r>
+        <w:t xml:space="preserve">hook immediately checks the browser’s</w:t>
+      </w:r>
+      <w:r>
+        <w:t xml:space="preserve"> </w:t>
+      </w:r>
+      <w:r>
+        <w:rPr>
+          <w:rStyle w:val="VerbatimChar"/>
+        </w:rPr>
+        <w:t xml:space="preserve">localStorage</w:t>
+      </w:r>
+      <w:r>
+        <w:t xml:space="preserve"> </w:t>
+      </w:r>
+      <w:r>
+        <w:t xml:space="preserve">for a valid JWT. If no token is found, the user is forcefully redirected to the unified login portal, completely locking down the application.</w:t>
+      </w:r>
+    </w:p>
+    <w:p>
+      <w:pPr>
+        <w:pStyle w:val="BlockText"/>
+      </w:pPr>
+      <w:r>
+        <w:rPr>
+          <w:b/>
+          <w:bCs/>
+        </w:rPr>
+        <w:t xml:space="preserve">Security Note</w:t>
+      </w:r>
+      <w:r>
+        <w:t xml:space="preserve"> </w:t>
+      </w:r>
+      <w:r>
+        <w:rPr>
+          <w:rStyle w:val="VerbatimChar"/>
+        </w:rPr>
+        <w:t xml:space="preserve">localStorage</w:t>
+      </w:r>
+      <w:r>
+        <w:t xml:space="preserve"> </w:t>
+      </w:r>
+      <w:r>
+        <w:t xml:space="preserve">is vulnerable to Cross-Site Scripting (XSS) attacks. If an attacker manages to execute malicious JavaScript on the Athenis domain, they could scrape the JWT. In enterprise deployments requiring maximum security, this architecture can be hardened by refactoring the JWT delivery mechanism to use</w:t>
+      </w:r>
+      <w:r>
+        <w:t xml:space="preserve"> </w:t>
+      </w:r>
+      <w:r>
+        <w:rPr>
+          <w:rStyle w:val="VerbatimChar"/>
+        </w:rPr>
+        <w:t xml:space="preserve">httpOnly</w:t>
+      </w:r>
+      <w:r>
+        <w:t xml:space="preserve"> </w:t>
+      </w:r>
+      <w:r>
+        <w:t xml:space="preserve">secure cookies.</w:t>
+      </w:r>
+    </w:p>
+    <w:bookmarkEnd w:id="38"/>
+    <w:bookmarkEnd w:id="39"/>
+    <w:bookmarkStart w:id="42" w:name="Xb81d7b5a627a4550ffa82d8f451d7ffd4e27b27"/>
+    <w:p>
+      <w:pPr>
+        <w:pStyle w:val="Heading1"/>
+      </w:pPr>
+      <w:r>
+        <w:t xml:space="preserve">Chapter 5: Backend Initialization &amp; Configuration</w:t>
+      </w:r>
+    </w:p>
+    <w:bookmarkStart w:id="40" w:name="the-fastapi-core"/>
+    <w:p>
+      <w:pPr>
+        <w:pStyle w:val="Heading2"/>
+      </w:pPr>
+      <w:r>
+        <w:t xml:space="preserve">5.1 The FastAPI Core</w:t>
+      </w:r>
+    </w:p>
+    <w:p>
+      <w:pPr>
+        <w:pStyle w:val="FirstParagraph"/>
+      </w:pPr>
+      <w:r>
+        <w:t xml:space="preserve">Athenis utilizes FastAPI as its primary HTTP gateway. The choice of FastAPI over older synchronous frameworks is not merely a preference; it is a strict architectural requirement for high-throughput AI applications.</w:t>
+      </w:r>
+    </w:p>
+    <w:p>
+      <w:pPr>
+        <w:pStyle w:val="BodyText"/>
+      </w:pPr>
+      <w:r>
+        <w:t xml:space="preserve">When a large language model generates a response, it streams that response over the network. If the backend gateway was synchronous, the thread handling that request would block completely until the AI finished responding. By utilizing Python’s</w:t>
+      </w:r>
+      <w:r>
+        <w:t xml:space="preserve"> </w:t>
+      </w:r>
+      <w:r>
+        <w:rPr>
+          <w:rStyle w:val="VerbatimChar"/>
+        </w:rPr>
+        <w:t xml:space="preserve">async/await</w:t>
+      </w:r>
+      <w:r>
+        <w:t xml:space="preserve"> </w:t>
+      </w:r>
+      <w:r>
+        <w:t xml:space="preserve">syntax, FastAPI can suspend the execution of the thread while waiting for network I/O, allowing a single process to handle hundreds of concurrent LLM streams.</w:t>
+      </w:r>
+    </w:p>
     <w:bookmarkEnd w:id="40"/>
-    <w:bookmarkEnd w:id="41"/>
-    <w:bookmarkStart w:id="42" w:name="handling-global-state"/>
-    <w:p>
-      <w:pPr>
-        <w:pStyle w:val="Heading2"/>
-      </w:pPr>
-      <w:r>
-        <w:t xml:space="preserve">4.2 Handling Global State</w:t>
-      </w:r>
-    </w:p>
-    <w:p>
-      <w:pPr>
-        <w:pStyle w:val="FirstParagraph"/>
-      </w:pPr>
-      <w:r>
-        <w:t xml:space="preserve">In a traditional React application, a global state management library like Redux might be used. However, Athenis avoids this complexity by relying on lightweight React Hooks (like</w:t>
-      </w:r>
-      <w:r>
-        <w:t xml:space="preserve"> </w:t>
-      </w:r>
-      <w:r>
-        <w:rPr>
-          <w:rStyle w:val="VerbatimChar"/>
-        </w:rPr>
-        <w:t xml:space="preserve">useState</w:t>
-      </w:r>
-      <w:r>
-        <w:t xml:space="preserve"> </w:t>
-      </w:r>
-      <w:r>
-        <w:t xml:space="preserve">and</w:t>
-      </w:r>
-      <w:r>
-        <w:t xml:space="preserve"> </w:t>
-      </w:r>
-      <w:r>
-        <w:rPr>
-          <w:rStyle w:val="VerbatimChar"/>
-        </w:rPr>
-        <w:t xml:space="preserve">useEffect</w:t>
-      </w:r>
-      <w:r>
-        <w:t xml:space="preserve">) combined with secure token storage.</w:t>
-      </w:r>
-    </w:p>
-    <w:p>
-      <w:pPr>
-        <w:pStyle w:val="BodyText"/>
-      </w:pPr>
-      <w:r>
-        <w:t xml:space="preserve">When the frontend initializes, a</w:t>
-      </w:r>
-      <w:r>
-        <w:t xml:space="preserve"> </w:t>
-      </w:r>
-      <w:r>
-        <w:rPr>
-          <w:rStyle w:val="VerbatimChar"/>
-        </w:rPr>
-        <w:t xml:space="preserve">useEffect</w:t>
-      </w:r>
-      <w:r>
-        <w:t xml:space="preserve"> </w:t>
-      </w:r>
-      <w:r>
-        <w:t xml:space="preserve">hook immediately checks the browser’s</w:t>
-      </w:r>
-      <w:r>
-        <w:t xml:space="preserve"> </w:t>
-      </w:r>
-      <w:r>
-        <w:rPr>
-          <w:rStyle w:val="VerbatimChar"/>
-        </w:rPr>
-        <w:t xml:space="preserve">localStorage</w:t>
-      </w:r>
-      <w:r>
-        <w:t xml:space="preserve"> </w:t>
-      </w:r>
-      <w:r>
-        <w:t xml:space="preserve">for a valid JWT. If no token is found, the user is forcefully redirected to the unified login portal, completely locking down the application.</w:t>
-      </w:r>
-    </w:p>
-    <w:p>
-      <w:pPr>
-        <w:pStyle w:val="BlockText"/>
-      </w:pPr>
-      <w:r>
-        <w:rPr>
-          <w:b/>
-          <w:bCs/>
-        </w:rPr>
-        <w:t xml:space="preserve">Security Note</w:t>
-      </w:r>
-      <w:r>
-        <w:t xml:space="preserve"> </w:t>
-      </w:r>
-      <w:r>
-        <w:rPr>
-          <w:rStyle w:val="VerbatimChar"/>
-        </w:rPr>
-        <w:t xml:space="preserve">localStorage</w:t>
-      </w:r>
-      <w:r>
-        <w:t xml:space="preserve"> </w:t>
-      </w:r>
-      <w:r>
-        <w:t xml:space="preserve">is vulnerable to Cross-Site Scripting (XSS) attacks. If an attacker manages to execute malicious JavaScript on the Athenis domain, they could scrape the JWT. In enterprise deployments requiring maximum security, this architecture can be hardened by refactoring the JWT delivery mechanism to use</w:t>
-      </w:r>
-      <w:r>
-        <w:t xml:space="preserve"> </w:t>
-      </w:r>
-      <w:r>
-        <w:rPr>
-          <w:rStyle w:val="VerbatimChar"/>
-        </w:rPr>
-        <w:t xml:space="preserve">httpOnly</w:t>
-      </w:r>
-      <w:r>
-        <w:t xml:space="preserve"> </w:t>
-      </w:r>
-      <w:r>
-        <w:t xml:space="preserve">secure cookies.</w:t>
-      </w:r>
-    </w:p>
-    <w:bookmarkEnd w:id="42"/>
-    <w:bookmarkEnd w:id="43"/>
-    <w:bookmarkStart w:id="46" w:name="Xb81d7b5a627a4550ffa82d8f451d7ffd4e27b27"/>
-    <w:p>
-      <w:pPr>
-        <w:pStyle w:val="Heading1"/>
-      </w:pPr>
-      <w:r>
-        <w:t xml:space="preserve">Chapter 5: Backend Initialization &amp; Configuration</w:t>
-      </w:r>
-    </w:p>
-    <w:bookmarkStart w:id="44" w:name="the-fastapi-core"/>
-    <w:p>
-      <w:pPr>
-        <w:pStyle w:val="Heading2"/>
-      </w:pPr>
-      <w:r>
-        <w:t xml:space="preserve">5.1 The FastAPI Core</w:t>
-      </w:r>
-    </w:p>
-    <w:p>
-      <w:pPr>
-        <w:pStyle w:val="FirstParagraph"/>
-      </w:pPr>
-      <w:r>
-        <w:t xml:space="preserve">Athenis utilizes FastAPI as its primary HTTP gateway. The choice of FastAPI over older synchronous frameworks is not merely a preference; it is a strict architectural requirement for high-throughput AI applications.</w:t>
-      </w:r>
-    </w:p>
-    <w:p>
-      <w:pPr>
-        <w:pStyle w:val="BodyText"/>
-      </w:pPr>
-      <w:r>
-        <w:t xml:space="preserve">When a large language model generates a response, it streams that response over the network. If the backend gateway was synchronous, the thread handling that request would block completely until the AI finished responding. By utilizing Python’s</w:t>
-      </w:r>
-      <w:r>
-        <w:t xml:space="preserve"> </w:t>
-      </w:r>
-      <w:r>
-        <w:rPr>
-          <w:rStyle w:val="VerbatimChar"/>
-        </w:rPr>
-        <w:t xml:space="preserve">async/await</w:t>
-      </w:r>
-      <w:r>
-        <w:t xml:space="preserve"> </w:t>
-      </w:r>
-      <w:r>
-        <w:t xml:space="preserve">syntax, FastAPI can suspend the execution of the thread while waiting for network I/O, allowing a single process to handle hundreds of concurrent LLM streams.</w:t>
-      </w:r>
-    </w:p>
-    <w:bookmarkEnd w:id="44"/>
-    <w:bookmarkStart w:id="45" w:name="environmental-configuration"/>
+    <w:bookmarkStart w:id="41" w:name="environmental-configuration"/>
     <w:p>
       <w:pPr>
         <w:pStyle w:val="Heading2"/>
@@ -1728,9 +1581,9 @@
         </w:pict>
       </w:r>
     </w:p>
-    <w:bookmarkEnd w:id="45"/>
-    <w:bookmarkEnd w:id="46"/>
-    <w:bookmarkStart w:id="54" w:name="X1dd2c071f81b348087abd35f35bfcf59c462db2"/>
+    <w:bookmarkEnd w:id="41"/>
+    <w:bookmarkEnd w:id="42"/>
+    <w:bookmarkStart w:id="50" w:name="X1dd2c071f81b348087abd35f35bfcf59c462db2"/>
     <w:p>
       <w:pPr>
         <w:pStyle w:val="Heading1"/>
@@ -1739,7 +1592,7 @@
         <w:t xml:space="preserve">Chapter 6: Authentication &amp; Authorization Internals</w:t>
       </w:r>
     </w:p>
-    <w:bookmarkStart w:id="48" w:name="the-jwt-lifecycle"/>
+    <w:bookmarkStart w:id="44" w:name="the-jwt-lifecycle"/>
     <w:p>
       <w:pPr>
         <w:pStyle w:val="Heading2"/>
@@ -1756,7 +1609,7 @@
         <w:t xml:space="preserve">Authentication within Athenis is entirely stateless. The system relies on JSON Web Tokens (JWT) signed using the HMAC SHA-256 algorithm.</w:t>
       </w:r>
     </w:p>
-    <w:bookmarkStart w:id="47" w:name="token-generation"/>
+    <w:bookmarkStart w:id="43" w:name="token-generation"/>
     <w:p>
       <w:pPr>
         <w:pStyle w:val="Heading3"/>
@@ -1871,9 +1724,9 @@
         <w:t xml:space="preserve">. Because the signature is cryptographically secure, the backend does not need to store the token in the database to verify its authenticity later.</w:t>
       </w:r>
     </w:p>
-    <w:bookmarkEnd w:id="47"/>
-    <w:bookmarkEnd w:id="48"/>
-    <w:bookmarkStart w:id="53" w:name="role-based-access-control-rbac"/>
+    <w:bookmarkEnd w:id="43"/>
+    <w:bookmarkEnd w:id="44"/>
+    <w:bookmarkStart w:id="49" w:name="role-based-access-control-rbac"/>
     <w:p>
       <w:pPr>
         <w:pStyle w:val="Heading2"/>
@@ -1926,7 +1779,7 @@
         <w:t xml:space="preserve">).</w:t>
       </w:r>
     </w:p>
-    <w:bookmarkStart w:id="52" w:name="the-execution-flow-of-a-secured-request"/>
+    <w:bookmarkStart w:id="48" w:name="the-execution-flow-of-a-secured-request"/>
     <w:p>
       <w:pPr>
         <w:pStyle w:val="Heading3"/>
@@ -2070,18 +1923,18 @@
           <wp:inline>
             <wp:extent cx="5334000" cy="4503964"/>
             <wp:effectExtent b="0" l="0" r="0" t="0"/>
-            <wp:docPr descr="Architecture Diagram" title="" id="50" name="Picture"/>
+            <wp:docPr descr="Architecture Diagram" title="" id="46" name="Picture"/>
             <a:graphic>
               <a:graphicData uri="http://schemas.openxmlformats.org/drawingml/2006/picture">
                 <pic:pic>
                   <pic:nvPicPr>
-                    <pic:cNvPr descr="diagram_4.png" id="51" name="Picture"/>
+                    <pic:cNvPr descr="diagram_4.png" id="47" name="Picture"/>
                     <pic:cNvPicPr>
                       <a:picLocks noChangeArrowheads="1" noChangeAspect="1"/>
                     </pic:cNvPicPr>
                   </pic:nvPicPr>
                   <pic:blipFill>
-                    <a:blip r:embed="rId49"/>
+                    <a:blip r:embed="rId45"/>
                     <a:stretch>
                       <a:fillRect/>
                     </a:stretch>
@@ -2148,112 +2001,112 @@
         <w:t xml:space="preserve">stored in Redis, allowing administrators to manually revoke specific tokens.</w:t>
       </w:r>
     </w:p>
+    <w:bookmarkEnd w:id="48"/>
+    <w:bookmarkEnd w:id="49"/>
+    <w:bookmarkEnd w:id="50"/>
+    <w:bookmarkStart w:id="54" w:name="chapter-7-the-document-upload-lifecycle"/>
+    <w:p>
+      <w:pPr>
+        <w:pStyle w:val="Heading1"/>
+      </w:pPr>
+      <w:r>
+        <w:t xml:space="preserve">Chapter 7: The Document Upload Lifecycle</w:t>
+      </w:r>
+    </w:p>
+    <w:bookmarkStart w:id="51" w:name="introduction-1"/>
+    <w:p>
+      <w:pPr>
+        <w:pStyle w:val="Heading2"/>
+      </w:pPr>
+      <w:r>
+        <w:t xml:space="preserve">7.1 Introduction</w:t>
+      </w:r>
+    </w:p>
+    <w:p>
+      <w:pPr>
+        <w:pStyle w:val="FirstParagraph"/>
+      </w:pPr>
+      <w:r>
+        <w:t xml:space="preserve">The core value proposition of Athenis is its ability to ingest proprietary enterprise documents and make them searchable via AI. This process begins when an Administrator navigates to the Document Management dashboard.</w:t>
+      </w:r>
+    </w:p>
+    <w:bookmarkEnd w:id="51"/>
+    <w:bookmarkStart w:id="52" w:name="handling-large-payloads"/>
+    <w:p>
+      <w:pPr>
+        <w:pStyle w:val="Heading2"/>
+      </w:pPr>
+      <w:r>
+        <w:t xml:space="preserve">7.2 Handling Large Payloads</w:t>
+      </w:r>
+    </w:p>
+    <w:p>
+      <w:pPr>
+        <w:pStyle w:val="FirstParagraph"/>
+      </w:pPr>
+      <w:r>
+        <w:t xml:space="preserve">When an admin uploads a 50MB PDF document, the backend must handle this payload delicately. Loading a 50MB file directly into RAM via the FastAPI endpoint is highly inefficient, especially under heavy load (e.g., 20 admins uploading files simultaneously).</w:t>
+      </w:r>
+    </w:p>
+    <w:p>
+      <w:pPr>
+        <w:pStyle w:val="BodyText"/>
+      </w:pPr>
+      <w:r>
+        <w:t xml:space="preserve">Instead, FastAPI utilizes</w:t>
+      </w:r>
+      <w:r>
+        <w:t xml:space="preserve"> </w:t>
+      </w:r>
+      <w:r>
+        <w:rPr>
+          <w:b/>
+          <w:bCs/>
+        </w:rPr>
+        <w:t xml:space="preserve">Multipart form streaming</w:t>
+      </w:r>
+      <w:r>
+        <w:t xml:space="preserve">. The file is intercepted and streamed directly to a persistent local volume (</w:t>
+      </w:r>
+      <w:r>
+        <w:rPr>
+          <w:rStyle w:val="VerbatimChar"/>
+        </w:rPr>
+        <w:t xml:space="preserve">data/uploads</w:t>
+      </w:r>
+      <w:r>
+        <w:t xml:space="preserve">) in chunks. Once the file is safely written to disk, FastAPI records its location in the PostgreSQL</w:t>
+      </w:r>
+      <w:r>
+        <w:t xml:space="preserve"> </w:t>
+      </w:r>
+      <w:r>
+        <w:rPr>
+          <w:rStyle w:val="VerbatimChar"/>
+        </w:rPr>
+        <w:t xml:space="preserve">documents</w:t>
+      </w:r>
+      <w:r>
+        <w:t xml:space="preserve"> </w:t>
+      </w:r>
+      <w:r>
+        <w:t xml:space="preserve">table, marking its status as</w:t>
+      </w:r>
+      <w:r>
+        <w:t xml:space="preserve"> </w:t>
+      </w:r>
+      <w:r>
+        <w:rPr>
+          <w:rStyle w:val="VerbatimChar"/>
+        </w:rPr>
+        <w:t xml:space="preserve">PROCESSING</w:t>
+      </w:r>
+      <w:r>
+        <w:t xml:space="preserve">.</w:t>
+      </w:r>
+    </w:p>
     <w:bookmarkEnd w:id="52"/>
-    <w:bookmarkEnd w:id="53"/>
-    <w:bookmarkEnd w:id="54"/>
-    <w:bookmarkStart w:id="58" w:name="chapter-7-the-document-upload-lifecycle"/>
-    <w:p>
-      <w:pPr>
-        <w:pStyle w:val="Heading1"/>
-      </w:pPr>
-      <w:r>
-        <w:t xml:space="preserve">Chapter 7: The Document Upload Lifecycle</w:t>
-      </w:r>
-    </w:p>
-    <w:bookmarkStart w:id="55" w:name="introduction-1"/>
-    <w:p>
-      <w:pPr>
-        <w:pStyle w:val="Heading2"/>
-      </w:pPr>
-      <w:r>
-        <w:t xml:space="preserve">7.1 Introduction</w:t>
-      </w:r>
-    </w:p>
-    <w:p>
-      <w:pPr>
-        <w:pStyle w:val="FirstParagraph"/>
-      </w:pPr>
-      <w:r>
-        <w:t xml:space="preserve">The core value proposition of Athenis is its ability to ingest proprietary enterprise documents and make them searchable via AI. This process begins when an Administrator navigates to the Document Management dashboard.</w:t>
-      </w:r>
-    </w:p>
-    <w:bookmarkEnd w:id="55"/>
-    <w:bookmarkStart w:id="56" w:name="handling-large-payloads"/>
-    <w:p>
-      <w:pPr>
-        <w:pStyle w:val="Heading2"/>
-      </w:pPr>
-      <w:r>
-        <w:t xml:space="preserve">7.2 Handling Large Payloads</w:t>
-      </w:r>
-    </w:p>
-    <w:p>
-      <w:pPr>
-        <w:pStyle w:val="FirstParagraph"/>
-      </w:pPr>
-      <w:r>
-        <w:t xml:space="preserve">When an admin uploads a 50MB PDF document, the backend must handle this payload delicately. Loading a 50MB file directly into RAM via the FastAPI endpoint is highly inefficient, especially under heavy load (e.g., 20 admins uploading files simultaneously).</w:t>
-      </w:r>
-    </w:p>
-    <w:p>
-      <w:pPr>
-        <w:pStyle w:val="BodyText"/>
-      </w:pPr>
-      <w:r>
-        <w:t xml:space="preserve">Instead, FastAPI utilizes</w:t>
-      </w:r>
-      <w:r>
-        <w:t xml:space="preserve"> </w:t>
-      </w:r>
-      <w:r>
-        <w:rPr>
-          <w:b/>
-          <w:bCs/>
-        </w:rPr>
-        <w:t xml:space="preserve">Multipart form streaming</w:t>
-      </w:r>
-      <w:r>
-        <w:t xml:space="preserve">. The file is intercepted and streamed directly to a persistent local volume (</w:t>
-      </w:r>
-      <w:r>
-        <w:rPr>
-          <w:rStyle w:val="VerbatimChar"/>
-        </w:rPr>
-        <w:t xml:space="preserve">data/uploads</w:t>
-      </w:r>
-      <w:r>
-        <w:t xml:space="preserve">) in chunks. Once the file is safely written to disk, FastAPI records its location in the PostgreSQL</w:t>
-      </w:r>
-      <w:r>
-        <w:t xml:space="preserve"> </w:t>
-      </w:r>
-      <w:r>
-        <w:rPr>
-          <w:rStyle w:val="VerbatimChar"/>
-        </w:rPr>
-        <w:t xml:space="preserve">documents</w:t>
-      </w:r>
-      <w:r>
-        <w:t xml:space="preserve"> </w:t>
-      </w:r>
-      <w:r>
-        <w:t xml:space="preserve">table, marking its status as</w:t>
-      </w:r>
-      <w:r>
-        <w:t xml:space="preserve"> </w:t>
-      </w:r>
-      <w:r>
-        <w:rPr>
-          <w:rStyle w:val="VerbatimChar"/>
-        </w:rPr>
-        <w:t xml:space="preserve">PROCESSING</w:t>
-      </w:r>
-      <w:r>
-        <w:t xml:space="preserve">.</w:t>
-      </w:r>
-    </w:p>
-    <w:bookmarkEnd w:id="56"/>
-    <w:bookmarkStart w:id="57" w:name="disconnecting-the-event-loop"/>
+    <w:bookmarkStart w:id="53" w:name="disconnecting-the-event-loop"/>
     <w:p>
       <w:pPr>
         <w:pStyle w:val="Heading2"/>
@@ -2303,9 +2156,9 @@
         </w:pict>
       </w:r>
     </w:p>
-    <w:bookmarkEnd w:id="57"/>
-    <w:bookmarkEnd w:id="58"/>
-    <w:bookmarkStart w:id="66" w:name="Xe4ae909f5d90c947c072078669feeaa9da29e67"/>
+    <w:bookmarkEnd w:id="53"/>
+    <w:bookmarkEnd w:id="54"/>
+    <w:bookmarkStart w:id="62" w:name="Xe4ae909f5d90c947c072078669feeaa9da29e67"/>
     <w:p>
       <w:pPr>
         <w:pStyle w:val="Heading1"/>
@@ -2314,7 +2167,7 @@
         <w:t xml:space="preserve">Chapter 8: Background Processing &amp; Embedding Generation</w:t>
       </w:r>
     </w:p>
-    <w:bookmarkStart w:id="65" w:name="the-celery-worker-lifecycle"/>
+    <w:bookmarkStart w:id="61" w:name="the-celery-worker-lifecycle"/>
     <w:p>
       <w:pPr>
         <w:pStyle w:val="Heading2"/>
@@ -2367,7 +2220,7 @@
         <w:t xml:space="preserve">appears in the queue, a worker claims it.</w:t>
       </w:r>
     </w:p>
-    <w:bookmarkStart w:id="59" w:name="stage-1-text-extraction-chunking"/>
+    <w:bookmarkStart w:id="55" w:name="stage-1-text-extraction-chunking"/>
     <w:p>
       <w:pPr>
         <w:pStyle w:val="Heading3"/>
@@ -2442,8 +2295,8 @@
         <w:t xml:space="preserve">The overlap ensures that if a crucial sentence spans across a chunk boundary, the context is not lost or broken in half.</w:t>
       </w:r>
     </w:p>
-    <w:bookmarkEnd w:id="59"/>
-    <w:bookmarkStart w:id="60" w:name="stage-2-vector-embeddings"/>
+    <w:bookmarkEnd w:id="55"/>
+    <w:bookmarkStart w:id="56" w:name="stage-2-vector-embeddings"/>
     <w:p>
       <w:pPr>
         <w:pStyle w:val="Heading3"/>
@@ -2484,8 +2337,8 @@
         <w:t xml:space="preserve">of the text, allowing the system to perform complex similarity searches later.</w:t>
       </w:r>
     </w:p>
-    <w:bookmarkEnd w:id="60"/>
-    <w:bookmarkStart w:id="64" w:name="stage-3-database-insertion"/>
+    <w:bookmarkEnd w:id="56"/>
+    <w:bookmarkStart w:id="60" w:name="stage-3-database-insertion"/>
     <w:p>
       <w:pPr>
         <w:pStyle w:val="Heading3"/>
@@ -2585,18 +2438,18 @@
           <wp:inline>
             <wp:extent cx="5334000" cy="3252107"/>
             <wp:effectExtent b="0" l="0" r="0" t="0"/>
-            <wp:docPr descr="Architecture Diagram" title="" id="62" name="Picture"/>
+            <wp:docPr descr="Architecture Diagram" title="" id="58" name="Picture"/>
             <a:graphic>
               <a:graphicData uri="http://schemas.openxmlformats.org/drawingml/2006/picture">
                 <pic:pic>
                   <pic:nvPicPr>
-                    <pic:cNvPr descr="diagram_5.png" id="63" name="Picture"/>
+                    <pic:cNvPr descr="diagram_5.png" id="59" name="Picture"/>
                     <pic:cNvPicPr>
                       <a:picLocks noChangeArrowheads="1" noChangeAspect="1"/>
                     </pic:cNvPicPr>
                   </pic:nvPicPr>
                   <pic:blipFill>
-                    <a:blip r:embed="rId61"/>
+                    <a:blip r:embed="rId57"/>
                     <a:stretch>
                       <a:fillRect/>
                     </a:stretch>
@@ -2651,25 +2504,98 @@
         <w:t xml:space="preserve">Embedding generation is extremely network-intensive. If your Celery worker is processing a large document, it may hit the rate limits of your LLM provider. Athenis implements automatic exponential backoff to handle HTTP 429 Too Many Requests errors gracefully.</w:t>
       </w:r>
     </w:p>
+    <w:bookmarkEnd w:id="60"/>
+    <w:bookmarkEnd w:id="61"/>
+    <w:bookmarkEnd w:id="62"/>
+    <w:bookmarkStart w:id="70" w:name="Xd42938827f19096719cb00ab9e34464f099e327"/>
+    <w:p>
+      <w:pPr>
+        <w:pStyle w:val="Heading1"/>
+      </w:pPr>
+      <w:r>
+        <w:t xml:space="preserve">Chapter 9: Storage &amp; The Hybrid Cognitive Engine</w:t>
+      </w:r>
+    </w:p>
+    <w:bookmarkStart w:id="64" w:name="introduction-to-the-storage-layer"/>
+    <w:p>
+      <w:pPr>
+        <w:pStyle w:val="Heading2"/>
+      </w:pPr>
+      <w:r>
+        <w:t xml:space="preserve">9.1 Introduction to the Storage Layer</w:t>
+      </w:r>
+    </w:p>
+    <w:p>
+      <w:pPr>
+        <w:pStyle w:val="FirstParagraph"/>
+      </w:pPr>
+      <w:r>
+        <w:t xml:space="preserve">Athenis relies entirely on PostgreSQL for its primary persistence. While many RAG applications split their infrastructure between a relational database (like MySQL for users) and a vector database (like Pinecone for embeddings), Athenis consolidates this using the</w:t>
+      </w:r>
+      <w:r>
+        <w:t xml:space="preserve"> </w:t>
+      </w:r>
+      <w:r>
+        <w:rPr>
+          <w:rStyle w:val="VerbatimChar"/>
+          <w:b/>
+          <w:bCs/>
+        </w:rPr>
+        <w:t xml:space="preserve">pgvector</w:t>
+      </w:r>
+      <w:r>
+        <w:t xml:space="preserve"> </w:t>
+      </w:r>
+      <w:r>
+        <w:t xml:space="preserve">extension.</w:t>
+      </w:r>
+    </w:p>
+    <w:bookmarkStart w:id="63" w:name="why-pgvector"/>
+    <w:p>
+      <w:pPr>
+        <w:pStyle w:val="Heading3"/>
+      </w:pPr>
+      <w:r>
+        <w:t xml:space="preserve">9.1.1 Why pgvector?</w:t>
+      </w:r>
+    </w:p>
+    <w:p>
+      <w:pPr>
+        <w:pStyle w:val="FirstParagraph"/>
+      </w:pPr>
+      <w:r>
+        <w:t xml:space="preserve">Running a dedicated vector database introduces extreme operational complexity. If a user deletes a document in MySQL, the system must perform an API call to Pinecone to delete the corresponding vectors. If that network call fails, the databases fall out of sync, and the AI will hallucinate answers from deleted data (a severe security violation).</w:t>
+      </w:r>
+    </w:p>
+    <w:p>
+      <w:pPr>
+        <w:pStyle w:val="BodyText"/>
+      </w:pPr>
+      <w:r>
+        <w:t xml:space="preserve">By using</w:t>
+      </w:r>
+      <w:r>
+        <w:t xml:space="preserve"> </w:t>
+      </w:r>
+      <w:r>
+        <w:rPr>
+          <w:rStyle w:val="VerbatimChar"/>
+        </w:rPr>
+        <w:t xml:space="preserve">pgvector</w:t>
+      </w:r>
+      <w:r>
+        <w:t xml:space="preserve">, Athenis relies on standard PostgreSQL Foreign Key cascading. If an administrator deletes a document, PostgreSQL instantly and atomically deletes all associated vector chunks. Synchronization issues are mathematically impossible.</w:t>
+      </w:r>
+    </w:p>
+    <w:bookmarkEnd w:id="63"/>
     <w:bookmarkEnd w:id="64"/>
-    <w:bookmarkEnd w:id="65"/>
-    <w:bookmarkEnd w:id="66"/>
-    <w:bookmarkStart w:id="74" w:name="Xd42938827f19096719cb00ab9e34464f099e327"/>
-    <w:p>
-      <w:pPr>
-        <w:pStyle w:val="Heading1"/>
-      </w:pPr>
-      <w:r>
-        <w:t xml:space="preserve">Chapter 9: Storage &amp; The Hybrid Cognitive Engine</w:t>
-      </w:r>
-    </w:p>
-    <w:bookmarkStart w:id="68" w:name="introduction-to-the-storage-layer"/>
+    <w:bookmarkStart w:id="69" w:name="X6f9033adfbdc4ebb564d744908d9230088e6eb6"/>
     <w:p>
       <w:pPr>
         <w:pStyle w:val="Heading2"/>
       </w:pPr>
       <w:r>
-        <w:t xml:space="preserve">9.1 Introduction to the Storage Layer</w:t>
+        <w:t xml:space="preserve">9.2 The Retrieval Architecture (Reciprocal Rank Fusion)</w:t>
       </w:r>
     </w:p>
     <w:p>
@@ -2677,41 +2603,16 @@
         <w:pStyle w:val="FirstParagraph"/>
       </w:pPr>
       <w:r>
-        <w:t xml:space="preserve">Athenis relies entirely on PostgreSQL for its primary persistence. While many RAG applications split their infrastructure between a relational database (like MySQL for users) and a vector database (like Pinecone for embeddings), Athenis consolidates this using the</w:t>
-      </w:r>
-      <w:r>
-        <w:t xml:space="preserve"> </w:t>
-      </w:r>
-      <w:r>
-        <w:rPr>
-          <w:rStyle w:val="VerbatimChar"/>
-          <w:b/>
-          <w:bCs/>
-        </w:rPr>
-        <w:t xml:space="preserve">pgvector</w:t>
-      </w:r>
-      <w:r>
-        <w:t xml:space="preserve"> </w:t>
-      </w:r>
-      <w:r>
-        <w:t xml:space="preserve">extension.</w:t>
-      </w:r>
-    </w:p>
-    <w:bookmarkStart w:id="67" w:name="why-pgvector"/>
-    <w:p>
-      <w:pPr>
-        <w:pStyle w:val="Heading3"/>
-      </w:pPr>
-      <w:r>
-        <w:t xml:space="preserve">9.1.1 Why pgvector?</w:t>
-      </w:r>
-    </w:p>
-    <w:p>
-      <w:pPr>
-        <w:pStyle w:val="FirstParagraph"/>
-      </w:pPr>
-      <w:r>
-        <w:t xml:space="preserve">Running a dedicated vector database introduces extreme operational complexity. If a user deletes a document in MySQL, the system must perform an API call to Pinecone to delete the corresponding vectors. If that network call fails, the databases fall out of sync, and the AI will hallucinate answers from deleted data (a severe security violation).</w:t>
+        <w:t xml:space="preserve">When a user asks a question (e.g.,</w:t>
+      </w:r>
+      <w:r>
+        <w:t xml:space="preserve"> </w:t>
+      </w:r>
+      <w:r>
+        <w:t xml:space="preserve">“What is the Q3 revenue for project Alpha?”</w:t>
+      </w:r>
+      <w:r>
+        <w:t xml:space="preserve">), Athenis must search the database for relevant context before asking the LLM to generate an answer.</w:t>
       </w:r>
     </w:p>
     <w:p>
@@ -2719,54 +2620,6 @@
         <w:pStyle w:val="BodyText"/>
       </w:pPr>
       <w:r>
-        <w:t xml:space="preserve">By using</w:t>
-      </w:r>
-      <w:r>
-        <w:t xml:space="preserve"> </w:t>
-      </w:r>
-      <w:r>
-        <w:rPr>
-          <w:rStyle w:val="VerbatimChar"/>
-        </w:rPr>
-        <w:t xml:space="preserve">pgvector</w:t>
-      </w:r>
-      <w:r>
-        <w:t xml:space="preserve">, Athenis relies on standard PostgreSQL Foreign Key cascading. If an administrator deletes a document, PostgreSQL instantly and atomically deletes all associated vector chunks. Synchronization issues are mathematically impossible.</w:t>
-      </w:r>
-    </w:p>
-    <w:bookmarkEnd w:id="67"/>
-    <w:bookmarkEnd w:id="68"/>
-    <w:bookmarkStart w:id="73" w:name="X6f9033adfbdc4ebb564d744908d9230088e6eb6"/>
-    <w:p>
-      <w:pPr>
-        <w:pStyle w:val="Heading2"/>
-      </w:pPr>
-      <w:r>
-        <w:t xml:space="preserve">9.2 The Retrieval Architecture (Reciprocal Rank Fusion)</w:t>
-      </w:r>
-    </w:p>
-    <w:p>
-      <w:pPr>
-        <w:pStyle w:val="FirstParagraph"/>
-      </w:pPr>
-      <w:r>
-        <w:t xml:space="preserve">When a user asks a question (e.g.,</w:t>
-      </w:r>
-      <w:r>
-        <w:t xml:space="preserve"> </w:t>
-      </w:r>
-      <w:r>
-        <w:t xml:space="preserve">“What is the Q3 revenue for project Alpha?”</w:t>
-      </w:r>
-      <w:r>
-        <w:t xml:space="preserve">), Athenis must search the database for relevant context before asking the LLM to generate an answer.</w:t>
-      </w:r>
-    </w:p>
-    <w:p>
-      <w:pPr>
-        <w:pStyle w:val="BodyText"/>
-      </w:pPr>
-      <w:r>
         <w:t xml:space="preserve">Athenis executes two entirely separate searches simultaneously:</w:t>
       </w:r>
       <w:r>
@@ -2850,7 +2703,7 @@
         <w:t xml:space="preserve">column for exact word matches.</w:t>
       </w:r>
     </w:p>
-    <w:bookmarkStart w:id="72" w:name="merging-the-results"/>
+    <w:bookmarkStart w:id="68" w:name="merging-the-results"/>
     <w:p>
       <w:pPr>
         <w:pStyle w:val="Heading3"/>
@@ -2933,18 +2786,18 @@
           <wp:inline>
             <wp:extent cx="5334000" cy="3211285"/>
             <wp:effectExtent b="0" l="0" r="0" t="0"/>
-            <wp:docPr descr="Architecture Diagram" title="" id="70" name="Picture"/>
+            <wp:docPr descr="Architecture Diagram" title="" id="66" name="Picture"/>
             <a:graphic>
               <a:graphicData uri="http://schemas.openxmlformats.org/drawingml/2006/picture">
                 <pic:pic>
                   <pic:nvPicPr>
-                    <pic:cNvPr descr="diagram_6.png" id="71" name="Picture"/>
+                    <pic:cNvPr descr="diagram_6.png" id="67" name="Picture"/>
                     <pic:cNvPicPr>
                       <a:picLocks noChangeArrowheads="1" noChangeAspect="1"/>
                     </pic:cNvPicPr>
                   </pic:nvPicPr>
                   <pic:blipFill>
-                    <a:blip r:embed="rId69"/>
+                    <a:blip r:embed="rId65"/>
                     <a:stretch>
                       <a:fillRect/>
                     </a:stretch>
@@ -2988,25 +2841,260 @@
         </w:pict>
       </w:r>
     </w:p>
+    <w:bookmarkEnd w:id="68"/>
+    <w:bookmarkEnd w:id="69"/>
+    <w:bookmarkEnd w:id="70"/>
+    <w:bookmarkStart w:id="73" w:name="Xf136b05d4c821232b319002678d3c3f95697fd4"/>
+    <w:p>
+      <w:pPr>
+        <w:pStyle w:val="Heading1"/>
+      </w:pPr>
+      <w:r>
+        <w:t xml:space="preserve">Chapter 10: LLM Interaction &amp; Streaming Responses</w:t>
+      </w:r>
+    </w:p>
+    <w:bookmarkStart w:id="71" w:name="the-litellm-router"/>
+    <w:p>
+      <w:pPr>
+        <w:pStyle w:val="Heading2"/>
+      </w:pPr>
+      <w:r>
+        <w:t xml:space="preserve">10.1 The LiteLLM Router</w:t>
+      </w:r>
+    </w:p>
+    <w:p>
+      <w:pPr>
+        <w:pStyle w:val="FirstParagraph"/>
+      </w:pPr>
+      <w:r>
+        <w:t xml:space="preserve">Once the top 5 most relevant chunks are retrieved via RRF, they are bundled together with the user’s original question into a massive text block known as the</w:t>
+      </w:r>
+      <w:r>
+        <w:t xml:space="preserve"> </w:t>
+      </w:r>
+      <w:r>
+        <w:t xml:space="preserve">“Prompt Template”</w:t>
+      </w:r>
+      <w:r>
+        <w:t xml:space="preserve">.</w:t>
+      </w:r>
+    </w:p>
+    <w:p>
+      <w:pPr>
+        <w:pStyle w:val="BodyText"/>
+      </w:pPr>
+      <w:r>
+        <w:t xml:space="preserve">This prompt is forwarded to the LLM. However, Athenis does not use the OpenAI or Gemini SDK directly. It utilizes</w:t>
+      </w:r>
+      <w:r>
+        <w:t xml:space="preserve"> </w:t>
+      </w:r>
+      <w:r>
+        <w:rPr>
+          <w:b/>
+          <w:bCs/>
+        </w:rPr>
+        <w:t xml:space="preserve">LiteLLM</w:t>
+      </w:r>
+      <w:r>
+        <w:t xml:space="preserve">. This abstraction layer standardizes the API format. By simply changing the</w:t>
+      </w:r>
+      <w:r>
+        <w:t xml:space="preserve"> </w:t>
+      </w:r>
+      <w:r>
+        <w:rPr>
+          <w:rStyle w:val="VerbatimChar"/>
+        </w:rPr>
+        <w:t xml:space="preserve">GEMINI_API_KEY</w:t>
+      </w:r>
+      <w:r>
+        <w:t xml:space="preserve"> </w:t>
+      </w:r>
+      <w:r>
+        <w:t xml:space="preserve">to</w:t>
+      </w:r>
+      <w:r>
+        <w:t xml:space="preserve"> </w:t>
+      </w:r>
+      <w:r>
+        <w:rPr>
+          <w:rStyle w:val="VerbatimChar"/>
+        </w:rPr>
+        <w:t xml:space="preserve">OPENAI_API_KEY</w:t>
+      </w:r>
+      <w:r>
+        <w:t xml:space="preserve">, Athenis can instantly route all enterprise traffic to a different AI provider without rewriting a single line of core logic.</w:t>
+      </w:r>
+    </w:p>
+    <w:bookmarkEnd w:id="71"/>
+    <w:bookmarkStart w:id="72" w:name="server-sent-events-sse-streaming"/>
+    <w:p>
+      <w:pPr>
+        <w:pStyle w:val="Heading2"/>
+      </w:pPr>
+      <w:r>
+        <w:t xml:space="preserve">10.2 Server-Sent Events (SSE) Streaming</w:t>
+      </w:r>
+    </w:p>
+    <w:p>
+      <w:pPr>
+        <w:pStyle w:val="FirstParagraph"/>
+      </w:pPr>
+      <w:r>
+        <w:t xml:space="preserve">Generative AI models are slow. Generating a 500-word essay might take an LLM 10 seconds. If Athenis waited for the entire response to finish before sending it to the user, the UI would freeze, providing a terrible user experience.</w:t>
+      </w:r>
+    </w:p>
+    <w:p>
+      <w:pPr>
+        <w:pStyle w:val="BodyText"/>
+      </w:pPr>
+      <w:r>
+        <w:t xml:space="preserve">Instead, Athenis implements</w:t>
+      </w:r>
+      <w:r>
+        <w:t xml:space="preserve"> </w:t>
+      </w:r>
+      <w:r>
+        <w:rPr>
+          <w:b/>
+          <w:bCs/>
+        </w:rPr>
+        <w:t xml:space="preserve">Streaming Responses</w:t>
+      </w:r>
+      <w:r>
+        <w:t xml:space="preserve"> </w:t>
+      </w:r>
+      <w:r>
+        <w:t xml:space="preserve">using Server-Sent Events (SSE).</w:t>
+      </w:r>
+      <w:r>
+        <w:t xml:space="preserve"> </w:t>
+      </w:r>
+      <w:r>
+        <w:t xml:space="preserve">As the LLM generates individual tokens (words), LiteLLM streams them to FastAPI. FastAPI instantly yields these tokens across the open HTTP socket to Next.js. Next.js appends the tokens to the DOM in real-time. This creates the</w:t>
+      </w:r>
+      <w:r>
+        <w:t xml:space="preserve"> </w:t>
+      </w:r>
+      <w:r>
+        <w:t xml:space="preserve">“typing”</w:t>
+      </w:r>
+      <w:r>
+        <w:t xml:space="preserve"> </w:t>
+      </w:r>
+      <w:r>
+        <w:t xml:space="preserve">effect standard in modern AI interfaces and provides sub-second initial response latency.</w:t>
+      </w:r>
+    </w:p>
+    <w:p>
+      <w:pPr>
+        <w:pStyle w:val="BlockText"/>
+      </w:pPr>
+      <w:r>
+        <w:rPr>
+          <w:b/>
+          <w:bCs/>
+        </w:rPr>
+        <w:t xml:space="preserve">Debugging Tip</w:t>
+      </w:r>
+      <w:r>
+        <w:t xml:space="preserve"> </w:t>
+      </w:r>
+      <w:r>
+        <w:t xml:space="preserve">If the chat interface appears to freeze and then suddenly dumps the entire paragraph of text all at once, check your Reverse Proxy (e.g., Nginx) configuration. Nginx often buffers HTTP responses by default. You must explicitly disable</w:t>
+      </w:r>
+      <w:r>
+        <w:t xml:space="preserve"> </w:t>
+      </w:r>
+      <w:r>
+        <w:rPr>
+          <w:rStyle w:val="VerbatimChar"/>
+        </w:rPr>
+        <w:t xml:space="preserve">proxy_buffering</w:t>
+      </w:r>
+      <w:r>
+        <w:t xml:space="preserve"> </w:t>
+      </w:r>
+      <w:r>
+        <w:t xml:space="preserve">for the</w:t>
+      </w:r>
+      <w:r>
+        <w:t xml:space="preserve"> </w:t>
+      </w:r>
+      <w:r>
+        <w:rPr>
+          <w:rStyle w:val="VerbatimChar"/>
+        </w:rPr>
+        <w:t xml:space="preserve">/api/v1/chat/completions</w:t>
+      </w:r>
+      <w:r>
+        <w:t xml:space="preserve"> </w:t>
+      </w:r>
+      <w:r>
+        <w:t xml:space="preserve">endpoint to allow the SSE stream to pass through unhindered.</w:t>
+      </w:r>
+    </w:p>
     <w:bookmarkEnd w:id="72"/>
     <w:bookmarkEnd w:id="73"/>
+    <w:bookmarkStart w:id="80" w:name="Xcef500cd95330b25db86aaba1e13b06f0fab0a1"/>
+    <w:p>
+      <w:pPr>
+        <w:pStyle w:val="Heading1"/>
+      </w:pPr>
+      <w:r>
+        <w:t xml:space="preserve">Chapter 11: Monitoring &amp; Observability Telemetry</w:t>
+      </w:r>
+    </w:p>
+    <w:bookmarkStart w:id="74" w:name="the-observability-stack"/>
+    <w:p>
+      <w:pPr>
+        <w:pStyle w:val="Heading2"/>
+      </w:pPr>
+      <w:r>
+        <w:t xml:space="preserve">11.1 The Observability Stack</w:t>
+      </w:r>
+    </w:p>
+    <w:p>
+      <w:pPr>
+        <w:pStyle w:val="FirstParagraph"/>
+      </w:pPr>
+      <w:r>
+        <w:t xml:space="preserve">In a decoupled, microservices architecture, a single user action (like asking a chat question) traverses the Next.js frontend, the FastAPI gateway, the PostgreSQL database, and the LiteLLM network boundary. If the request takes 5 seconds, how does a DevOps engineer know which component was slow?</w:t>
+      </w:r>
+    </w:p>
+    <w:p>
+      <w:pPr>
+        <w:pStyle w:val="BodyText"/>
+      </w:pPr>
+      <w:r>
+        <w:t xml:space="preserve">Athenis implements</w:t>
+      </w:r>
+      <w:r>
+        <w:t xml:space="preserve"> </w:t>
+      </w:r>
+      <w:r>
+        <w:rPr>
+          <w:b/>
+          <w:bCs/>
+        </w:rPr>
+        <w:t xml:space="preserve">OpenTelemetry (OTel)</w:t>
+      </w:r>
+      <w:r>
+        <w:t xml:space="preserve"> </w:t>
+      </w:r>
+      <w:r>
+        <w:t xml:space="preserve">to solve this.</w:t>
+      </w:r>
+    </w:p>
     <w:bookmarkEnd w:id="74"/>
-    <w:bookmarkStart w:id="77" w:name="Xf136b05d4c821232b319002678d3c3f95697fd4"/>
-    <w:p>
-      <w:pPr>
-        <w:pStyle w:val="Heading1"/>
-      </w:pPr>
-      <w:r>
-        <w:t xml:space="preserve">Chapter 10: LLM Interaction &amp; Streaming Responses</w:t>
-      </w:r>
-    </w:p>
-    <w:bookmarkStart w:id="75" w:name="the-litellm-router"/>
+    <w:bookmarkStart w:id="75" w:name="trace-propagation"/>
     <w:p>
       <w:pPr>
         <w:pStyle w:val="Heading2"/>
       </w:pPr>
       <w:r>
-        <w:t xml:space="preserve">10.1 The LiteLLM Router</w:t>
+        <w:t xml:space="preserve">11.2 Trace Propagation</w:t>
       </w:r>
     </w:p>
     <w:p>
@@ -3014,16 +3102,22 @@
         <w:pStyle w:val="FirstParagraph"/>
       </w:pPr>
       <w:r>
-        <w:t xml:space="preserve">Once the top 5 most relevant chunks are retrieved via RRF, they are bundled together with the user’s original question into a massive text block known as the</w:t>
-      </w:r>
-      <w:r>
-        <w:t xml:space="preserve"> </w:t>
-      </w:r>
-      <w:r>
-        <w:t xml:space="preserve">“Prompt Template”</w:t>
-      </w:r>
-      <w:r>
-        <w:t xml:space="preserve">.</w:t>
+        <w:t xml:space="preserve">When a request enters FastAPI, the</w:t>
+      </w:r>
+      <w:r>
+        <w:t xml:space="preserve"> </w:t>
+      </w:r>
+      <w:r>
+        <w:rPr>
+          <w:rStyle w:val="VerbatimChar"/>
+        </w:rPr>
+        <w:t xml:space="preserve">CorrelationIdMiddleware</w:t>
+      </w:r>
+      <w:r>
+        <w:t xml:space="preserve"> </w:t>
+      </w:r>
+      <w:r>
+        <w:t xml:space="preserve">assigns it a unique UUID. This UUID is attached to every internal function call and database query.</w:t>
       </w:r>
     </w:p>
     <w:p>
@@ -3031,311 +3125,70 @@
         <w:pStyle w:val="BodyText"/>
       </w:pPr>
       <w:r>
-        <w:t xml:space="preserve">This prompt is forwarded to the LLM. However, Athenis does not use the OpenAI or Gemini SDK directly. It utilizes</w:t>
-      </w:r>
-      <w:r>
-        <w:t xml:space="preserve"> </w:t>
-      </w:r>
-      <w:r>
-        <w:rPr>
-          <w:b/>
-          <w:bCs/>
-        </w:rPr>
-        <w:t xml:space="preserve">LiteLLM</w:t>
-      </w:r>
-      <w:r>
-        <w:t xml:space="preserve">. This abstraction layer standardizes the API format. By simply changing the</w:t>
-      </w:r>
-      <w:r>
-        <w:t xml:space="preserve"> </w:t>
-      </w:r>
-      <w:r>
-        <w:rPr>
-          <w:rStyle w:val="VerbatimChar"/>
-        </w:rPr>
-        <w:t xml:space="preserve">GEMINI_API_KEY</w:t>
-      </w:r>
-      <w:r>
-        <w:t xml:space="preserve"> </w:t>
-      </w:r>
-      <w:r>
-        <w:t xml:space="preserve">to</w:t>
-      </w:r>
-      <w:r>
-        <w:t xml:space="preserve"> </w:t>
-      </w:r>
-      <w:r>
-        <w:rPr>
-          <w:rStyle w:val="VerbatimChar"/>
-        </w:rPr>
-        <w:t xml:space="preserve">OPENAI_API_KEY</w:t>
-      </w:r>
-      <w:r>
-        <w:t xml:space="preserve">, Athenis can instantly route all enterprise traffic to a different AI provider without rewriting a single line of core logic.</w:t>
+        <w:t xml:space="preserve">These traces are exported to a central telemetry collector (like Prometheus or Jaeger).</w:t>
+      </w:r>
+      <w:r>
+        <w:t xml:space="preserve"> </w:t>
+      </w:r>
+      <w:r>
+        <w:t xml:space="preserve">Additionally, Athenis tracks raw numerical metrics:</w:t>
+      </w:r>
+      <w:r>
+        <w:t xml:space="preserve"> </w:t>
+      </w:r>
+      <w:r>
+        <w:t xml:space="preserve">-</w:t>
+      </w:r>
+      <w:r>
+        <w:t xml:space="preserve"> </w:t>
+      </w:r>
+      <w:r>
+        <w:rPr>
+          <w:b/>
+          <w:bCs/>
+        </w:rPr>
+        <w:t xml:space="preserve">API Request Latency</w:t>
+      </w:r>
+      <w:r>
+        <w:t xml:space="preserve">: Histogram of response times.</w:t>
+      </w:r>
+      <w:r>
+        <w:t xml:space="preserve"> </w:t>
+      </w:r>
+      <w:r>
+        <w:t xml:space="preserve">-</w:t>
+      </w:r>
+      <w:r>
+        <w:t xml:space="preserve"> </w:t>
+      </w:r>
+      <w:r>
+        <w:rPr>
+          <w:b/>
+          <w:bCs/>
+        </w:rPr>
+        <w:t xml:space="preserve">LLM Token Usage</w:t>
+      </w:r>
+      <w:r>
+        <w:t xml:space="preserve">: Essential for billing. Every time a user chats, the token counts (prompt tokens + completion tokens) are calculated by</w:t>
+      </w:r>
+      <w:r>
+        <w:t xml:space="preserve"> </w:t>
+      </w:r>
+      <w:r>
+        <w:rPr>
+          <w:rStyle w:val="VerbatimChar"/>
+        </w:rPr>
+        <w:t xml:space="preserve">litellm</w:t>
+      </w:r>
+      <w:r>
+        <w:t xml:space="preserve"> </w:t>
+      </w:r>
+      <w:r>
+        <w:t xml:space="preserve">and exported.</w:t>
       </w:r>
     </w:p>
     <w:bookmarkEnd w:id="75"/>
-    <w:bookmarkStart w:id="76" w:name="server-sent-events-sse-streaming"/>
-    <w:p>
-      <w:pPr>
-        <w:pStyle w:val="Heading2"/>
-      </w:pPr>
-      <w:r>
-        <w:t xml:space="preserve">10.2 Server-Sent Events (SSE) Streaming</w:t>
-      </w:r>
-    </w:p>
-    <w:p>
-      <w:pPr>
-        <w:pStyle w:val="FirstParagraph"/>
-      </w:pPr>
-      <w:r>
-        <w:t xml:space="preserve">Generative AI models are slow. Generating a 500-word essay might take an LLM 10 seconds. If Athenis waited for the entire response to finish before sending it to the user, the UI would freeze, providing a terrible user experience.</w:t>
-      </w:r>
-    </w:p>
-    <w:p>
-      <w:pPr>
-        <w:pStyle w:val="BodyText"/>
-      </w:pPr>
-      <w:r>
-        <w:t xml:space="preserve">Instead, Athenis implements</w:t>
-      </w:r>
-      <w:r>
-        <w:t xml:space="preserve"> </w:t>
-      </w:r>
-      <w:r>
-        <w:rPr>
-          <w:b/>
-          <w:bCs/>
-        </w:rPr>
-        <w:t xml:space="preserve">Streaming Responses</w:t>
-      </w:r>
-      <w:r>
-        <w:t xml:space="preserve"> </w:t>
-      </w:r>
-      <w:r>
-        <w:t xml:space="preserve">using Server-Sent Events (SSE).</w:t>
-      </w:r>
-      <w:r>
-        <w:t xml:space="preserve"> </w:t>
-      </w:r>
-      <w:r>
-        <w:t xml:space="preserve">As the LLM generates individual tokens (words), LiteLLM streams them to FastAPI. FastAPI instantly yields these tokens across the open HTTP socket to Next.js. Next.js appends the tokens to the DOM in real-time. This creates the</w:t>
-      </w:r>
-      <w:r>
-        <w:t xml:space="preserve"> </w:t>
-      </w:r>
-      <w:r>
-        <w:t xml:space="preserve">“typing”</w:t>
-      </w:r>
-      <w:r>
-        <w:t xml:space="preserve"> </w:t>
-      </w:r>
-      <w:r>
-        <w:t xml:space="preserve">effect standard in modern AI interfaces and provides sub-second initial response latency.</w:t>
-      </w:r>
-    </w:p>
-    <w:p>
-      <w:pPr>
-        <w:pStyle w:val="BlockText"/>
-      </w:pPr>
-      <w:r>
-        <w:rPr>
-          <w:b/>
-          <w:bCs/>
-        </w:rPr>
-        <w:t xml:space="preserve">Debugging Tip</w:t>
-      </w:r>
-      <w:r>
-        <w:t xml:space="preserve"> </w:t>
-      </w:r>
-      <w:r>
-        <w:t xml:space="preserve">If the chat interface appears to freeze and then suddenly dumps the entire paragraph of text all at once, check your Reverse Proxy (e.g., Nginx) configuration. Nginx often buffers HTTP responses by default. You must explicitly disable</w:t>
-      </w:r>
-      <w:r>
-        <w:t xml:space="preserve"> </w:t>
-      </w:r>
-      <w:r>
-        <w:rPr>
-          <w:rStyle w:val="VerbatimChar"/>
-        </w:rPr>
-        <w:t xml:space="preserve">proxy_buffering</w:t>
-      </w:r>
-      <w:r>
-        <w:t xml:space="preserve"> </w:t>
-      </w:r>
-      <w:r>
-        <w:t xml:space="preserve">for the</w:t>
-      </w:r>
-      <w:r>
-        <w:t xml:space="preserve"> </w:t>
-      </w:r>
-      <w:r>
-        <w:rPr>
-          <w:rStyle w:val="VerbatimChar"/>
-        </w:rPr>
-        <w:t xml:space="preserve">/api/v1/chat/completions</w:t>
-      </w:r>
-      <w:r>
-        <w:t xml:space="preserve"> </w:t>
-      </w:r>
-      <w:r>
-        <w:t xml:space="preserve">endpoint to allow the SSE stream to pass through unhindered.</w:t>
-      </w:r>
-    </w:p>
-    <w:bookmarkEnd w:id="76"/>
-    <w:bookmarkEnd w:id="77"/>
-    <w:bookmarkStart w:id="84" w:name="Xcef500cd95330b25db86aaba1e13b06f0fab0a1"/>
-    <w:p>
-      <w:pPr>
-        <w:pStyle w:val="Heading1"/>
-      </w:pPr>
-      <w:r>
-        <w:t xml:space="preserve">Chapter 11: Monitoring &amp; Observability Telemetry</w:t>
-      </w:r>
-    </w:p>
-    <w:bookmarkStart w:id="78" w:name="the-observability-stack"/>
-    <w:p>
-      <w:pPr>
-        <w:pStyle w:val="Heading2"/>
-      </w:pPr>
-      <w:r>
-        <w:t xml:space="preserve">11.1 The Observability Stack</w:t>
-      </w:r>
-    </w:p>
-    <w:p>
-      <w:pPr>
-        <w:pStyle w:val="FirstParagraph"/>
-      </w:pPr>
-      <w:r>
-        <w:t xml:space="preserve">In a decoupled, microservices architecture, a single user action (like asking a chat question) traverses the Next.js frontend, the FastAPI gateway, the PostgreSQL database, and the LiteLLM network boundary. If the request takes 5 seconds, how does a DevOps engineer know which component was slow?</w:t>
-      </w:r>
-    </w:p>
-    <w:p>
-      <w:pPr>
-        <w:pStyle w:val="BodyText"/>
-      </w:pPr>
-      <w:r>
-        <w:t xml:space="preserve">Athenis implements</w:t>
-      </w:r>
-      <w:r>
-        <w:t xml:space="preserve"> </w:t>
-      </w:r>
-      <w:r>
-        <w:rPr>
-          <w:b/>
-          <w:bCs/>
-        </w:rPr>
-        <w:t xml:space="preserve">OpenTelemetry (OTel)</w:t>
-      </w:r>
-      <w:r>
-        <w:t xml:space="preserve"> </w:t>
-      </w:r>
-      <w:r>
-        <w:t xml:space="preserve">to solve this.</w:t>
-      </w:r>
-    </w:p>
-    <w:bookmarkEnd w:id="78"/>
-    <w:bookmarkStart w:id="79" w:name="trace-propagation"/>
-    <w:p>
-      <w:pPr>
-        <w:pStyle w:val="Heading2"/>
-      </w:pPr>
-      <w:r>
-        <w:t xml:space="preserve">11.2 Trace Propagation</w:t>
-      </w:r>
-    </w:p>
-    <w:p>
-      <w:pPr>
-        <w:pStyle w:val="FirstParagraph"/>
-      </w:pPr>
-      <w:r>
-        <w:t xml:space="preserve">When a request enters FastAPI, the</w:t>
-      </w:r>
-      <w:r>
-        <w:t xml:space="preserve"> </w:t>
-      </w:r>
-      <w:r>
-        <w:rPr>
-          <w:rStyle w:val="VerbatimChar"/>
-        </w:rPr>
-        <w:t xml:space="preserve">CorrelationIdMiddleware</w:t>
-      </w:r>
-      <w:r>
-        <w:t xml:space="preserve"> </w:t>
-      </w:r>
-      <w:r>
-        <w:t xml:space="preserve">assigns it a unique UUID. This UUID is attached to every internal function call and database query.</w:t>
-      </w:r>
-    </w:p>
-    <w:p>
-      <w:pPr>
-        <w:pStyle w:val="BodyText"/>
-      </w:pPr>
-      <w:r>
-        <w:t xml:space="preserve">These traces are exported to a central telemetry collector (like Prometheus or Jaeger).</w:t>
-      </w:r>
-      <w:r>
-        <w:t xml:space="preserve"> </w:t>
-      </w:r>
-      <w:r>
-        <w:t xml:space="preserve">Additionally, Athenis tracks raw numerical metrics:</w:t>
-      </w:r>
-      <w:r>
-        <w:t xml:space="preserve"> </w:t>
-      </w:r>
-      <w:r>
-        <w:t xml:space="preserve">-</w:t>
-      </w:r>
-      <w:r>
-        <w:t xml:space="preserve"> </w:t>
-      </w:r>
-      <w:r>
-        <w:rPr>
-          <w:b/>
-          <w:bCs/>
-        </w:rPr>
-        <w:t xml:space="preserve">API Request Latency</w:t>
-      </w:r>
-      <w:r>
-        <w:t xml:space="preserve">: Histogram of response times.</w:t>
-      </w:r>
-      <w:r>
-        <w:t xml:space="preserve"> </w:t>
-      </w:r>
-      <w:r>
-        <w:t xml:space="preserve">-</w:t>
-      </w:r>
-      <w:r>
-        <w:t xml:space="preserve"> </w:t>
-      </w:r>
-      <w:r>
-        <w:rPr>
-          <w:b/>
-          <w:bCs/>
-        </w:rPr>
-        <w:t xml:space="preserve">LLM Token Usage</w:t>
-      </w:r>
-      <w:r>
-        <w:t xml:space="preserve">: Essential for billing. Every time a user chats, the token counts (prompt tokens + completion tokens) are calculated by</w:t>
-      </w:r>
-      <w:r>
-        <w:t xml:space="preserve"> </w:t>
-      </w:r>
-      <w:r>
-        <w:rPr>
-          <w:rStyle w:val="VerbatimChar"/>
-        </w:rPr>
-        <w:t xml:space="preserve">litellm</w:t>
-      </w:r>
-      <w:r>
-        <w:t xml:space="preserve"> </w:t>
-      </w:r>
-      <w:r>
-        <w:t xml:space="preserve">and exported.</w:t>
-      </w:r>
-    </w:p>
-    <w:bookmarkEnd w:id="79"/>
-    <w:bookmarkStart w:id="83" w:name="grafana-dashboards"/>
+    <w:bookmarkStart w:id="79" w:name="grafana-dashboards"/>
     <w:p>
       <w:pPr>
         <w:pStyle w:val="Heading2"/>
@@ -3361,18 +3214,18 @@
           <wp:inline>
             <wp:extent cx="5334000" cy="1170214"/>
             <wp:effectExtent b="0" l="0" r="0" t="0"/>
-            <wp:docPr descr="Architecture Diagram" title="" id="81" name="Picture"/>
+            <wp:docPr descr="Architecture Diagram" title="" id="77" name="Picture"/>
             <a:graphic>
               <a:graphicData uri="http://schemas.openxmlformats.org/drawingml/2006/picture">
                 <pic:pic>
                   <pic:nvPicPr>
-                    <pic:cNvPr descr="diagram_7.png" id="82" name="Picture"/>
+                    <pic:cNvPr descr="diagram_7.png" id="78" name="Picture"/>
                     <pic:cNvPicPr>
                       <a:picLocks noChangeArrowheads="1" noChangeAspect="1"/>
                     </pic:cNvPicPr>
                   </pic:nvPicPr>
                   <pic:blipFill>
-                    <a:blip r:embed="rId80"/>
+                    <a:blip r:embed="rId76"/>
                     <a:stretch>
                       <a:fillRect/>
                     </a:stretch>
@@ -3416,9 +3269,9 @@
         </w:pict>
       </w:r>
     </w:p>
-    <w:bookmarkEnd w:id="83"/>
-    <w:bookmarkEnd w:id="84"/>
-    <w:bookmarkStart w:id="87" w:name="X2419d0a7b0e748616544cd4dd00f6817fd734db"/>
+    <w:bookmarkEnd w:id="79"/>
+    <w:bookmarkEnd w:id="80"/>
+    <w:bookmarkStart w:id="83" w:name="X2419d0a7b0e748616544cd4dd00f6817fd734db"/>
     <w:p>
       <w:pPr>
         <w:pStyle w:val="Heading1"/>
@@ -3427,7 +3280,7 @@
         <w:t xml:space="preserve">Chapter 12: Deployment &amp; Containerization Architecture</w:t>
       </w:r>
     </w:p>
-    <w:bookmarkStart w:id="85" w:name="docker-multi-stage-builds"/>
+    <w:bookmarkStart w:id="81" w:name="docker-multi-stage-builds"/>
     <w:p>
       <w:pPr>
         <w:pStyle w:val="Heading2"/>
@@ -3548,8 +3401,8 @@
         <w:t xml:space="preserve">By using multi-stage builds, the final Next.js production image size is reduced by over 80% (from ~1.5GB to ~150MB). This drastically speeds up Kubernetes pod initialization times during horizontal scaling events.</w:t>
       </w:r>
     </w:p>
-    <w:bookmarkEnd w:id="85"/>
-    <w:bookmarkStart w:id="86" w:name="kubernetes-deployment-strategy"/>
+    <w:bookmarkEnd w:id="81"/>
+    <w:bookmarkStart w:id="82" w:name="kubernetes-deployment-strategy"/>
     <w:p>
       <w:pPr>
         <w:pStyle w:val="Heading2"/>
@@ -3654,240 +3507,240 @@
         </w:pict>
       </w:r>
     </w:p>
+    <w:bookmarkEnd w:id="82"/>
+    <w:bookmarkEnd w:id="83"/>
+    <w:bookmarkStart w:id="86" w:name="Xbcf302662d9d8ad3f2e49b5d3423ae3ef784e91"/>
+    <w:p>
+      <w:pPr>
+        <w:pStyle w:val="Heading1"/>
+      </w:pPr>
+      <w:r>
+        <w:t xml:space="preserve">Chapter 13: Scaling Strategy &amp; Disaster Recovery</w:t>
+      </w:r>
+    </w:p>
+    <w:bookmarkStart w:id="84" w:name="horizontal-vs-vertical-scaling"/>
+    <w:p>
+      <w:pPr>
+        <w:pStyle w:val="Heading2"/>
+      </w:pPr>
+      <w:r>
+        <w:t xml:space="preserve">13.1 Horizontal vs Vertical Scaling</w:t>
+      </w:r>
+    </w:p>
+    <w:p>
+      <w:pPr>
+        <w:pStyle w:val="FirstParagraph"/>
+      </w:pPr>
+      <w:r>
+        <w:t xml:space="preserve">Athenis is designed for aggressive</w:t>
+      </w:r>
+      <w:r>
+        <w:t xml:space="preserve"> </w:t>
+      </w:r>
+      <w:r>
+        <w:rPr>
+          <w:b/>
+          <w:bCs/>
+        </w:rPr>
+        <w:t xml:space="preserve">Horizontal Scaling</w:t>
+      </w:r>
+      <w:r>
+        <w:t xml:space="preserve">. Because FastAPI and Next.js are completely stateless (storing all JWTs and context in the client or Redis), you can run 100 instances of the backend behind a load balancer.</w:t>
+      </w:r>
+    </w:p>
+    <w:p>
+      <w:pPr>
+        <w:pStyle w:val="BodyText"/>
+      </w:pPr>
+      <w:r>
+        <w:t xml:space="preserve">However, PostgreSQL must be scaled</w:t>
+      </w:r>
+      <w:r>
+        <w:t xml:space="preserve"> </w:t>
+      </w:r>
+      <w:r>
+        <w:rPr>
+          <w:b/>
+          <w:bCs/>
+        </w:rPr>
+        <w:t xml:space="preserve">Vertically</w:t>
+      </w:r>
+      <w:r>
+        <w:t xml:space="preserve"> </w:t>
+      </w:r>
+      <w:r>
+        <w:t xml:space="preserve">(adding more RAM and CPU to the single master node) or scaled via Read Replicas, because relational databases are inherently stateful.</w:t>
+      </w:r>
+    </w:p>
+    <w:bookmarkEnd w:id="84"/>
+    <w:bookmarkStart w:id="85" w:name="disaster-recovery-backups"/>
+    <w:p>
+      <w:pPr>
+        <w:pStyle w:val="Heading2"/>
+      </w:pPr>
+      <w:r>
+        <w:t xml:space="preserve">13.2 Disaster Recovery &amp; Backups</w:t>
+      </w:r>
+    </w:p>
+    <w:p>
+      <w:pPr>
+        <w:pStyle w:val="FirstParagraph"/>
+      </w:pPr>
+      <w:r>
+        <w:t xml:space="preserve">If the Kubernetes cluster suffers a catastrophic failure, the stateless compute pods (Next.js, FastAPI, Celery) can be spun up in a new cluster in seconds.</w:t>
+      </w:r>
+    </w:p>
+    <w:p>
+      <w:pPr>
+        <w:pStyle w:val="BodyText"/>
+      </w:pPr>
+      <w:r>
+        <w:t xml:space="preserve">The only critical assets are the persistent volumes:</w:t>
+      </w:r>
+      <w:r>
+        <w:t xml:space="preserve"> </w:t>
+      </w:r>
+      <w:r>
+        <w:t xml:space="preserve">1.</w:t>
+      </w:r>
+      <w:r>
+        <w:t xml:space="preserve"> </w:t>
+      </w:r>
+      <w:r>
+        <w:rPr>
+          <w:b/>
+          <w:bCs/>
+        </w:rPr>
+        <w:t xml:space="preserve">The PostgreSQL Database</w:t>
+      </w:r>
+      <w:r>
+        <w:t xml:space="preserve">: Contains user accounts and the mathematical vectors.</w:t>
+      </w:r>
+      <w:r>
+        <w:t xml:space="preserve"> </w:t>
+      </w:r>
+      <w:r>
+        <w:t xml:space="preserve">2.</w:t>
+      </w:r>
+      <w:r>
+        <w:t xml:space="preserve"> </w:t>
+      </w:r>
+      <w:r>
+        <w:rPr>
+          <w:b/>
+          <w:bCs/>
+        </w:rPr>
+        <w:t xml:space="preserve">The Uploads Volume</w:t>
+      </w:r>
+      <w:r>
+        <w:t xml:space="preserve">: Contains the raw PDF files.</w:t>
+      </w:r>
+    </w:p>
+    <w:p>
+      <w:pPr>
+        <w:pStyle w:val="BlockText"/>
+      </w:pPr>
+      <w:r>
+        <w:rPr>
+          <w:b/>
+          <w:bCs/>
+        </w:rPr>
+        <w:t xml:space="preserve">Production Recommendation</w:t>
+      </w:r>
+      <w:r>
+        <w:t xml:space="preserve"> </w:t>
+      </w:r>
+      <w:r>
+        <w:t xml:space="preserve">In production (e.g., AWS), never run PostgreSQL inside a Kubernetes pod. Use a managed service like AWS RDS for PostgreSQL with the</w:t>
+      </w:r>
+      <w:r>
+        <w:t xml:space="preserve"> </w:t>
+      </w:r>
+      <w:r>
+        <w:rPr>
+          <w:rStyle w:val="VerbatimChar"/>
+        </w:rPr>
+        <w:t xml:space="preserve">pgvector</w:t>
+      </w:r>
+      <w:r>
+        <w:t xml:space="preserve"> </w:t>
+      </w:r>
+      <w:r>
+        <w:t xml:space="preserve">extension enabled. RDS provides automated daily snapshots and Point-In-Time-Recovery (PITR), guaranteeing that even in a worst-case scenario, data loss is mitigated to the exact minute before the crash.</w:t>
+      </w:r>
+    </w:p>
+    <w:bookmarkEnd w:id="85"/>
     <w:bookmarkEnd w:id="86"/>
+    <w:bookmarkStart w:id="90" w:name="Xb1332ee2655e6c84aaeab99b52ecdcf99580db2"/>
+    <w:p>
+      <w:pPr>
+        <w:pStyle w:val="Heading1"/>
+      </w:pPr>
+      <w:r>
+        <w:t xml:space="preserve">Chapter 14: Security Audit &amp; Threat Modeling</w:t>
+      </w:r>
+    </w:p>
+    <w:bookmarkStart w:id="87" w:name="introduction-2"/>
+    <w:p>
+      <w:pPr>
+        <w:pStyle w:val="Heading2"/>
+      </w:pPr>
+      <w:r>
+        <w:t xml:space="preserve">14.1 Introduction</w:t>
+      </w:r>
+    </w:p>
+    <w:p>
+      <w:pPr>
+        <w:pStyle w:val="FirstParagraph"/>
+      </w:pPr>
+      <w:r>
+        <w:t xml:space="preserve">Enterprise AI applications introduce novel threat vectors that do not exist in traditional software. Beyond standard SQL injection or Cross-Site Scripting (XSS), Athenis must defend against</w:t>
+      </w:r>
+      <w:r>
+        <w:t xml:space="preserve"> </w:t>
+      </w:r>
+      <w:r>
+        <w:rPr>
+          <w:b/>
+          <w:bCs/>
+        </w:rPr>
+        <w:t xml:space="preserve">Prompt Injection</w:t>
+      </w:r>
+      <w:r>
+        <w:t xml:space="preserve">,</w:t>
+      </w:r>
+      <w:r>
+        <w:t xml:space="preserve"> </w:t>
+      </w:r>
+      <w:r>
+        <w:rPr>
+          <w:b/>
+          <w:bCs/>
+        </w:rPr>
+        <w:t xml:space="preserve">Data Exfiltration via RAG</w:t>
+      </w:r>
+      <w:r>
+        <w:t xml:space="preserve">, and</w:t>
+      </w:r>
+      <w:r>
+        <w:t xml:space="preserve"> </w:t>
+      </w:r>
+      <w:r>
+        <w:rPr>
+          <w:b/>
+          <w:bCs/>
+        </w:rPr>
+        <w:t xml:space="preserve">Cost Exhaustion</w:t>
+      </w:r>
+      <w:r>
+        <w:t xml:space="preserve"> </w:t>
+      </w:r>
+      <w:r>
+        <w:t xml:space="preserve">attacks.</w:t>
+      </w:r>
+    </w:p>
     <w:bookmarkEnd w:id="87"/>
-    <w:bookmarkStart w:id="90" w:name="Xbcf302662d9d8ad3f2e49b5d3423ae3ef784e91"/>
-    <w:p>
-      <w:pPr>
-        <w:pStyle w:val="Heading1"/>
-      </w:pPr>
-      <w:r>
-        <w:t xml:space="preserve">Chapter 13: Scaling Strategy &amp; Disaster Recovery</w:t>
-      </w:r>
-    </w:p>
-    <w:bookmarkStart w:id="88" w:name="horizontal-vs-vertical-scaling"/>
-    <w:p>
-      <w:pPr>
-        <w:pStyle w:val="Heading2"/>
-      </w:pPr>
-      <w:r>
-        <w:t xml:space="preserve">13.1 Horizontal vs Vertical Scaling</w:t>
-      </w:r>
-    </w:p>
-    <w:p>
-      <w:pPr>
-        <w:pStyle w:val="FirstParagraph"/>
-      </w:pPr>
-      <w:r>
-        <w:t xml:space="preserve">Athenis is designed for aggressive</w:t>
-      </w:r>
-      <w:r>
-        <w:t xml:space="preserve"> </w:t>
-      </w:r>
-      <w:r>
-        <w:rPr>
-          <w:b/>
-          <w:bCs/>
-        </w:rPr>
-        <w:t xml:space="preserve">Horizontal Scaling</w:t>
-      </w:r>
-      <w:r>
-        <w:t xml:space="preserve">. Because FastAPI and Next.js are completely stateless (storing all JWTs and context in the client or Redis), you can run 100 instances of the backend behind a load balancer.</w:t>
-      </w:r>
-    </w:p>
-    <w:p>
-      <w:pPr>
-        <w:pStyle w:val="BodyText"/>
-      </w:pPr>
-      <w:r>
-        <w:t xml:space="preserve">However, PostgreSQL must be scaled</w:t>
-      </w:r>
-      <w:r>
-        <w:t xml:space="preserve"> </w:t>
-      </w:r>
-      <w:r>
-        <w:rPr>
-          <w:b/>
-          <w:bCs/>
-        </w:rPr>
-        <w:t xml:space="preserve">Vertically</w:t>
-      </w:r>
-      <w:r>
-        <w:t xml:space="preserve"> </w:t>
-      </w:r>
-      <w:r>
-        <w:t xml:space="preserve">(adding more RAM and CPU to the single master node) or scaled via Read Replicas, because relational databases are inherently stateful.</w:t>
-      </w:r>
-    </w:p>
-    <w:bookmarkEnd w:id="88"/>
-    <w:bookmarkStart w:id="89" w:name="disaster-recovery-backups"/>
-    <w:p>
-      <w:pPr>
-        <w:pStyle w:val="Heading2"/>
-      </w:pPr>
-      <w:r>
-        <w:t xml:space="preserve">13.2 Disaster Recovery &amp; Backups</w:t>
-      </w:r>
-    </w:p>
-    <w:p>
-      <w:pPr>
-        <w:pStyle w:val="FirstParagraph"/>
-      </w:pPr>
-      <w:r>
-        <w:t xml:space="preserve">If the Kubernetes cluster suffers a catastrophic failure, the stateless compute pods (Next.js, FastAPI, Celery) can be spun up in a new cluster in seconds.</w:t>
-      </w:r>
-    </w:p>
-    <w:p>
-      <w:pPr>
-        <w:pStyle w:val="BodyText"/>
-      </w:pPr>
-      <w:r>
-        <w:t xml:space="preserve">The only critical assets are the persistent volumes:</w:t>
-      </w:r>
-      <w:r>
-        <w:t xml:space="preserve"> </w:t>
-      </w:r>
-      <w:r>
-        <w:t xml:space="preserve">1.</w:t>
-      </w:r>
-      <w:r>
-        <w:t xml:space="preserve"> </w:t>
-      </w:r>
-      <w:r>
-        <w:rPr>
-          <w:b/>
-          <w:bCs/>
-        </w:rPr>
-        <w:t xml:space="preserve">The PostgreSQL Database</w:t>
-      </w:r>
-      <w:r>
-        <w:t xml:space="preserve">: Contains user accounts and the mathematical vectors.</w:t>
-      </w:r>
-      <w:r>
-        <w:t xml:space="preserve"> </w:t>
-      </w:r>
-      <w:r>
-        <w:t xml:space="preserve">2.</w:t>
-      </w:r>
-      <w:r>
-        <w:t xml:space="preserve"> </w:t>
-      </w:r>
-      <w:r>
-        <w:rPr>
-          <w:b/>
-          <w:bCs/>
-        </w:rPr>
-        <w:t xml:space="preserve">The Uploads Volume</w:t>
-      </w:r>
-      <w:r>
-        <w:t xml:space="preserve">: Contains the raw PDF files.</w:t>
-      </w:r>
-    </w:p>
-    <w:p>
-      <w:pPr>
-        <w:pStyle w:val="BlockText"/>
-      </w:pPr>
-      <w:r>
-        <w:rPr>
-          <w:b/>
-          <w:bCs/>
-        </w:rPr>
-        <w:t xml:space="preserve">Production Recommendation</w:t>
-      </w:r>
-      <w:r>
-        <w:t xml:space="preserve"> </w:t>
-      </w:r>
-      <w:r>
-        <w:t xml:space="preserve">In production (e.g., AWS), never run PostgreSQL inside a Kubernetes pod. Use a managed service like AWS RDS for PostgreSQL with the</w:t>
-      </w:r>
-      <w:r>
-        <w:t xml:space="preserve"> </w:t>
-      </w:r>
-      <w:r>
-        <w:rPr>
-          <w:rStyle w:val="VerbatimChar"/>
-        </w:rPr>
-        <w:t xml:space="preserve">pgvector</w:t>
-      </w:r>
-      <w:r>
-        <w:t xml:space="preserve"> </w:t>
-      </w:r>
-      <w:r>
-        <w:t xml:space="preserve">extension enabled. RDS provides automated daily snapshots and Point-In-Time-Recovery (PITR), guaranteeing that even in a worst-case scenario, data loss is mitigated to the exact minute before the crash.</w:t>
-      </w:r>
-    </w:p>
-    <w:bookmarkEnd w:id="89"/>
-    <w:bookmarkEnd w:id="90"/>
-    <w:bookmarkStart w:id="94" w:name="Xb1332ee2655e6c84aaeab99b52ecdcf99580db2"/>
-    <w:p>
-      <w:pPr>
-        <w:pStyle w:val="Heading1"/>
-      </w:pPr>
-      <w:r>
-        <w:t xml:space="preserve">Chapter 14: Security Audit &amp; Threat Modeling</w:t>
-      </w:r>
-    </w:p>
-    <w:bookmarkStart w:id="91" w:name="introduction-2"/>
-    <w:p>
-      <w:pPr>
-        <w:pStyle w:val="Heading2"/>
-      </w:pPr>
-      <w:r>
-        <w:t xml:space="preserve">14.1 Introduction</w:t>
-      </w:r>
-    </w:p>
-    <w:p>
-      <w:pPr>
-        <w:pStyle w:val="FirstParagraph"/>
-      </w:pPr>
-      <w:r>
-        <w:t xml:space="preserve">Enterprise AI applications introduce novel threat vectors that do not exist in traditional software. Beyond standard SQL injection or Cross-Site Scripting (XSS), Athenis must defend against</w:t>
-      </w:r>
-      <w:r>
-        <w:t xml:space="preserve"> </w:t>
-      </w:r>
-      <w:r>
-        <w:rPr>
-          <w:b/>
-          <w:bCs/>
-        </w:rPr>
-        <w:t xml:space="preserve">Prompt Injection</w:t>
-      </w:r>
-      <w:r>
-        <w:t xml:space="preserve">,</w:t>
-      </w:r>
-      <w:r>
-        <w:t xml:space="preserve"> </w:t>
-      </w:r>
-      <w:r>
-        <w:rPr>
-          <w:b/>
-          <w:bCs/>
-        </w:rPr>
-        <w:t xml:space="preserve">Data Exfiltration via RAG</w:t>
-      </w:r>
-      <w:r>
-        <w:t xml:space="preserve">, and</w:t>
-      </w:r>
-      <w:r>
-        <w:t xml:space="preserve"> </w:t>
-      </w:r>
-      <w:r>
-        <w:rPr>
-          <w:b/>
-          <w:bCs/>
-        </w:rPr>
-        <w:t xml:space="preserve">Cost Exhaustion</w:t>
-      </w:r>
-      <w:r>
-        <w:t xml:space="preserve"> </w:t>
-      </w:r>
-      <w:r>
-        <w:t xml:space="preserve">attacks.</w:t>
-      </w:r>
-    </w:p>
-    <w:bookmarkEnd w:id="91"/>
-    <w:bookmarkStart w:id="92" w:name="prompt-injection-mitigation"/>
+    <w:bookmarkStart w:id="88" w:name="prompt-injection-mitigation"/>
     <w:p>
       <w:pPr>
         <w:pStyle w:val="Heading2"/>
@@ -3983,8 +3836,8 @@
         <w:t xml:space="preserve">: The user’s query and the retrieved database context are strictly separated in the API schema. The LLM is mathematically less likely to confuse user input for systemic instructions.</w:t>
       </w:r>
     </w:p>
-    <w:bookmarkEnd w:id="92"/>
-    <w:bookmarkStart w:id="93" w:name="role-based-data-exfiltration-prevention"/>
+    <w:bookmarkEnd w:id="88"/>
+    <w:bookmarkStart w:id="89" w:name="role-based-data-exfiltration-prevention"/>
     <w:p>
       <w:pPr>
         <w:pStyle w:val="Heading2"/>
@@ -4136,9 +3989,9 @@
         </w:pict>
       </w:r>
     </w:p>
-    <w:bookmarkEnd w:id="93"/>
-    <w:bookmarkEnd w:id="94"/>
-    <w:bookmarkStart w:id="97" w:name="chapter-15-performance-optimization"/>
+    <w:bookmarkEnd w:id="89"/>
+    <w:bookmarkEnd w:id="90"/>
+    <w:bookmarkStart w:id="93" w:name="chapter-15-performance-optimization"/>
     <w:p>
       <w:pPr>
         <w:pStyle w:val="Heading1"/>
@@ -4147,7 +4000,7 @@
         <w:t xml:space="preserve">Chapter 15: Performance Optimization</w:t>
       </w:r>
     </w:p>
-    <w:bookmarkStart w:id="95" w:name="vector-search-latency"/>
+    <w:bookmarkStart w:id="91" w:name="vector-search-latency"/>
     <w:p>
       <w:pPr>
         <w:pStyle w:val="Heading2"/>
@@ -4306,8 +4159,8 @@
         <w:t xml:space="preserve">.</w:t>
       </w:r>
     </w:p>
-    <w:bookmarkEnd w:id="95"/>
-    <w:bookmarkStart w:id="96" w:name="redis-caching"/>
+    <w:bookmarkEnd w:id="91"/>
+    <w:bookmarkStart w:id="92" w:name="redis-caching"/>
     <w:p>
       <w:pPr>
         <w:pStyle w:val="Heading2"/>
@@ -4370,24 +4223,335 @@
         </w:pict>
       </w:r>
     </w:p>
+    <w:bookmarkEnd w:id="92"/>
+    <w:bookmarkEnd w:id="93"/>
+    <w:bookmarkStart w:id="96" w:name="chapter-16-cicd-production-readiness"/>
+    <w:p>
+      <w:pPr>
+        <w:pStyle w:val="Heading1"/>
+      </w:pPr>
+      <w:r>
+        <w:t xml:space="preserve">Chapter 16: CI/CD &amp; Production Readiness</w:t>
+      </w:r>
+    </w:p>
+    <w:bookmarkStart w:id="94" w:name="continuous-integration-github-actions"/>
+    <w:p>
+      <w:pPr>
+        <w:pStyle w:val="Heading2"/>
+      </w:pPr>
+      <w:r>
+        <w:t xml:space="preserve">16.1 Continuous Integration (GitHub Actions)</w:t>
+      </w:r>
+    </w:p>
+    <w:p>
+      <w:pPr>
+        <w:pStyle w:val="FirstParagraph"/>
+      </w:pPr>
+      <w:r>
+        <w:t xml:space="preserve">Before any code is merged into the</w:t>
+      </w:r>
+      <w:r>
+        <w:t xml:space="preserve"> </w:t>
+      </w:r>
+      <w:r>
+        <w:rPr>
+          <w:rStyle w:val="VerbatimChar"/>
+        </w:rPr>
+        <w:t xml:space="preserve">main</w:t>
+      </w:r>
+      <w:r>
+        <w:t xml:space="preserve"> </w:t>
+      </w:r>
+      <w:r>
+        <w:t xml:space="preserve">branch, it must survive the CI pipeline defined in</w:t>
+      </w:r>
+      <w:r>
+        <w:t xml:space="preserve"> </w:t>
+      </w:r>
+      <w:r>
+        <w:rPr>
+          <w:rStyle w:val="VerbatimChar"/>
+        </w:rPr>
+        <w:t xml:space="preserve">.github/workflows/</w:t>
+      </w:r>
+      <w:r>
+        <w:t xml:space="preserve">.</w:t>
+      </w:r>
+      <w:r>
+        <w:t xml:space="preserve"> </w:t>
+      </w:r>
+      <w:r>
+        <w:t xml:space="preserve">1.</w:t>
+      </w:r>
+      <w:r>
+        <w:t xml:space="preserve"> </w:t>
+      </w:r>
+      <w:r>
+        <w:rPr>
+          <w:b/>
+          <w:bCs/>
+        </w:rPr>
+        <w:t xml:space="preserve">Linting &amp; Formatting</w:t>
+      </w:r>
+      <w:r>
+        <w:t xml:space="preserve">: Enforces Python</w:t>
+      </w:r>
+      <w:r>
+        <w:t xml:space="preserve"> </w:t>
+      </w:r>
+      <w:r>
+        <w:rPr>
+          <w:rStyle w:val="VerbatimChar"/>
+        </w:rPr>
+        <w:t xml:space="preserve">black</w:t>
+      </w:r>
+      <w:r>
+        <w:t xml:space="preserve"> </w:t>
+      </w:r>
+      <w:r>
+        <w:t xml:space="preserve">and TypeScript</w:t>
+      </w:r>
+      <w:r>
+        <w:t xml:space="preserve"> </w:t>
+      </w:r>
+      <w:r>
+        <w:rPr>
+          <w:rStyle w:val="VerbatimChar"/>
+        </w:rPr>
+        <w:t xml:space="preserve">eslint</w:t>
+      </w:r>
+      <w:r>
+        <w:t xml:space="preserve"> </w:t>
+      </w:r>
+      <w:r>
+        <w:t xml:space="preserve">standards.</w:t>
+      </w:r>
+      <w:r>
+        <w:t xml:space="preserve"> </w:t>
+      </w:r>
+      <w:r>
+        <w:t xml:space="preserve">2.</w:t>
+      </w:r>
+      <w:r>
+        <w:t xml:space="preserve"> </w:t>
+      </w:r>
+      <w:r>
+        <w:rPr>
+          <w:b/>
+          <w:bCs/>
+        </w:rPr>
+        <w:t xml:space="preserve">Unit Testing</w:t>
+      </w:r>
+      <w:r>
+        <w:t xml:space="preserve">: Spins up an ephemeral PostgreSQL container, applies Alembic migrations, and runs</w:t>
+      </w:r>
+      <w:r>
+        <w:t xml:space="preserve"> </w:t>
+      </w:r>
+      <w:r>
+        <w:rPr>
+          <w:rStyle w:val="VerbatimChar"/>
+        </w:rPr>
+        <w:t xml:space="preserve">pytest</w:t>
+      </w:r>
+      <w:r>
+        <w:t xml:space="preserve"> </w:t>
+      </w:r>
+      <w:r>
+        <w:t xml:space="preserve">against the FastAPI routers.</w:t>
+      </w:r>
+      <w:r>
+        <w:t xml:space="preserve"> </w:t>
+      </w:r>
+      <w:r>
+        <w:t xml:space="preserve">3.</w:t>
+      </w:r>
+      <w:r>
+        <w:t xml:space="preserve"> </w:t>
+      </w:r>
+      <w:r>
+        <w:rPr>
+          <w:b/>
+          <w:bCs/>
+        </w:rPr>
+        <w:t xml:space="preserve">Build Verification</w:t>
+      </w:r>
+      <w:r>
+        <w:t xml:space="preserve">: Builds the Docker images to guarantee the</w:t>
+      </w:r>
+      <w:r>
+        <w:t xml:space="preserve"> </w:t>
+      </w:r>
+      <w:r>
+        <w:rPr>
+          <w:rStyle w:val="VerbatimChar"/>
+        </w:rPr>
+        <w:t xml:space="preserve">Dockerfile</w:t>
+      </w:r>
+      <w:r>
+        <w:t xml:space="preserve"> </w:t>
+      </w:r>
+      <w:r>
+        <w:t xml:space="preserve">is not broken.</w:t>
+      </w:r>
+    </w:p>
+    <w:bookmarkEnd w:id="94"/>
+    <w:bookmarkStart w:id="95" w:name="production-readiness-checklist"/>
+    <w:p>
+      <w:pPr>
+        <w:pStyle w:val="Heading2"/>
+      </w:pPr>
+      <w:r>
+        <w:t xml:space="preserve">16.2 Production Readiness Checklist</w:t>
+      </w:r>
+    </w:p>
+    <w:p>
+      <w:pPr>
+        <w:pStyle w:val="FirstParagraph"/>
+      </w:pPr>
+      <w:r>
+        <w:t xml:space="preserve">Before taking Athenis live for real enterprise users, an architect must verify:</w:t>
+      </w:r>
+      <w:r>
+        <w:t xml:space="preserve"> </w:t>
+      </w:r>
+      <w:r>
+        <w:t xml:space="preserve">- [ ]</w:t>
+      </w:r>
+      <w:r>
+        <w:t xml:space="preserve"> </w:t>
+      </w:r>
+      <w:r>
+        <w:rPr>
+          <w:b/>
+          <w:bCs/>
+        </w:rPr>
+        <w:t xml:space="preserve">Secrets</w:t>
+      </w:r>
+      <w:r>
+        <w:t xml:space="preserve">: All</w:t>
+      </w:r>
+      <w:r>
+        <w:t xml:space="preserve"> </w:t>
+      </w:r>
+      <w:r>
+        <w:rPr>
+          <w:rStyle w:val="VerbatimChar"/>
+        </w:rPr>
+        <w:t xml:space="preserve">.env</w:t>
+      </w:r>
+      <w:r>
+        <w:t xml:space="preserve"> </w:t>
+      </w:r>
+      <w:r>
+        <w:t xml:space="preserve">files are deleted. Credentials are injected via Kubernetes Secrets.</w:t>
+      </w:r>
+      <w:r>
+        <w:t xml:space="preserve"> </w:t>
+      </w:r>
+      <w:r>
+        <w:t xml:space="preserve">- [ ]</w:t>
+      </w:r>
+      <w:r>
+        <w:t xml:space="preserve"> </w:t>
+      </w:r>
+      <w:r>
+        <w:rPr>
+          <w:b/>
+          <w:bCs/>
+        </w:rPr>
+        <w:t xml:space="preserve">Database Backups</w:t>
+      </w:r>
+      <w:r>
+        <w:t xml:space="preserve">: RDS automated backups are enabled with a 35-day retention policy.</w:t>
+      </w:r>
+      <w:r>
+        <w:t xml:space="preserve"> </w:t>
+      </w:r>
+      <w:r>
+        <w:t xml:space="preserve">- [ ]</w:t>
+      </w:r>
+      <w:r>
+        <w:t xml:space="preserve"> </w:t>
+      </w:r>
+      <w:r>
+        <w:rPr>
+          <w:b/>
+          <w:bCs/>
+        </w:rPr>
+        <w:t xml:space="preserve">Resource Limits</w:t>
+      </w:r>
+      <w:r>
+        <w:t xml:space="preserve">: Every Docker container specifies memory limits (e.g.,</w:t>
+      </w:r>
+      <w:r>
+        <w:t xml:space="preserve"> </w:t>
+      </w:r>
+      <w:r>
+        <w:rPr>
+          <w:rStyle w:val="VerbatimChar"/>
+        </w:rPr>
+        <w:t xml:space="preserve">memory: 1G</w:t>
+      </w:r>
+      <w:r>
+        <w:t xml:space="preserve">). Without this, a memory leak in Celery will crash the entire host node.</w:t>
+      </w:r>
+      <w:r>
+        <w:t xml:space="preserve"> </w:t>
+      </w:r>
+      <w:r>
+        <w:t xml:space="preserve">- [ ]</w:t>
+      </w:r>
+      <w:r>
+        <w:t xml:space="preserve"> </w:t>
+      </w:r>
+      <w:r>
+        <w:rPr>
+          <w:b/>
+          <w:bCs/>
+        </w:rPr>
+        <w:t xml:space="preserve">Observability</w:t>
+      </w:r>
+      <w:r>
+        <w:t xml:space="preserve">: Grafana dashboards are actively capturing OpenTelemetry traces, and Slack alerts are configured for HTTP 500 errors.</w:t>
+      </w:r>
+    </w:p>
+    <w:bookmarkEnd w:id="95"/>
     <w:bookmarkEnd w:id="96"/>
+    <w:bookmarkStart w:id="97" w:name="conclusion-final-thoughts"/>
+    <w:p>
+      <w:pPr>
+        <w:pStyle w:val="Heading1"/>
+      </w:pPr>
+      <w:r>
+        <w:t xml:space="preserve">17. Conclusion &amp; Final Thoughts</w:t>
+      </w:r>
+    </w:p>
+    <w:p>
+      <w:pPr>
+        <w:pStyle w:val="FirstParagraph"/>
+      </w:pPr>
+      <w:r>
+        <w:t xml:space="preserve">You have successfully traced the entire execution lifecycle of the Athenis platform. You understand the business tradeoffs of the microservices topology, the mathematical necessity of Reciprocal Rank Fusion, the asynchronous elegance of the Celery ingestion pipeline, and the defensive security posture of the pgvector implementation. You are now equipped to operate and scale this platform at a massive enterprise level.</w:t>
+      </w:r>
+    </w:p>
     <w:bookmarkEnd w:id="97"/>
-    <w:bookmarkStart w:id="100" w:name="chapter-16-cicd-production-readiness"/>
+    <w:bookmarkStart w:id="100" w:name="X3d277326781992caf26d6f3544d7784104c0b50"/>
     <w:p>
       <w:pPr>
         <w:pStyle w:val="Heading1"/>
       </w:pPr>
       <w:r>
-        <w:t xml:space="preserve">Chapter 16: CI/CD &amp; Production Readiness</w:t>
-      </w:r>
-    </w:p>
-    <w:bookmarkStart w:id="98" w:name="continuous-integration-github-actions"/>
+        <w:t xml:space="preserve">Chapter 18: Security Audit &amp; Threat Modeling</w:t>
+      </w:r>
+    </w:p>
+    <w:bookmarkStart w:id="98" w:name="introduction-3"/>
     <w:p>
       <w:pPr>
         <w:pStyle w:val="Heading2"/>
       </w:pPr>
       <w:r>
-        <w:t xml:space="preserve">16.1 Continuous Integration (GitHub Actions)</w:t>
+        <w:t xml:space="preserve">18.1 Introduction</w:t>
       </w:r>
     </w:p>
     <w:p>
@@ -4395,364 +4559,53 @@
         <w:pStyle w:val="FirstParagraph"/>
       </w:pPr>
       <w:r>
-        <w:t xml:space="preserve">Before any code is merged into the</w:t>
-      </w:r>
-      <w:r>
-        <w:t xml:space="preserve"> </w:t>
-      </w:r>
-      <w:r>
-        <w:rPr>
-          <w:rStyle w:val="VerbatimChar"/>
-        </w:rPr>
-        <w:t xml:space="preserve">main</w:t>
-      </w:r>
-      <w:r>
-        <w:t xml:space="preserve"> </w:t>
-      </w:r>
-      <w:r>
-        <w:t xml:space="preserve">branch, it must survive the CI pipeline defined in</w:t>
-      </w:r>
-      <w:r>
-        <w:t xml:space="preserve"> </w:t>
-      </w:r>
-      <w:r>
-        <w:rPr>
-          <w:rStyle w:val="VerbatimChar"/>
-        </w:rPr>
-        <w:t xml:space="preserve">.github/workflows/</w:t>
-      </w:r>
-      <w:r>
-        <w:t xml:space="preserve">.</w:t>
-      </w:r>
-      <w:r>
-        <w:t xml:space="preserve"> </w:t>
-      </w:r>
-      <w:r>
-        <w:t xml:space="preserve">1.</w:t>
-      </w:r>
-      <w:r>
-        <w:t xml:space="preserve"> </w:t>
-      </w:r>
-      <w:r>
-        <w:rPr>
-          <w:b/>
-          <w:bCs/>
-        </w:rPr>
-        <w:t xml:space="preserve">Linting &amp; Formatting</w:t>
-      </w:r>
-      <w:r>
-        <w:t xml:space="preserve">: Enforces Python</w:t>
-      </w:r>
-      <w:r>
-        <w:t xml:space="preserve"> </w:t>
-      </w:r>
-      <w:r>
-        <w:rPr>
-          <w:rStyle w:val="VerbatimChar"/>
-        </w:rPr>
-        <w:t xml:space="preserve">black</w:t>
-      </w:r>
-      <w:r>
-        <w:t xml:space="preserve"> </w:t>
-      </w:r>
-      <w:r>
-        <w:t xml:space="preserve">and TypeScript</w:t>
-      </w:r>
-      <w:r>
-        <w:t xml:space="preserve"> </w:t>
-      </w:r>
-      <w:r>
-        <w:rPr>
-          <w:rStyle w:val="VerbatimChar"/>
-        </w:rPr>
-        <w:t xml:space="preserve">eslint</w:t>
-      </w:r>
-      <w:r>
-        <w:t xml:space="preserve"> </w:t>
-      </w:r>
-      <w:r>
-        <w:t xml:space="preserve">standards.</w:t>
-      </w:r>
-      <w:r>
-        <w:t xml:space="preserve"> </w:t>
-      </w:r>
-      <w:r>
-        <w:t xml:space="preserve">2.</w:t>
-      </w:r>
-      <w:r>
-        <w:t xml:space="preserve"> </w:t>
-      </w:r>
-      <w:r>
-        <w:rPr>
-          <w:b/>
-          <w:bCs/>
-        </w:rPr>
-        <w:t xml:space="preserve">Unit Testing</w:t>
-      </w:r>
-      <w:r>
-        <w:t xml:space="preserve">: Spins up an ephemeral PostgreSQL container, applies Alembic migrations, and runs</w:t>
-      </w:r>
-      <w:r>
-        <w:t xml:space="preserve"> </w:t>
-      </w:r>
-      <w:r>
-        <w:rPr>
-          <w:rStyle w:val="VerbatimChar"/>
-        </w:rPr>
-        <w:t xml:space="preserve">pytest</w:t>
-      </w:r>
-      <w:r>
-        <w:t xml:space="preserve"> </w:t>
-      </w:r>
-      <w:r>
-        <w:t xml:space="preserve">against the FastAPI routers.</w:t>
-      </w:r>
-      <w:r>
-        <w:t xml:space="preserve"> </w:t>
-      </w:r>
-      <w:r>
-        <w:t xml:space="preserve">3.</w:t>
-      </w:r>
-      <w:r>
-        <w:t xml:space="preserve"> </w:t>
-      </w:r>
-      <w:r>
-        <w:rPr>
-          <w:b/>
-          <w:bCs/>
-        </w:rPr>
-        <w:t xml:space="preserve">Build Verification</w:t>
-      </w:r>
-      <w:r>
-        <w:t xml:space="preserve">: Builds the Docker images to guarantee the</w:t>
-      </w:r>
-      <w:r>
-        <w:t xml:space="preserve"> </w:t>
-      </w:r>
-      <w:r>
-        <w:rPr>
-          <w:rStyle w:val="VerbatimChar"/>
-        </w:rPr>
-        <w:t xml:space="preserve">Dockerfile</w:t>
-      </w:r>
-      <w:r>
-        <w:t xml:space="preserve"> </w:t>
-      </w:r>
-      <w:r>
-        <w:t xml:space="preserve">is not broken.</w:t>
+        <w:t xml:space="preserve">Enterprise AI applications introduce novel threat vectors that do not exist in traditional software. Beyond standard SQL injection or Cross-Site Scripting (XSS), Athenis must defend against</w:t>
+      </w:r>
+      <w:r>
+        <w:t xml:space="preserve"> </w:t>
+      </w:r>
+      <w:r>
+        <w:rPr>
+          <w:b/>
+          <w:bCs/>
+        </w:rPr>
+        <w:t xml:space="preserve">Prompt Injection</w:t>
+      </w:r>
+      <w:r>
+        <w:t xml:space="preserve">,</w:t>
+      </w:r>
+      <w:r>
+        <w:t xml:space="preserve"> </w:t>
+      </w:r>
+      <w:r>
+        <w:rPr>
+          <w:b/>
+          <w:bCs/>
+        </w:rPr>
+        <w:t xml:space="preserve">Data Exfiltration via RAG</w:t>
+      </w:r>
+      <w:r>
+        <w:t xml:space="preserve">, and</w:t>
+      </w:r>
+      <w:r>
+        <w:t xml:space="preserve"> </w:t>
+      </w:r>
+      <w:r>
+        <w:rPr>
+          <w:b/>
+          <w:bCs/>
+        </w:rPr>
+        <w:t xml:space="preserve">Cost Exhaustion</w:t>
+      </w:r>
+      <w:r>
+        <w:t xml:space="preserve"> </w:t>
+      </w:r>
+      <w:r>
+        <w:t xml:space="preserve">attacks.</w:t>
       </w:r>
     </w:p>
     <w:bookmarkEnd w:id="98"/>
-    <w:bookmarkStart w:id="99" w:name="production-readiness-checklist"/>
-    <w:p>
-      <w:pPr>
-        <w:pStyle w:val="Heading2"/>
-      </w:pPr>
-      <w:r>
-        <w:t xml:space="preserve">16.2 Production Readiness Checklist</w:t>
-      </w:r>
-    </w:p>
-    <w:p>
-      <w:pPr>
-        <w:pStyle w:val="FirstParagraph"/>
-      </w:pPr>
-      <w:r>
-        <w:t xml:space="preserve">Before taking Athenis live for real enterprise users, an architect must verify:</w:t>
-      </w:r>
-      <w:r>
-        <w:t xml:space="preserve"> </w:t>
-      </w:r>
-      <w:r>
-        <w:t xml:space="preserve">- [ ]</w:t>
-      </w:r>
-      <w:r>
-        <w:t xml:space="preserve"> </w:t>
-      </w:r>
-      <w:r>
-        <w:rPr>
-          <w:b/>
-          <w:bCs/>
-        </w:rPr>
-        <w:t xml:space="preserve">Secrets</w:t>
-      </w:r>
-      <w:r>
-        <w:t xml:space="preserve">: All</w:t>
-      </w:r>
-      <w:r>
-        <w:t xml:space="preserve"> </w:t>
-      </w:r>
-      <w:r>
-        <w:rPr>
-          <w:rStyle w:val="VerbatimChar"/>
-        </w:rPr>
-        <w:t xml:space="preserve">.env</w:t>
-      </w:r>
-      <w:r>
-        <w:t xml:space="preserve"> </w:t>
-      </w:r>
-      <w:r>
-        <w:t xml:space="preserve">files are deleted. Credentials are injected via Kubernetes Secrets.</w:t>
-      </w:r>
-      <w:r>
-        <w:t xml:space="preserve"> </w:t>
-      </w:r>
-      <w:r>
-        <w:t xml:space="preserve">- [ ]</w:t>
-      </w:r>
-      <w:r>
-        <w:t xml:space="preserve"> </w:t>
-      </w:r>
-      <w:r>
-        <w:rPr>
-          <w:b/>
-          <w:bCs/>
-        </w:rPr>
-        <w:t xml:space="preserve">Database Backups</w:t>
-      </w:r>
-      <w:r>
-        <w:t xml:space="preserve">: RDS automated backups are enabled with a 35-day retention policy.</w:t>
-      </w:r>
-      <w:r>
-        <w:t xml:space="preserve"> </w:t>
-      </w:r>
-      <w:r>
-        <w:t xml:space="preserve">- [ ]</w:t>
-      </w:r>
-      <w:r>
-        <w:t xml:space="preserve"> </w:t>
-      </w:r>
-      <w:r>
-        <w:rPr>
-          <w:b/>
-          <w:bCs/>
-        </w:rPr>
-        <w:t xml:space="preserve">Resource Limits</w:t>
-      </w:r>
-      <w:r>
-        <w:t xml:space="preserve">: Every Docker container specifies memory limits (e.g.,</w:t>
-      </w:r>
-      <w:r>
-        <w:t xml:space="preserve"> </w:t>
-      </w:r>
-      <w:r>
-        <w:rPr>
-          <w:rStyle w:val="VerbatimChar"/>
-        </w:rPr>
-        <w:t xml:space="preserve">memory: 1G</w:t>
-      </w:r>
-      <w:r>
-        <w:t xml:space="preserve">). Without this, a memory leak in Celery will crash the entire host node.</w:t>
-      </w:r>
-      <w:r>
-        <w:t xml:space="preserve"> </w:t>
-      </w:r>
-      <w:r>
-        <w:t xml:space="preserve">- [ ]</w:t>
-      </w:r>
-      <w:r>
-        <w:t xml:space="preserve"> </w:t>
-      </w:r>
-      <w:r>
-        <w:rPr>
-          <w:b/>
-          <w:bCs/>
-        </w:rPr>
-        <w:t xml:space="preserve">Observability</w:t>
-      </w:r>
-      <w:r>
-        <w:t xml:space="preserve">: Grafana dashboards are actively capturing OpenTelemetry traces, and Slack alerts are configured for HTTP 500 errors.</w:t>
-      </w:r>
-    </w:p>
-    <w:bookmarkEnd w:id="99"/>
-    <w:bookmarkEnd w:id="100"/>
-    <w:bookmarkStart w:id="101" w:name="conclusion-final-thoughts"/>
-    <w:p>
-      <w:pPr>
-        <w:pStyle w:val="Heading1"/>
-      </w:pPr>
-      <w:r>
-        <w:t xml:space="preserve">17. Conclusion &amp; Final Thoughts</w:t>
-      </w:r>
-    </w:p>
-    <w:p>
-      <w:pPr>
-        <w:pStyle w:val="FirstParagraph"/>
-      </w:pPr>
-      <w:r>
-        <w:t xml:space="preserve">You have successfully traced the entire execution lifecycle of the Athenis platform. You understand the business tradeoffs of the microservices topology, the mathematical necessity of Reciprocal Rank Fusion, the asynchronous elegance of the Celery ingestion pipeline, and the defensive security posture of the pgvector implementation. You are now equipped to operate and scale this platform at a massive enterprise level.</w:t>
-      </w:r>
-    </w:p>
-    <w:bookmarkEnd w:id="101"/>
-    <w:bookmarkStart w:id="104" w:name="X3d277326781992caf26d6f3544d7784104c0b50"/>
-    <w:p>
-      <w:pPr>
-        <w:pStyle w:val="Heading1"/>
-      </w:pPr>
-      <w:r>
-        <w:t xml:space="preserve">Chapter 18: Security Audit &amp; Threat Modeling</w:t>
-      </w:r>
-    </w:p>
-    <w:bookmarkStart w:id="102" w:name="introduction-3"/>
-    <w:p>
-      <w:pPr>
-        <w:pStyle w:val="Heading2"/>
-      </w:pPr>
-      <w:r>
-        <w:t xml:space="preserve">18.1 Introduction</w:t>
-      </w:r>
-    </w:p>
-    <w:p>
-      <w:pPr>
-        <w:pStyle w:val="FirstParagraph"/>
-      </w:pPr>
-      <w:r>
-        <w:t xml:space="preserve">Enterprise AI applications introduce novel threat vectors that do not exist in traditional software. Beyond standard SQL injection or Cross-Site Scripting (XSS), Athenis must defend against</w:t>
-      </w:r>
-      <w:r>
-        <w:t xml:space="preserve"> </w:t>
-      </w:r>
-      <w:r>
-        <w:rPr>
-          <w:b/>
-          <w:bCs/>
-        </w:rPr>
-        <w:t xml:space="preserve">Prompt Injection</w:t>
-      </w:r>
-      <w:r>
-        <w:t xml:space="preserve">,</w:t>
-      </w:r>
-      <w:r>
-        <w:t xml:space="preserve"> </w:t>
-      </w:r>
-      <w:r>
-        <w:rPr>
-          <w:b/>
-          <w:bCs/>
-        </w:rPr>
-        <w:t xml:space="preserve">Data Exfiltration via RAG</w:t>
-      </w:r>
-      <w:r>
-        <w:t xml:space="preserve">, and</w:t>
-      </w:r>
-      <w:r>
-        <w:t xml:space="preserve"> </w:t>
-      </w:r>
-      <w:r>
-        <w:rPr>
-          <w:b/>
-          <w:bCs/>
-        </w:rPr>
-        <w:t xml:space="preserve">Cost Exhaustion</w:t>
-      </w:r>
-      <w:r>
-        <w:t xml:space="preserve"> </w:t>
-      </w:r>
-      <w:r>
-        <w:t xml:space="preserve">attacks.</w:t>
-      </w:r>
-    </w:p>
-    <w:bookmarkEnd w:id="102"/>
-    <w:bookmarkStart w:id="103" w:name="prompt-injection-mitigation-1"/>
+    <w:bookmarkStart w:id="99" w:name="prompt-injection-mitigation-1"/>
     <w:p>
       <w:pPr>
         <w:pStyle w:val="Heading2"/>
@@ -4901,9 +4754,9 @@
         </w:pict>
       </w:r>
     </w:p>
-    <w:bookmarkEnd w:id="103"/>
-    <w:bookmarkEnd w:id="104"/>
-    <w:bookmarkStart w:id="107" w:name="Xf0b7871ca72e650df5bd9f6476713f3502db1fb"/>
+    <w:bookmarkEnd w:id="99"/>
+    <w:bookmarkEnd w:id="100"/>
+    <w:bookmarkStart w:id="103" w:name="Xf0b7871ca72e650df5bd9f6476713f3502db1fb"/>
     <w:p>
       <w:pPr>
         <w:pStyle w:val="Heading1"/>
@@ -4912,7 +4765,7 @@
         <w:t xml:space="preserve">Chapter 19: Disaster Recovery, Backup &amp; Restore</w:t>
       </w:r>
     </w:p>
-    <w:bookmarkStart w:id="105" w:name="the-rto-and-rpo-strategy"/>
+    <w:bookmarkStart w:id="101" w:name="the-rto-and-rpo-strategy"/>
     <w:p>
       <w:pPr>
         <w:pStyle w:val="Heading2"/>
@@ -4950,8 +4803,8 @@
         <w:t xml:space="preserve">, they can be re-deployed into a secondary region instantly via Helm charts.</w:t>
       </w:r>
     </w:p>
-    <w:bookmarkEnd w:id="105"/>
-    <w:bookmarkStart w:id="106" w:name="restoring-postgresql-pgvector"/>
+    <w:bookmarkEnd w:id="101"/>
+    <w:bookmarkStart w:id="102" w:name="restoring-postgresql-pgvector"/>
     <w:p>
       <w:pPr>
         <w:pStyle w:val="Heading2"/>
@@ -4996,9 +4849,9 @@
         </w:pict>
       </w:r>
     </w:p>
-    <w:bookmarkEnd w:id="106"/>
-    <w:bookmarkEnd w:id="107"/>
-    <w:bookmarkStart w:id="111" w:name="X140e3ca9636f220e2346450b9382f3e4b023803"/>
+    <w:bookmarkEnd w:id="102"/>
+    <w:bookmarkEnd w:id="103"/>
+    <w:bookmarkStart w:id="107" w:name="X140e3ca9636f220e2346450b9382f3e4b023803"/>
     <w:p>
       <w:pPr>
         <w:pStyle w:val="Heading1"/>
@@ -5007,7 +4860,7 @@
         <w:t xml:space="preserve">Chapter 20: Extension Guide for Future Developers</w:t>
       </w:r>
     </w:p>
-    <w:bookmarkStart w:id="108" w:name="X9c2e774d9b9579cce7c0e3989404d36d91cb83d"/>
+    <w:bookmarkStart w:id="104" w:name="X9c2e774d9b9579cce7c0e3989404d36d91cb83d"/>
     <w:p>
       <w:pPr>
         <w:pStyle w:val="Heading2"/>
@@ -5087,8 +4940,8 @@
         <w:t xml:space="preserve">3. Once the Okta assertion is verified, generate the exact same internal JWT payload that the standard password flow generates. This ensures you do not need to modify the RBAC dependencies across the rest of the application.</w:t>
       </w:r>
     </w:p>
-    <w:bookmarkEnd w:id="108"/>
-    <w:bookmarkStart w:id="109" w:name="modifying-the-chunking-strategy"/>
+    <w:bookmarkEnd w:id="104"/>
+    <w:bookmarkStart w:id="105" w:name="modifying-the-chunking-strategy"/>
     <w:p>
       <w:pPr>
         <w:pStyle w:val="Heading2"/>
@@ -5170,8 +5023,8 @@
         <w:t xml:space="preserve">: This will require re-embedding every single document in the database, because the old 1000-character vectors are mathematically incompatible with the new 2000-character chunks. You must write an Alembic data migration to execute this.</w:t>
       </w:r>
     </w:p>
-    <w:bookmarkEnd w:id="109"/>
-    <w:bookmarkStart w:id="110" w:name="key-takeaways"/>
+    <w:bookmarkEnd w:id="105"/>
+    <w:bookmarkStart w:id="106" w:name="key-takeaways"/>
     <w:p>
       <w:pPr>
         <w:pStyle w:val="Heading2"/>
@@ -5258,8 +5111,8 @@
         <w:t xml:space="preserve">This concludes the Athenis Enterprise Engineering Handbook.</w:t>
       </w:r>
     </w:p>
-    <w:bookmarkEnd w:id="110"/>
-    <w:bookmarkEnd w:id="111"/>
+    <w:bookmarkEnd w:id="106"/>
+    <w:bookmarkEnd w:id="107"/>
     <w:sectPr>
       <w:footnotePr>
         <w:numRestart w:val="eachSect"/>

</xml_diff>